<commit_message>
Update Documentação - InfoTech by Júlio Mulhanga.docx
</commit_message>
<xml_diff>
--- a/doc/Documentação - InfoTech by Júlio Mulhanga.docx
+++ b/doc/Documentação - InfoTech by Júlio Mulhanga.docx
@@ -62,7 +62,7 @@
           <w:r>
             <w:fldChar w:fldCharType="separate"/>
           </w:r>
-          <w:hyperlink w:anchor="_Toc238644600" w:history="1">
+          <w:hyperlink w:anchor="_Toc238892663" w:history="1">
             <w:r>
               <w:rPr>
                 <w:rStyle w:val="Hyperlink"/>
@@ -90,7 +90,7 @@
                 <w:noProof/>
                 <w:webHidden/>
               </w:rPr>
-              <w:instrText xml:space="preserve"> PAGEREF _Toc238644600 \h </w:instrText>
+              <w:instrText xml:space="preserve"> PAGEREF _Toc238892663 \h </w:instrText>
             </w:r>
             <w:r>
               <w:rPr>
@@ -133,7 +133,7 @@
               <w:noProof/>
             </w:rPr>
           </w:pPr>
-          <w:hyperlink w:anchor="_Toc238644601" w:history="1">
+          <w:hyperlink w:anchor="_Toc238892664" w:history="1">
             <w:r>
               <w:rPr>
                 <w:rStyle w:val="Hyperlink"/>
@@ -176,7 +176,7 @@
                 <w:noProof/>
                 <w:webHidden/>
               </w:rPr>
-              <w:instrText xml:space="preserve"> PAGEREF _Toc238644601 \h </w:instrText>
+              <w:instrText xml:space="preserve"> PAGEREF _Toc238892664 \h </w:instrText>
             </w:r>
             <w:r>
               <w:rPr>
@@ -219,7 +219,7 @@
               <w:noProof/>
             </w:rPr>
           </w:pPr>
-          <w:hyperlink w:anchor="_Toc238644602" w:history="1">
+          <w:hyperlink w:anchor="_Toc238892665" w:history="1">
             <w:r>
               <w:rPr>
                 <w:rStyle w:val="Hyperlink"/>
@@ -241,7 +241,7 @@
                 <w:noProof/>
                 <w:lang w:val="pt-PT"/>
               </w:rPr>
-              <w:t>Desenvolvimento</w:t>
+              <w:t>DESENVOLVIMENTO</w:t>
             </w:r>
             <w:r>
               <w:rPr>
@@ -262,7 +262,7 @@
                 <w:noProof/>
                 <w:webHidden/>
               </w:rPr>
-              <w:instrText xml:space="preserve"> PAGEREF _Toc238644602 \h </w:instrText>
+              <w:instrText xml:space="preserve"> PAGEREF _Toc238892665 \h </w:instrText>
             </w:r>
             <w:r>
               <w:rPr>
@@ -305,7 +305,7 @@
               <w:noProof/>
             </w:rPr>
           </w:pPr>
-          <w:hyperlink w:anchor="_Toc238644603" w:history="1">
+          <w:hyperlink w:anchor="_Toc238892666" w:history="1">
             <w:r>
               <w:rPr>
                 <w:rStyle w:val="Hyperlink"/>
@@ -348,7 +348,7 @@
                 <w:noProof/>
                 <w:webHidden/>
               </w:rPr>
-              <w:instrText xml:space="preserve"> PAGEREF _Toc238644603 \h </w:instrText>
+              <w:instrText xml:space="preserve"> PAGEREF _Toc238892666 \h </w:instrText>
             </w:r>
             <w:r>
               <w:rPr>
@@ -391,7 +391,7 @@
               <w:noProof/>
             </w:rPr>
           </w:pPr>
-          <w:hyperlink w:anchor="_Toc238644604" w:history="1">
+          <w:hyperlink w:anchor="_Toc238892667" w:history="1">
             <w:r>
               <w:rPr>
                 <w:rStyle w:val="Hyperlink"/>
@@ -434,7 +434,7 @@
                 <w:noProof/>
                 <w:webHidden/>
               </w:rPr>
-              <w:instrText xml:space="preserve"> PAGEREF _Toc238644604 \h </w:instrText>
+              <w:instrText xml:space="preserve"> PAGEREF _Toc238892667 \h </w:instrText>
             </w:r>
             <w:r>
               <w:rPr>
@@ -477,7 +477,7 @@
               <w:noProof/>
             </w:rPr>
           </w:pPr>
-          <w:hyperlink w:anchor="_Toc238644605" w:history="1">
+          <w:hyperlink w:anchor="_Toc238892668" w:history="1">
             <w:r>
               <w:rPr>
                 <w:rStyle w:val="Hyperlink"/>
@@ -519,7 +519,7 @@
                 <w:noProof/>
                 <w:webHidden/>
               </w:rPr>
-              <w:instrText xml:space="preserve"> PAGEREF _Toc238644605 \h </w:instrText>
+              <w:instrText xml:space="preserve"> PAGEREF _Toc238892668 \h </w:instrText>
             </w:r>
             <w:r>
               <w:rPr>
@@ -562,7 +562,7 @@
               <w:noProof/>
             </w:rPr>
           </w:pPr>
-          <w:hyperlink w:anchor="_Toc238644606" w:history="1">
+          <w:hyperlink w:anchor="_Toc238892669" w:history="1">
             <w:r>
               <w:rPr>
                 <w:rStyle w:val="Hyperlink"/>
@@ -605,7 +605,7 @@
                 <w:noProof/>
                 <w:webHidden/>
               </w:rPr>
-              <w:instrText xml:space="preserve"> PAGEREF _Toc238644606 \h </w:instrText>
+              <w:instrText xml:space="preserve"> PAGEREF _Toc238892669 \h </w:instrText>
             </w:r>
             <w:r>
               <w:rPr>
@@ -648,7 +648,7 @@
               <w:noProof/>
             </w:rPr>
           </w:pPr>
-          <w:hyperlink w:anchor="_Toc238644607" w:history="1">
+          <w:hyperlink w:anchor="_Toc238892670" w:history="1">
             <w:r>
               <w:rPr>
                 <w:rStyle w:val="Hyperlink"/>
@@ -691,7 +691,7 @@
                 <w:noProof/>
                 <w:webHidden/>
               </w:rPr>
-              <w:instrText xml:space="preserve"> PAGEREF _Toc238644607 \h </w:instrText>
+              <w:instrText xml:space="preserve"> PAGEREF _Toc238892670 \h </w:instrText>
             </w:r>
             <w:r>
               <w:rPr>
@@ -712,6 +712,592 @@
                 <w:webHidden/>
               </w:rPr>
               <w:t>9</w:t>
+            </w:r>
+            <w:r>
+              <w:rPr>
+                <w:noProof/>
+                <w:webHidden/>
+              </w:rPr>
+              <w:fldChar w:fldCharType="end"/>
+            </w:r>
+          </w:hyperlink>
+        </w:p>
+        <w:p>
+          <w:pPr>
+            <w:pStyle w:val="TOC2"/>
+            <w:tabs>
+              <w:tab w:val="left" w:pos="960"/>
+              <w:tab w:val="right" w:leader="dot" w:pos="9350"/>
+            </w:tabs>
+            <w:rPr>
+              <w:rFonts w:asciiTheme="minorHAnsi" w:eastAsiaTheme="minorEastAsia" w:hAnsiTheme="minorHAnsi"/>
+              <w:noProof/>
+            </w:rPr>
+          </w:pPr>
+          <w:hyperlink w:anchor="_Toc238892671" w:history="1">
+            <w:r>
+              <w:rPr>
+                <w:rStyle w:val="Hyperlink"/>
+                <w:noProof/>
+                <w:lang w:val="pt-PT"/>
+              </w:rPr>
+              <w:t>2.6.</w:t>
+            </w:r>
+            <w:r>
+              <w:rPr>
+                <w:rFonts w:asciiTheme="minorHAnsi" w:eastAsiaTheme="minorEastAsia" w:hAnsiTheme="minorHAnsi"/>
+                <w:noProof/>
+              </w:rPr>
+              <w:tab/>
+            </w:r>
+            <w:r>
+              <w:rPr>
+                <w:rStyle w:val="Hyperlink"/>
+                <w:noProof/>
+                <w:lang w:val="pt-PT"/>
+              </w:rPr>
+              <w:t>Desenvolvimento das Páginas em HTML</w:t>
+            </w:r>
+            <w:r>
+              <w:rPr>
+                <w:noProof/>
+                <w:webHidden/>
+              </w:rPr>
+              <w:tab/>
+            </w:r>
+            <w:r>
+              <w:rPr>
+                <w:noProof/>
+                <w:webHidden/>
+              </w:rPr>
+              <w:fldChar w:fldCharType="begin"/>
+            </w:r>
+            <w:r>
+              <w:rPr>
+                <w:noProof/>
+                <w:webHidden/>
+              </w:rPr>
+              <w:instrText xml:space="preserve"> PAGEREF _Toc238892671 \h </w:instrText>
+            </w:r>
+            <w:r>
+              <w:rPr>
+                <w:noProof/>
+                <w:webHidden/>
+              </w:rPr>
+            </w:r>
+            <w:r>
+              <w:rPr>
+                <w:noProof/>
+                <w:webHidden/>
+              </w:rPr>
+              <w:fldChar w:fldCharType="separate"/>
+            </w:r>
+            <w:r>
+              <w:rPr>
+                <w:noProof/>
+                <w:webHidden/>
+              </w:rPr>
+              <w:t>9</w:t>
+            </w:r>
+            <w:r>
+              <w:rPr>
+                <w:noProof/>
+                <w:webHidden/>
+              </w:rPr>
+              <w:fldChar w:fldCharType="end"/>
+            </w:r>
+          </w:hyperlink>
+        </w:p>
+        <w:p>
+          <w:pPr>
+            <w:pStyle w:val="TOC2"/>
+            <w:tabs>
+              <w:tab w:val="left" w:pos="960"/>
+              <w:tab w:val="right" w:leader="dot" w:pos="9350"/>
+            </w:tabs>
+            <w:rPr>
+              <w:rFonts w:asciiTheme="minorHAnsi" w:eastAsiaTheme="minorEastAsia" w:hAnsiTheme="minorHAnsi"/>
+              <w:noProof/>
+            </w:rPr>
+          </w:pPr>
+          <w:hyperlink w:anchor="_Toc238892672" w:history="1">
+            <w:r>
+              <w:rPr>
+                <w:rStyle w:val="Hyperlink"/>
+                <w:noProof/>
+                <w:lang w:val="pt-PT"/>
+              </w:rPr>
+              <w:t>2.7.</w:t>
+            </w:r>
+            <w:r>
+              <w:rPr>
+                <w:rFonts w:asciiTheme="minorHAnsi" w:eastAsiaTheme="minorEastAsia" w:hAnsiTheme="minorHAnsi"/>
+                <w:noProof/>
+              </w:rPr>
+              <w:tab/>
+            </w:r>
+            <w:r>
+              <w:rPr>
+                <w:rStyle w:val="Hyperlink"/>
+                <w:noProof/>
+                <w:lang w:val="pt-PT"/>
+              </w:rPr>
+              <w:t>Integração de Imagens, Áudio, Vídeo e Formulários</w:t>
+            </w:r>
+            <w:r>
+              <w:rPr>
+                <w:noProof/>
+                <w:webHidden/>
+              </w:rPr>
+              <w:tab/>
+            </w:r>
+            <w:r>
+              <w:rPr>
+                <w:noProof/>
+                <w:webHidden/>
+              </w:rPr>
+              <w:fldChar w:fldCharType="begin"/>
+            </w:r>
+            <w:r>
+              <w:rPr>
+                <w:noProof/>
+                <w:webHidden/>
+              </w:rPr>
+              <w:instrText xml:space="preserve"> PAGEREF _Toc238892672 \h </w:instrText>
+            </w:r>
+            <w:r>
+              <w:rPr>
+                <w:noProof/>
+                <w:webHidden/>
+              </w:rPr>
+            </w:r>
+            <w:r>
+              <w:rPr>
+                <w:noProof/>
+                <w:webHidden/>
+              </w:rPr>
+              <w:fldChar w:fldCharType="separate"/>
+            </w:r>
+            <w:r>
+              <w:rPr>
+                <w:noProof/>
+                <w:webHidden/>
+              </w:rPr>
+              <w:t>11</w:t>
+            </w:r>
+            <w:r>
+              <w:rPr>
+                <w:noProof/>
+                <w:webHidden/>
+              </w:rPr>
+              <w:fldChar w:fldCharType="end"/>
+            </w:r>
+          </w:hyperlink>
+        </w:p>
+        <w:p>
+          <w:pPr>
+            <w:pStyle w:val="TOC2"/>
+            <w:tabs>
+              <w:tab w:val="left" w:pos="960"/>
+              <w:tab w:val="right" w:leader="dot" w:pos="9350"/>
+            </w:tabs>
+            <w:rPr>
+              <w:rFonts w:asciiTheme="minorHAnsi" w:eastAsiaTheme="minorEastAsia" w:hAnsiTheme="minorHAnsi"/>
+              <w:noProof/>
+            </w:rPr>
+          </w:pPr>
+          <w:hyperlink w:anchor="_Toc238892673" w:history="1">
+            <w:r>
+              <w:rPr>
+                <w:rStyle w:val="Hyperlink"/>
+                <w:noProof/>
+                <w:lang w:val="pt-PT"/>
+              </w:rPr>
+              <w:t>2.8.</w:t>
+            </w:r>
+            <w:r>
+              <w:rPr>
+                <w:rFonts w:asciiTheme="minorHAnsi" w:eastAsiaTheme="minorEastAsia" w:hAnsiTheme="minorHAnsi"/>
+                <w:noProof/>
+              </w:rPr>
+              <w:tab/>
+            </w:r>
+            <w:r>
+              <w:rPr>
+                <w:rStyle w:val="Hyperlink"/>
+                <w:noProof/>
+                <w:lang w:val="pt-PT"/>
+              </w:rPr>
+              <w:t>Testes e Correcção de Erros</w:t>
+            </w:r>
+            <w:r>
+              <w:rPr>
+                <w:noProof/>
+                <w:webHidden/>
+              </w:rPr>
+              <w:tab/>
+            </w:r>
+            <w:r>
+              <w:rPr>
+                <w:noProof/>
+                <w:webHidden/>
+              </w:rPr>
+              <w:fldChar w:fldCharType="begin"/>
+            </w:r>
+            <w:r>
+              <w:rPr>
+                <w:noProof/>
+                <w:webHidden/>
+              </w:rPr>
+              <w:instrText xml:space="preserve"> PAGEREF _Toc238892673 \h </w:instrText>
+            </w:r>
+            <w:r>
+              <w:rPr>
+                <w:noProof/>
+                <w:webHidden/>
+              </w:rPr>
+            </w:r>
+            <w:r>
+              <w:rPr>
+                <w:noProof/>
+                <w:webHidden/>
+              </w:rPr>
+              <w:fldChar w:fldCharType="separate"/>
+            </w:r>
+            <w:r>
+              <w:rPr>
+                <w:noProof/>
+                <w:webHidden/>
+              </w:rPr>
+              <w:t>12</w:t>
+            </w:r>
+            <w:r>
+              <w:rPr>
+                <w:noProof/>
+                <w:webHidden/>
+              </w:rPr>
+              <w:fldChar w:fldCharType="end"/>
+            </w:r>
+          </w:hyperlink>
+        </w:p>
+        <w:p>
+          <w:pPr>
+            <w:pStyle w:val="TOC2"/>
+            <w:tabs>
+              <w:tab w:val="left" w:pos="960"/>
+              <w:tab w:val="right" w:leader="dot" w:pos="9350"/>
+            </w:tabs>
+            <w:rPr>
+              <w:rFonts w:asciiTheme="minorHAnsi" w:eastAsiaTheme="minorEastAsia" w:hAnsiTheme="minorHAnsi"/>
+              <w:noProof/>
+            </w:rPr>
+          </w:pPr>
+          <w:hyperlink w:anchor="_Toc238892674" w:history="1">
+            <w:r>
+              <w:rPr>
+                <w:rStyle w:val="Hyperlink"/>
+                <w:noProof/>
+                <w:lang w:val="pt-PT"/>
+              </w:rPr>
+              <w:t>2.9.</w:t>
+            </w:r>
+            <w:r>
+              <w:rPr>
+                <w:rFonts w:asciiTheme="minorHAnsi" w:eastAsiaTheme="minorEastAsia" w:hAnsiTheme="minorHAnsi"/>
+                <w:noProof/>
+              </w:rPr>
+              <w:tab/>
+            </w:r>
+            <w:r>
+              <w:rPr>
+                <w:rStyle w:val="Hyperlink"/>
+                <w:noProof/>
+                <w:lang w:val="pt-PT"/>
+              </w:rPr>
+              <w:t>Hospedagem e Publicação</w:t>
+            </w:r>
+            <w:r>
+              <w:rPr>
+                <w:noProof/>
+                <w:webHidden/>
+              </w:rPr>
+              <w:tab/>
+            </w:r>
+            <w:r>
+              <w:rPr>
+                <w:noProof/>
+                <w:webHidden/>
+              </w:rPr>
+              <w:fldChar w:fldCharType="begin"/>
+            </w:r>
+            <w:r>
+              <w:rPr>
+                <w:noProof/>
+                <w:webHidden/>
+              </w:rPr>
+              <w:instrText xml:space="preserve"> PAGEREF _Toc238892674 \h </w:instrText>
+            </w:r>
+            <w:r>
+              <w:rPr>
+                <w:noProof/>
+                <w:webHidden/>
+              </w:rPr>
+            </w:r>
+            <w:r>
+              <w:rPr>
+                <w:noProof/>
+                <w:webHidden/>
+              </w:rPr>
+              <w:fldChar w:fldCharType="separate"/>
+            </w:r>
+            <w:r>
+              <w:rPr>
+                <w:noProof/>
+                <w:webHidden/>
+              </w:rPr>
+              <w:t>13</w:t>
+            </w:r>
+            <w:r>
+              <w:rPr>
+                <w:noProof/>
+                <w:webHidden/>
+              </w:rPr>
+              <w:fldChar w:fldCharType="end"/>
+            </w:r>
+          </w:hyperlink>
+        </w:p>
+        <w:p>
+          <w:pPr>
+            <w:pStyle w:val="TOC2"/>
+            <w:tabs>
+              <w:tab w:val="left" w:pos="1200"/>
+              <w:tab w:val="right" w:leader="dot" w:pos="9350"/>
+            </w:tabs>
+            <w:rPr>
+              <w:rFonts w:asciiTheme="minorHAnsi" w:eastAsiaTheme="minorEastAsia" w:hAnsiTheme="minorHAnsi"/>
+              <w:noProof/>
+            </w:rPr>
+          </w:pPr>
+          <w:hyperlink w:anchor="_Toc238892675" w:history="1">
+            <w:r>
+              <w:rPr>
+                <w:rStyle w:val="Hyperlink"/>
+                <w:noProof/>
+                <w:lang w:val="pt-PT"/>
+              </w:rPr>
+              <w:t>2.10.</w:t>
+            </w:r>
+            <w:r>
+              <w:rPr>
+                <w:rFonts w:asciiTheme="minorHAnsi" w:eastAsiaTheme="minorEastAsia" w:hAnsiTheme="minorHAnsi"/>
+                <w:noProof/>
+              </w:rPr>
+              <w:tab/>
+            </w:r>
+            <w:r>
+              <w:rPr>
+                <w:rStyle w:val="Hyperlink"/>
+                <w:noProof/>
+                <w:lang w:val="pt-PT"/>
+              </w:rPr>
+              <w:t>Apresentação do Projecto</w:t>
+            </w:r>
+            <w:r>
+              <w:rPr>
+                <w:noProof/>
+                <w:webHidden/>
+              </w:rPr>
+              <w:tab/>
+            </w:r>
+            <w:r>
+              <w:rPr>
+                <w:noProof/>
+                <w:webHidden/>
+              </w:rPr>
+              <w:fldChar w:fldCharType="begin"/>
+            </w:r>
+            <w:r>
+              <w:rPr>
+                <w:noProof/>
+                <w:webHidden/>
+              </w:rPr>
+              <w:instrText xml:space="preserve"> PAGEREF _Toc238892675 \h </w:instrText>
+            </w:r>
+            <w:r>
+              <w:rPr>
+                <w:noProof/>
+                <w:webHidden/>
+              </w:rPr>
+            </w:r>
+            <w:r>
+              <w:rPr>
+                <w:noProof/>
+                <w:webHidden/>
+              </w:rPr>
+              <w:fldChar w:fldCharType="separate"/>
+            </w:r>
+            <w:r>
+              <w:rPr>
+                <w:noProof/>
+                <w:webHidden/>
+              </w:rPr>
+              <w:t>16</w:t>
+            </w:r>
+            <w:r>
+              <w:rPr>
+                <w:noProof/>
+                <w:webHidden/>
+              </w:rPr>
+              <w:fldChar w:fldCharType="end"/>
+            </w:r>
+          </w:hyperlink>
+        </w:p>
+        <w:p>
+          <w:pPr>
+            <w:pStyle w:val="TOC1"/>
+            <w:tabs>
+              <w:tab w:val="left" w:pos="480"/>
+              <w:tab w:val="right" w:leader="dot" w:pos="9350"/>
+            </w:tabs>
+            <w:rPr>
+              <w:rFonts w:asciiTheme="minorHAnsi" w:eastAsiaTheme="minorEastAsia" w:hAnsiTheme="minorHAnsi"/>
+              <w:noProof/>
+            </w:rPr>
+          </w:pPr>
+          <w:hyperlink w:anchor="_Toc238892676" w:history="1">
+            <w:r>
+              <w:rPr>
+                <w:rStyle w:val="Hyperlink"/>
+                <w:noProof/>
+                <w:lang w:val="pt-PT"/>
+              </w:rPr>
+              <w:t>3.</w:t>
+            </w:r>
+            <w:r>
+              <w:rPr>
+                <w:rFonts w:asciiTheme="minorHAnsi" w:eastAsiaTheme="minorEastAsia" w:hAnsiTheme="minorHAnsi"/>
+                <w:noProof/>
+              </w:rPr>
+              <w:tab/>
+            </w:r>
+            <w:r>
+              <w:rPr>
+                <w:rStyle w:val="Hyperlink"/>
+                <w:noProof/>
+                <w:lang w:val="pt-PT"/>
+              </w:rPr>
+              <w:t>Conclusão</w:t>
+            </w:r>
+            <w:r>
+              <w:rPr>
+                <w:noProof/>
+                <w:webHidden/>
+              </w:rPr>
+              <w:tab/>
+            </w:r>
+            <w:r>
+              <w:rPr>
+                <w:noProof/>
+                <w:webHidden/>
+              </w:rPr>
+              <w:fldChar w:fldCharType="begin"/>
+            </w:r>
+            <w:r>
+              <w:rPr>
+                <w:noProof/>
+                <w:webHidden/>
+              </w:rPr>
+              <w:instrText xml:space="preserve"> PAGEREF _Toc238892676 \h </w:instrText>
+            </w:r>
+            <w:r>
+              <w:rPr>
+                <w:noProof/>
+                <w:webHidden/>
+              </w:rPr>
+            </w:r>
+            <w:r>
+              <w:rPr>
+                <w:noProof/>
+                <w:webHidden/>
+              </w:rPr>
+              <w:fldChar w:fldCharType="separate"/>
+            </w:r>
+            <w:r>
+              <w:rPr>
+                <w:noProof/>
+                <w:webHidden/>
+              </w:rPr>
+              <w:t>17</w:t>
+            </w:r>
+            <w:r>
+              <w:rPr>
+                <w:noProof/>
+                <w:webHidden/>
+              </w:rPr>
+              <w:fldChar w:fldCharType="end"/>
+            </w:r>
+          </w:hyperlink>
+        </w:p>
+        <w:p>
+          <w:pPr>
+            <w:pStyle w:val="TOC1"/>
+            <w:tabs>
+              <w:tab w:val="right" w:leader="dot" w:pos="9350"/>
+            </w:tabs>
+            <w:rPr>
+              <w:rFonts w:asciiTheme="minorHAnsi" w:eastAsiaTheme="minorEastAsia" w:hAnsiTheme="minorHAnsi"/>
+              <w:noProof/>
+            </w:rPr>
+          </w:pPr>
+          <w:hyperlink w:anchor="_Toc238892677" w:history="1">
+            <w:r>
+              <w:rPr>
+                <w:rStyle w:val="Hyperlink"/>
+                <w:noProof/>
+                <w:lang w:val="pt-PT"/>
+              </w:rPr>
+              <w:t>Referências</w:t>
+            </w:r>
+            <w:r>
+              <w:rPr>
+                <w:noProof/>
+                <w:webHidden/>
+              </w:rPr>
+              <w:tab/>
+            </w:r>
+            <w:r>
+              <w:rPr>
+                <w:noProof/>
+                <w:webHidden/>
+              </w:rPr>
+              <w:fldChar w:fldCharType="begin"/>
+            </w:r>
+            <w:r>
+              <w:rPr>
+                <w:noProof/>
+                <w:webHidden/>
+              </w:rPr>
+              <w:instrText xml:space="preserve"> PAGEREF _Toc238892677 \h </w:instrText>
+            </w:r>
+            <w:r>
+              <w:rPr>
+                <w:noProof/>
+                <w:webHidden/>
+              </w:rPr>
+            </w:r>
+            <w:r>
+              <w:rPr>
+                <w:noProof/>
+                <w:webHidden/>
+              </w:rPr>
+              <w:fldChar w:fldCharType="separate"/>
+            </w:r>
+            <w:r>
+              <w:rPr>
+                <w:noProof/>
+                <w:webHidden/>
+              </w:rPr>
+              <w:t>18</w:t>
             </w:r>
             <w:r>
               <w:rPr>
@@ -746,7 +1332,7 @@
           <w:lang w:val="pt-PT"/>
         </w:rPr>
       </w:pPr>
-      <w:bookmarkStart w:id="0" w:name="_Toc238644600"/>
+      <w:bookmarkStart w:id="0" w:name="_Toc238892663"/>
       <w:r>
         <w:rPr>
           <w:lang w:val="pt-PT"/>
@@ -911,7 +1497,7 @@
           <w:lang w:val="pt-PT"/>
         </w:rPr>
       </w:pPr>
-      <w:bookmarkStart w:id="1" w:name="_Toc238644601"/>
+      <w:bookmarkStart w:id="1" w:name="_Toc238892664"/>
       <w:r>
         <w:rPr>
           <w:lang w:val="pt-PT"/>
@@ -1191,7 +1777,7 @@
           <w:lang w:val="pt-PT"/>
         </w:rPr>
       </w:pPr>
-      <w:bookmarkStart w:id="2" w:name="_Toc238644602"/>
+      <w:bookmarkStart w:id="2" w:name="_Toc238892665"/>
       <w:r>
         <w:rPr>
           <w:lang w:val="pt-PT"/>
@@ -1212,7 +1798,7 @@
           <w:lang w:val="pt-PT"/>
         </w:rPr>
       </w:pPr>
-      <w:bookmarkStart w:id="3" w:name="_Toc238644603"/>
+      <w:bookmarkStart w:id="3" w:name="_Toc238892666"/>
       <w:r>
         <w:rPr>
           <w:lang w:val="pt-PT"/>
@@ -1547,7 +2133,7 @@
           <w:lang w:val="pt-PT"/>
         </w:rPr>
       </w:pPr>
-      <w:bookmarkStart w:id="4" w:name="_Toc238644604"/>
+      <w:bookmarkStart w:id="4" w:name="_Toc238892667"/>
       <w:r>
         <w:rPr>
           <w:lang w:val="pt-PT"/>
@@ -2483,7 +3069,7 @@
           <w:lang w:val="pt-PT"/>
         </w:rPr>
       </w:pPr>
-      <w:bookmarkStart w:id="5" w:name="_Toc238644605"/>
+      <w:bookmarkStart w:id="5" w:name="_Toc238892668"/>
       <w:proofErr w:type="spellStart"/>
       <w:r>
         <w:t>Arquitectura</w:t>
@@ -2689,7 +3275,13 @@
         <w:rPr>
           <w:lang w:val="pt-PT"/>
         </w:rPr>
-        <w:t xml:space="preserve">, ligação para </w:t>
+        <w:t xml:space="preserve"> e </w:t>
+      </w:r>
+      <w:r>
+        <w:rPr>
+          <w:lang w:val="pt-PT"/>
+        </w:rPr>
+        <w:t xml:space="preserve">ligação para </w:t>
       </w:r>
       <w:r>
         <w:rPr>
@@ -2701,7 +3293,7 @@
         <w:rPr>
           <w:lang w:val="pt-PT"/>
         </w:rPr>
-        <w:t xml:space="preserve"> e ligação para rede social.</w:t>
+        <w:t>.</w:t>
       </w:r>
     </w:p>
     <w:p>
@@ -2943,7 +3535,7 @@
           <w:lang w:val="pt-PT"/>
         </w:rPr>
       </w:pPr>
-      <w:bookmarkStart w:id="6" w:name="_Toc238644606"/>
+      <w:bookmarkStart w:id="6" w:name="_Toc238892669"/>
       <w:r>
         <w:rPr>
           <w:lang w:val="pt-PT"/>
@@ -3425,7 +4017,7 @@
           <w:lang w:val="pt-PT"/>
         </w:rPr>
       </w:pPr>
-      <w:bookmarkStart w:id="7" w:name="_Toc238644607"/>
+      <w:bookmarkStart w:id="7" w:name="_Toc238892670"/>
       <w:r>
         <w:rPr>
           <w:lang w:val="pt-PT"/>
@@ -3659,12 +4251,14 @@
           <w:lang w:val="pt-PT"/>
         </w:rPr>
       </w:pPr>
+      <w:bookmarkStart w:id="8" w:name="_Toc238892671"/>
       <w:r>
         <w:rPr>
           <w:lang w:val="pt-PT"/>
         </w:rPr>
         <w:t>Desenvolvimento das Páginas em HTML</w:t>
       </w:r>
+      <w:bookmarkEnd w:id="8"/>
     </w:p>
     <w:p>
       <w:pPr>
@@ -4289,6 +4883,7 @@
           <w:lang w:val="pt-PT"/>
         </w:rPr>
       </w:pPr>
+      <w:bookmarkStart w:id="9" w:name="_Toc238892672"/>
       <w:r>
         <w:rPr>
           <w:lang w:val="pt-PT"/>
@@ -4296,6 +4891,7 @@
         <w:lastRenderedPageBreak/>
         <w:t>Integração de Imagens, Áudio, Vídeo e Formulários</w:t>
       </w:r>
+      <w:bookmarkEnd w:id="9"/>
     </w:p>
     <w:p>
       <w:pPr>
@@ -4551,25 +5147,19 @@
         <w:rPr>
           <w:lang w:val="pt-PT"/>
         </w:rPr>
-        <w:t xml:space="preserve">, </w:t>
+        <w:t xml:space="preserve"> e</w:t>
+      </w:r>
+      <w:r>
+        <w:rPr>
+          <w:lang w:val="pt-PT"/>
+        </w:rPr>
+        <w:t xml:space="preserve"> </w:t>
       </w:r>
       <w:r>
         <w:rPr>
           <w:rStyle w:val="EstrageirasChar"/>
         </w:rPr>
         <w:t>WhatsApp</w:t>
-      </w:r>
-      <w:r>
-        <w:rPr>
-          <w:lang w:val="pt-PT"/>
-        </w:rPr>
-        <w:t xml:space="preserve"> e </w:t>
-      </w:r>
-      <w:r>
-        <w:rPr>
-          <w:rStyle w:val="EstrageirasChar"/>
-        </w:rPr>
-        <w:t>Facebook</w:t>
       </w:r>
       <w:r>
         <w:rPr>
@@ -4709,6 +5299,94 @@
         <w:rPr>
           <w:lang w:val="pt-PT"/>
         </w:rPr>
+        <w:drawing>
+          <wp:inline distT="0" distB="0" distL="0" distR="0" wp14:anchorId="2ACFA972" wp14:editId="7BA43441">
+            <wp:extent cx="6051058" cy="1476375"/>
+            <wp:effectExtent l="0" t="0" r="6985" b="0"/>
+            <wp:docPr id="911394138" name="Picture 1"/>
+            <wp:cNvGraphicFramePr>
+              <a:graphicFrameLocks xmlns:a="http://schemas.openxmlformats.org/drawingml/2006/main" noChangeAspect="1"/>
+            </wp:cNvGraphicFramePr>
+            <a:graphic xmlns:a="http://schemas.openxmlformats.org/drawingml/2006/main">
+              <a:graphicData uri="http://schemas.openxmlformats.org/drawingml/2006/picture">
+                <pic:pic xmlns:pic="http://schemas.openxmlformats.org/drawingml/2006/picture">
+                  <pic:nvPicPr>
+                    <pic:cNvPr id="911394138" name=""/>
+                    <pic:cNvPicPr/>
+                  </pic:nvPicPr>
+                  <pic:blipFill rotWithShape="1">
+                    <a:blip r:embed="rId14"/>
+                    <a:srcRect l="4327" t="52166" r="49038" b="27595"/>
+                    <a:stretch>
+                      <a:fillRect/>
+                    </a:stretch>
+                  </pic:blipFill>
+                  <pic:spPr bwMode="auto">
+                    <a:xfrm>
+                      <a:off x="0" y="0"/>
+                      <a:ext cx="6062960" cy="1479279"/>
+                    </a:xfrm>
+                    <a:prstGeom prst="rect">
+                      <a:avLst/>
+                    </a:prstGeom>
+                    <a:ln>
+                      <a:noFill/>
+                    </a:ln>
+                    <a:extLst>
+                      <a:ext uri="{53640926-AAD7-44D8-BBD7-CCE9431645EC}">
+                        <a14:shadowObscured xmlns:a14="http://schemas.microsoft.com/office/drawing/2010/main"/>
+                      </a:ext>
+                    </a:extLst>
+                  </pic:spPr>
+                </pic:pic>
+              </a:graphicData>
+            </a:graphic>
+          </wp:inline>
+        </w:drawing>
+      </w:r>
+    </w:p>
+    <w:p>
+      <w:pPr>
+        <w:pStyle w:val="Caption"/>
+        <w:jc w:val="center"/>
+        <w:rPr>
+          <w:lang w:val="pt-PT"/>
+        </w:rPr>
+      </w:pPr>
+      <w:r>
+        <w:rPr>
+          <w:lang w:val="pt-PT"/>
+        </w:rPr>
+        <w:t xml:space="preserve">Figura </w:t>
+      </w:r>
+      <w:r>
+        <w:rPr>
+          <w:lang w:val="pt-PT"/>
+        </w:rPr>
+        <w:t>7</w:t>
+      </w:r>
+      <w:r>
+        <w:rPr>
+          <w:lang w:val="pt-PT"/>
+        </w:rPr>
+        <w:t>: Exemplo de campo obrigatório do formulário</w:t>
+      </w:r>
+    </w:p>
+    <w:p>
+      <w:pPr>
+        <w:rPr>
+          <w:lang w:val="pt-PT"/>
+        </w:rPr>
+      </w:pPr>
+    </w:p>
+    <w:p>
+      <w:pPr>
+        <w:keepNext/>
+      </w:pPr>
+      <w:r>
+        <w:rPr>
+          <w:lang w:val="pt-PT"/>
+        </w:rPr>
         <w:lastRenderedPageBreak/>
         <w:drawing>
           <wp:inline distT="0" distB="0" distL="0" distR="0" wp14:anchorId="318802FE" wp14:editId="49F48183">
@@ -4726,7 +5404,7 @@
                     <pic:cNvPicPr/>
                   </pic:nvPicPr>
                   <pic:blipFill rotWithShape="1">
-                    <a:blip r:embed="rId14"/>
+                    <a:blip r:embed="rId15"/>
                     <a:srcRect l="3685" t="31071" r="21314" b="9350"/>
                     <a:stretch>
                       <a:fillRect/>
@@ -4768,29 +5446,19 @@
         <w:rPr>
           <w:lang w:val="pt-PT"/>
         </w:rPr>
-        <w:t xml:space="preserve">Figura </w:t>
-      </w:r>
-      <w:r>
-        <w:fldChar w:fldCharType="begin"/>
-      </w:r>
-      <w:r>
-        <w:rPr>
-          <w:lang w:val="pt-PT"/>
-        </w:rPr>
-        <w:instrText xml:space="preserve"> SEQ Figura \* ARABIC </w:instrText>
-      </w:r>
-      <w:r>
-        <w:fldChar w:fldCharType="separate"/>
-      </w:r>
-      <w:r>
-        <w:rPr>
-          <w:noProof/>
-          <w:lang w:val="pt-PT"/>
-        </w:rPr>
-        <w:t>7</w:t>
-      </w:r>
-      <w:r>
-        <w:fldChar w:fldCharType="end"/>
+        <w:t>Figura</w:t>
+      </w:r>
+      <w:r>
+        <w:rPr>
+          <w:lang w:val="pt-PT"/>
+        </w:rPr>
+        <w:t xml:space="preserve"> </w:t>
+      </w:r>
+      <w:r>
+        <w:rPr>
+          <w:lang w:val="pt-PT"/>
+        </w:rPr>
+        <w:t>8</w:t>
       </w:r>
       <w:r>
         <w:rPr>
@@ -4805,103 +5473,6 @@
           <w:lang w:val="pt-PT"/>
         </w:rPr>
       </w:pPr>
-    </w:p>
-    <w:p>
-      <w:pPr>
-        <w:keepNext/>
-      </w:pPr>
-      <w:r>
-        <w:rPr>
-          <w:lang w:val="pt-PT"/>
-        </w:rPr>
-        <w:drawing>
-          <wp:inline distT="0" distB="0" distL="0" distR="0" wp14:anchorId="6A1DB932" wp14:editId="4683545A">
-            <wp:extent cx="6051058" cy="1476375"/>
-            <wp:effectExtent l="0" t="0" r="6985" b="0"/>
-            <wp:docPr id="911394138" name="Picture 1"/>
-            <wp:cNvGraphicFramePr>
-              <a:graphicFrameLocks xmlns:a="http://schemas.openxmlformats.org/drawingml/2006/main" noChangeAspect="1"/>
-            </wp:cNvGraphicFramePr>
-            <a:graphic xmlns:a="http://schemas.openxmlformats.org/drawingml/2006/main">
-              <a:graphicData uri="http://schemas.openxmlformats.org/drawingml/2006/picture">
-                <pic:pic xmlns:pic="http://schemas.openxmlformats.org/drawingml/2006/picture">
-                  <pic:nvPicPr>
-                    <pic:cNvPr id="911394138" name=""/>
-                    <pic:cNvPicPr/>
-                  </pic:nvPicPr>
-                  <pic:blipFill rotWithShape="1">
-                    <a:blip r:embed="rId15"/>
-                    <a:srcRect l="4327" t="52166" r="49038" b="27595"/>
-                    <a:stretch>
-                      <a:fillRect/>
-                    </a:stretch>
-                  </pic:blipFill>
-                  <pic:spPr bwMode="auto">
-                    <a:xfrm>
-                      <a:off x="0" y="0"/>
-                      <a:ext cx="6062960" cy="1479279"/>
-                    </a:xfrm>
-                    <a:prstGeom prst="rect">
-                      <a:avLst/>
-                    </a:prstGeom>
-                    <a:ln>
-                      <a:noFill/>
-                    </a:ln>
-                    <a:extLst>
-                      <a:ext uri="{53640926-AAD7-44D8-BBD7-CCE9431645EC}">
-                        <a14:shadowObscured xmlns:a14="http://schemas.microsoft.com/office/drawing/2010/main"/>
-                      </a:ext>
-                    </a:extLst>
-                  </pic:spPr>
-                </pic:pic>
-              </a:graphicData>
-            </a:graphic>
-          </wp:inline>
-        </w:drawing>
-      </w:r>
-    </w:p>
-    <w:p>
-      <w:pPr>
-        <w:pStyle w:val="Caption"/>
-        <w:jc w:val="center"/>
-        <w:rPr>
-          <w:lang w:val="pt-PT"/>
-        </w:rPr>
-      </w:pPr>
-      <w:r>
-        <w:rPr>
-          <w:lang w:val="pt-PT"/>
-        </w:rPr>
-        <w:t xml:space="preserve">Figura </w:t>
-      </w:r>
-      <w:r>
-        <w:fldChar w:fldCharType="begin"/>
-      </w:r>
-      <w:r>
-        <w:rPr>
-          <w:lang w:val="pt-PT"/>
-        </w:rPr>
-        <w:instrText xml:space="preserve"> SEQ Figura \* ARABIC </w:instrText>
-      </w:r>
-      <w:r>
-        <w:fldChar w:fldCharType="separate"/>
-      </w:r>
-      <w:r>
-        <w:rPr>
-          <w:noProof/>
-          <w:lang w:val="pt-PT"/>
-        </w:rPr>
-        <w:t>8</w:t>
-      </w:r>
-      <w:r>
-        <w:fldChar w:fldCharType="end"/>
-      </w:r>
-      <w:r>
-        <w:rPr>
-          <w:lang w:val="pt-PT"/>
-        </w:rPr>
-        <w:t>: Exemplo de campo obrigatório do formulário</w:t>
-      </w:r>
     </w:p>
     <w:p>
       <w:pPr>
@@ -4988,6 +5559,7 @@
           <w:lang w:val="pt-PT"/>
         </w:rPr>
       </w:pPr>
+      <w:bookmarkStart w:id="10" w:name="_Toc238892673"/>
       <w:r>
         <w:rPr>
           <w:lang w:val="pt-PT"/>
@@ -5008,6 +5580,7 @@
         </w:rPr>
         <w:t xml:space="preserve"> de Erros</w:t>
       </w:r>
+      <w:bookmarkEnd w:id="10"/>
     </w:p>
     <w:p>
       <w:pPr>
@@ -5112,14 +5685,7 @@
         <w:rPr>
           <w:lang w:val="pt-PT"/>
         </w:rPr>
-        <w:t xml:space="preserve"> e se os conteúdos eram apresentados de forma </w:t>
-      </w:r>
-      <w:r>
-        <w:rPr>
-          <w:lang w:val="pt-PT"/>
-        </w:rPr>
-        <w:lastRenderedPageBreak/>
-        <w:t xml:space="preserve">adequada no navegador. Foram também realizados testes em diferentes tamanhos de ecrã, incluindo computador, </w:t>
+        <w:t xml:space="preserve"> e se os conteúdos eram apresentados de forma adequada no navegador. Foram também realizados testes em diferentes tamanhos de ecrã, incluindo computador, </w:t>
       </w:r>
       <w:r>
         <w:rPr>
@@ -5220,6 +5786,7 @@
         <w:rPr>
           <w:lang w:val="pt-PT"/>
         </w:rPr>
+        <w:lastRenderedPageBreak/>
         <w:t xml:space="preserve">Tabela </w:t>
       </w:r>
       <w:r>
@@ -6111,12 +6678,14 @@
           <w:lang w:val="pt-PT"/>
         </w:rPr>
       </w:pPr>
+      <w:bookmarkStart w:id="11" w:name="_Toc238892674"/>
       <w:r>
         <w:rPr>
           <w:lang w:val="pt-PT"/>
         </w:rPr>
         <w:t>Hospedagem e Publicação</w:t>
       </w:r>
+      <w:bookmarkEnd w:id="11"/>
     </w:p>
     <w:p>
       <w:pPr>
@@ -6229,8 +6798,450 @@
         <w:rPr>
           <w:lang w:val="pt-PT"/>
         </w:rPr>
+        <w:t xml:space="preserve">Para a publicação, os ficheiros do </w:t>
+      </w:r>
+      <w:proofErr w:type="spellStart"/>
+      <w:r>
+        <w:rPr>
+          <w:lang w:val="pt-PT"/>
+        </w:rPr>
+        <w:t>projecto</w:t>
+      </w:r>
+      <w:proofErr w:type="spellEnd"/>
+      <w:r>
+        <w:rPr>
+          <w:lang w:val="pt-PT"/>
+        </w:rPr>
+        <w:t xml:space="preserve"> foram organizados num repositório no </w:t>
+      </w:r>
+      <w:r>
+        <w:rPr>
+          <w:rStyle w:val="EstrageirasChar"/>
+        </w:rPr>
+        <w:t>GitHub</w:t>
+      </w:r>
+      <w:r>
+        <w:rPr>
+          <w:lang w:val="pt-PT"/>
+        </w:rPr>
+        <w:t xml:space="preserve">. Foram incluídas as páginas </w:t>
+      </w:r>
+      <w:r>
+        <w:rPr>
+          <w:rStyle w:val="EstrageirasChar"/>
+        </w:rPr>
+        <w:t>index.html</w:t>
+      </w:r>
+      <w:r>
+        <w:rPr>
+          <w:lang w:val="pt-PT"/>
+        </w:rPr>
+        <w:t xml:space="preserve">, </w:t>
+      </w:r>
+      <w:r>
+        <w:rPr>
+          <w:rStyle w:val="EstrageirasChar"/>
+        </w:rPr>
+        <w:t>sobre.html</w:t>
+      </w:r>
+      <w:r>
+        <w:rPr>
+          <w:lang w:val="pt-PT"/>
+        </w:rPr>
+        <w:t xml:space="preserve">, </w:t>
+      </w:r>
+      <w:r>
+        <w:rPr>
+          <w:rStyle w:val="EstrageirasChar"/>
+        </w:rPr>
+        <w:t>areas.html</w:t>
+      </w:r>
+      <w:r>
+        <w:rPr>
+          <w:lang w:val="pt-PT"/>
+        </w:rPr>
+        <w:t xml:space="preserve">, </w:t>
+      </w:r>
+      <w:r>
+        <w:rPr>
+          <w:rStyle w:val="EstrageirasChar"/>
+        </w:rPr>
+        <w:t>galeria.html</w:t>
+      </w:r>
+      <w:r>
+        <w:rPr>
+          <w:lang w:val="pt-PT"/>
+        </w:rPr>
+        <w:t xml:space="preserve"> e </w:t>
+      </w:r>
+      <w:r>
+        <w:rPr>
+          <w:rStyle w:val="EstrageirasChar"/>
+        </w:rPr>
+        <w:t>contacto.html</w:t>
+      </w:r>
+      <w:r>
+        <w:rPr>
+          <w:lang w:val="pt-PT"/>
+        </w:rPr>
+        <w:t xml:space="preserve">, bem como as pastas destinadas aos estilos </w:t>
+      </w:r>
+      <w:r>
+        <w:rPr>
+          <w:rStyle w:val="EstrageirasChar"/>
+        </w:rPr>
+        <w:t>CSS</w:t>
+      </w:r>
+      <w:r>
+        <w:rPr>
+          <w:lang w:val="pt-PT"/>
+        </w:rPr>
+        <w:t xml:space="preserve">, </w:t>
+      </w:r>
+      <w:r>
+        <w:rPr>
+          <w:rStyle w:val="EstrageirasChar"/>
+        </w:rPr>
+        <w:t>scripts JavaScript</w:t>
+      </w:r>
+      <w:r>
+        <w:rPr>
+          <w:lang w:val="pt-PT"/>
+        </w:rPr>
+        <w:t xml:space="preserve">, imagens, áudio, vídeos e documentos. Em seguida, os ficheiros foram enviados para o repositório e a funcionalidade </w:t>
+      </w:r>
+      <w:r>
+        <w:rPr>
+          <w:rStyle w:val="EstrageirasChar"/>
+        </w:rPr>
+        <w:t xml:space="preserve">GitHub </w:t>
+      </w:r>
+      <w:proofErr w:type="spellStart"/>
+      <w:r>
+        <w:rPr>
+          <w:rStyle w:val="EstrageirasChar"/>
+        </w:rPr>
+        <w:t>Pages</w:t>
+      </w:r>
+      <w:proofErr w:type="spellEnd"/>
+      <w:r>
+        <w:rPr>
+          <w:lang w:val="pt-PT"/>
+        </w:rPr>
+        <w:t xml:space="preserve"> foi </w:t>
+      </w:r>
+      <w:proofErr w:type="spellStart"/>
+      <w:r>
+        <w:rPr>
+          <w:lang w:val="pt-PT"/>
+        </w:rPr>
+        <w:t>activada</w:t>
+      </w:r>
+      <w:proofErr w:type="spellEnd"/>
+      <w:r>
+        <w:rPr>
+          <w:lang w:val="pt-PT"/>
+        </w:rPr>
+        <w:t xml:space="preserve"> nas definições do </w:t>
+      </w:r>
+      <w:proofErr w:type="spellStart"/>
+      <w:r>
+        <w:rPr>
+          <w:lang w:val="pt-PT"/>
+        </w:rPr>
+        <w:t>projecto</w:t>
+      </w:r>
+      <w:proofErr w:type="spellEnd"/>
+      <w:r>
+        <w:rPr>
+          <w:lang w:val="pt-PT"/>
+        </w:rPr>
+        <w:t>.</w:t>
+      </w:r>
+    </w:p>
+    <w:p>
+      <w:pPr>
+        <w:rPr>
+          <w:lang w:val="pt-PT"/>
+        </w:rPr>
+      </w:pPr>
+      <w:r>
+        <w:rPr>
+          <w:lang w:val="pt-PT"/>
+        </w:rPr>
+        <w:t xml:space="preserve">A publicação foi configurada a partir da </w:t>
+      </w:r>
+      <w:proofErr w:type="spellStart"/>
+      <w:r>
+        <w:rPr>
+          <w:rStyle w:val="EstrageirasChar"/>
+        </w:rPr>
+        <w:t>branch</w:t>
+      </w:r>
+      <w:proofErr w:type="spellEnd"/>
+      <w:r>
+        <w:rPr>
+          <w:lang w:val="pt-PT"/>
+        </w:rPr>
+        <w:t xml:space="preserve"> principal do repositório, permitindo que o </w:t>
+      </w:r>
+      <w:r>
+        <w:rPr>
+          <w:rStyle w:val="EstrageirasChar"/>
+        </w:rPr>
+        <w:t>GitHub</w:t>
+      </w:r>
+      <w:r>
+        <w:rPr>
+          <w:lang w:val="pt-PT"/>
+        </w:rPr>
+        <w:t xml:space="preserve"> </w:t>
+      </w:r>
+      <w:proofErr w:type="spellStart"/>
+      <w:r>
+        <w:rPr>
+          <w:rStyle w:val="EstrageirasChar"/>
+        </w:rPr>
+        <w:t>Pages</w:t>
+      </w:r>
+      <w:proofErr w:type="spellEnd"/>
+      <w:r>
+        <w:rPr>
+          <w:lang w:val="pt-PT"/>
+        </w:rPr>
+        <w:t xml:space="preserve"> disponibilizasse automaticamente o conteúdo do </w:t>
+      </w:r>
+      <w:proofErr w:type="spellStart"/>
+      <w:r>
+        <w:rPr>
+          <w:lang w:val="pt-PT"/>
+        </w:rPr>
+        <w:t>projecto</w:t>
+      </w:r>
+      <w:proofErr w:type="spellEnd"/>
+      <w:r>
+        <w:rPr>
+          <w:lang w:val="pt-PT"/>
+        </w:rPr>
+        <w:t xml:space="preserve"> através de um endereço </w:t>
+      </w:r>
+      <w:r>
+        <w:rPr>
+          <w:rStyle w:val="EstrageirasChar"/>
+        </w:rPr>
+        <w:t>web</w:t>
+      </w:r>
+      <w:r>
+        <w:rPr>
+          <w:lang w:val="pt-PT"/>
+        </w:rPr>
+        <w:t xml:space="preserve">. Sempre que são realizadas alterações e enviadas para o repositório, o website pode ser </w:t>
+      </w:r>
+      <w:proofErr w:type="spellStart"/>
+      <w:r>
+        <w:rPr>
+          <w:lang w:val="pt-PT"/>
+        </w:rPr>
+        <w:t>actualizado</w:t>
+      </w:r>
+      <w:proofErr w:type="spellEnd"/>
+      <w:r>
+        <w:rPr>
+          <w:lang w:val="pt-PT"/>
+        </w:rPr>
+        <w:t xml:space="preserve"> com a nova versão dos ficheiros. O </w:t>
+      </w:r>
+      <w:r>
+        <w:rPr>
+          <w:rStyle w:val="EstrageirasChar"/>
+        </w:rPr>
+        <w:t xml:space="preserve">GitHub </w:t>
+      </w:r>
+      <w:proofErr w:type="spellStart"/>
+      <w:r>
+        <w:rPr>
+          <w:rStyle w:val="EstrageirasChar"/>
+        </w:rPr>
+        <w:t>Pages</w:t>
+      </w:r>
+      <w:proofErr w:type="spellEnd"/>
+      <w:r>
+        <w:rPr>
+          <w:lang w:val="pt-PT"/>
+        </w:rPr>
+        <w:t xml:space="preserve"> permite publicar um </w:t>
+      </w:r>
+      <w:r>
+        <w:rPr>
+          <w:rStyle w:val="EstrageirasChar"/>
+        </w:rPr>
+        <w:t>site</w:t>
+      </w:r>
+      <w:r>
+        <w:rPr>
+          <w:lang w:val="pt-PT"/>
+        </w:rPr>
+        <w:t xml:space="preserve"> a partir de uma </w:t>
+      </w:r>
+      <w:proofErr w:type="spellStart"/>
+      <w:r>
+        <w:rPr>
+          <w:rStyle w:val="EstrageirasChar"/>
+        </w:rPr>
+        <w:t>branch</w:t>
+      </w:r>
+      <w:proofErr w:type="spellEnd"/>
+      <w:r>
+        <w:rPr>
+          <w:lang w:val="pt-PT"/>
+        </w:rPr>
+        <w:t xml:space="preserve"> configurada ou através de um fluxo de trabalho de implantação.</w:t>
+      </w:r>
+    </w:p>
+    <w:p>
+      <w:pPr>
+        <w:rPr>
+          <w:lang w:val="pt-PT"/>
+        </w:rPr>
+      </w:pPr>
+      <w:r>
+        <w:rPr>
+          <w:lang w:val="pt-PT"/>
+        </w:rPr>
         <w:lastRenderedPageBreak/>
-        <w:t xml:space="preserve">Para a publicação, os ficheiros do </w:t>
+        <w:t xml:space="preserve">Após a </w:t>
+      </w:r>
+      <w:proofErr w:type="spellStart"/>
+      <w:r>
+        <w:rPr>
+          <w:lang w:val="pt-PT"/>
+        </w:rPr>
+        <w:t>activação</w:t>
+      </w:r>
+      <w:proofErr w:type="spellEnd"/>
+      <w:r>
+        <w:rPr>
+          <w:lang w:val="pt-PT"/>
+        </w:rPr>
+        <w:t xml:space="preserve"> da hospedagem, foi realizado um novo teste através do endereço publicado. Foram verificados o carregamento das páginas, os </w:t>
+      </w:r>
+      <w:r>
+        <w:rPr>
+          <w:rStyle w:val="EstrageirasChar"/>
+        </w:rPr>
+        <w:t>links</w:t>
+      </w:r>
+      <w:r>
+        <w:rPr>
+          <w:lang w:val="pt-PT"/>
+        </w:rPr>
+        <w:t xml:space="preserve"> de navegação, o funcionamento do menu, a apresentação das imagens, o carrossel, o formulário de contacto, os recursos multimédia e a adaptação do conteúdo a diferentes tamanhos de ecrã.</w:t>
+      </w:r>
+    </w:p>
+    <w:p>
+      <w:pPr>
+        <w:keepNext/>
+      </w:pPr>
+      <w:r>
+        <w:rPr>
+          <w:noProof/>
+        </w:rPr>
+        <w:drawing>
+          <wp:inline distT="0" distB="0" distL="0" distR="0" wp14:anchorId="4589D2CD" wp14:editId="684ABB9B">
+            <wp:extent cx="5942893" cy="4880758"/>
+            <wp:effectExtent l="0" t="0" r="1270" b="0"/>
+            <wp:docPr id="696194719" name="Picture 1"/>
+            <wp:cNvGraphicFramePr>
+              <a:graphicFrameLocks xmlns:a="http://schemas.openxmlformats.org/drawingml/2006/main" noChangeAspect="1"/>
+            </wp:cNvGraphicFramePr>
+            <a:graphic xmlns:a="http://schemas.openxmlformats.org/drawingml/2006/main">
+              <a:graphicData uri="http://schemas.openxmlformats.org/drawingml/2006/picture">
+                <pic:pic xmlns:pic="http://schemas.openxmlformats.org/drawingml/2006/picture">
+                  <pic:nvPicPr>
+                    <pic:cNvPr id="0" name="Picture 1"/>
+                    <pic:cNvPicPr>
+                      <a:picLocks noChangeAspect="1" noChangeArrowheads="1"/>
+                    </pic:cNvPicPr>
+                  </pic:nvPicPr>
+                  <pic:blipFill rotWithShape="1">
+                    <a:blip r:embed="rId16">
+                      <a:extLst>
+                        <a:ext uri="{28A0092B-C50C-407E-A947-70E740481C1C}">
+                          <a14:useLocalDpi xmlns:a14="http://schemas.microsoft.com/office/drawing/2010/main" val="0"/>
+                        </a:ext>
+                      </a:extLst>
+                    </a:blip>
+                    <a:srcRect b="37176"/>
+                    <a:stretch>
+                      <a:fillRect/>
+                    </a:stretch>
+                  </pic:blipFill>
+                  <pic:spPr bwMode="auto">
+                    <a:xfrm>
+                      <a:off x="0" y="0"/>
+                      <a:ext cx="5943600" cy="4881338"/>
+                    </a:xfrm>
+                    <a:prstGeom prst="rect">
+                      <a:avLst/>
+                    </a:prstGeom>
+                    <a:noFill/>
+                    <a:ln>
+                      <a:noFill/>
+                    </a:ln>
+                    <a:extLst>
+                      <a:ext uri="{53640926-AAD7-44D8-BBD7-CCE9431645EC}">
+                        <a14:shadowObscured xmlns:a14="http://schemas.microsoft.com/office/drawing/2010/main"/>
+                      </a:ext>
+                    </a:extLst>
+                  </pic:spPr>
+                </pic:pic>
+              </a:graphicData>
+            </a:graphic>
+          </wp:inline>
+        </w:drawing>
+      </w:r>
+    </w:p>
+    <w:p>
+      <w:pPr>
+        <w:pStyle w:val="Caption"/>
+        <w:jc w:val="center"/>
+        <w:rPr>
+          <w:lang w:val="pt-PT"/>
+        </w:rPr>
+      </w:pPr>
+      <w:r>
+        <w:rPr>
+          <w:lang w:val="pt-PT"/>
+        </w:rPr>
+        <w:t xml:space="preserve">Figura </w:t>
+      </w:r>
+      <w:r>
+        <w:fldChar w:fldCharType="begin"/>
+      </w:r>
+      <w:r>
+        <w:rPr>
+          <w:lang w:val="pt-PT"/>
+        </w:rPr>
+        <w:instrText xml:space="preserve"> SEQ Figura \* ARABIC </w:instrText>
+      </w:r>
+      <w:r>
+        <w:fldChar w:fldCharType="separate"/>
+      </w:r>
+      <w:r>
+        <w:rPr>
+          <w:noProof/>
+          <w:lang w:val="pt-PT"/>
+        </w:rPr>
+        <w:t>7</w:t>
+      </w:r>
+      <w:r>
+        <w:fldChar w:fldCharType="end"/>
+      </w:r>
+      <w:r>
+        <w:rPr>
+          <w:lang w:val="pt-PT"/>
+        </w:rPr>
+        <w:t xml:space="preserve">: Repositório do </w:t>
       </w:r>
       <w:proofErr w:type="spellStart"/>
       <w:r>
@@ -6244,25 +7255,838 @@
         <w:rPr>
           <w:lang w:val="pt-PT"/>
         </w:rPr>
-        <w:t xml:space="preserve"> foram organizados num repositório no </w:t>
-      </w:r>
-      <w:r>
-        <w:rPr>
-          <w:rStyle w:val="EstrageirasChar"/>
-        </w:rPr>
-        <w:t>GitHub</w:t>
-      </w:r>
-      <w:r>
-        <w:rPr>
-          <w:lang w:val="pt-PT"/>
-        </w:rPr>
-        <w:t xml:space="preserve">. Foram incluídas as páginas </w:t>
-      </w:r>
-      <w:r>
-        <w:rPr>
-          <w:rStyle w:val="EstrageirasChar"/>
-        </w:rPr>
-        <w:t>index.html</w:t>
+        <w:t xml:space="preserve"> </w:t>
+      </w:r>
+      <w:proofErr w:type="spellStart"/>
+      <w:r>
+        <w:rPr>
+          <w:lang w:val="pt-PT"/>
+        </w:rPr>
+        <w:t>InfoTech</w:t>
+      </w:r>
+      <w:proofErr w:type="spellEnd"/>
+      <w:r>
+        <w:rPr>
+          <w:lang w:val="pt-PT"/>
+        </w:rPr>
+        <w:t xml:space="preserve"> no GitHub</w:t>
+      </w:r>
+    </w:p>
+    <w:p>
+      <w:pPr>
+        <w:keepNext/>
+      </w:pPr>
+      <w:r>
+        <w:rPr>
+          <w:noProof/>
+        </w:rPr>
+        <w:lastRenderedPageBreak/>
+        <w:drawing>
+          <wp:inline distT="0" distB="0" distL="0" distR="0" wp14:anchorId="45F2998B" wp14:editId="11C48696">
+            <wp:extent cx="5943600" cy="2817628"/>
+            <wp:effectExtent l="0" t="0" r="0" b="1905"/>
+            <wp:docPr id="1187859245" name="Picture 2"/>
+            <wp:cNvGraphicFramePr>
+              <a:graphicFrameLocks xmlns:a="http://schemas.openxmlformats.org/drawingml/2006/main" noChangeAspect="1"/>
+            </wp:cNvGraphicFramePr>
+            <a:graphic xmlns:a="http://schemas.openxmlformats.org/drawingml/2006/main">
+              <a:graphicData uri="http://schemas.openxmlformats.org/drawingml/2006/picture">
+                <pic:pic xmlns:pic="http://schemas.openxmlformats.org/drawingml/2006/picture">
+                  <pic:nvPicPr>
+                    <pic:cNvPr id="0" name="Picture 3"/>
+                    <pic:cNvPicPr>
+                      <a:picLocks noChangeAspect="1" noChangeArrowheads="1"/>
+                    </pic:cNvPicPr>
+                  </pic:nvPicPr>
+                  <pic:blipFill rotWithShape="1">
+                    <a:blip r:embed="rId17">
+                      <a:extLst>
+                        <a:ext uri="{28A0092B-C50C-407E-A947-70E740481C1C}">
+                          <a14:useLocalDpi xmlns:a14="http://schemas.microsoft.com/office/drawing/2010/main" val="0"/>
+                        </a:ext>
+                      </a:extLst>
+                    </a:blip>
+                    <a:srcRect b="43540"/>
+                    <a:stretch>
+                      <a:fillRect/>
+                    </a:stretch>
+                  </pic:blipFill>
+                  <pic:spPr bwMode="auto">
+                    <a:xfrm>
+                      <a:off x="0" y="0"/>
+                      <a:ext cx="5943600" cy="2817628"/>
+                    </a:xfrm>
+                    <a:prstGeom prst="rect">
+                      <a:avLst/>
+                    </a:prstGeom>
+                    <a:noFill/>
+                    <a:ln>
+                      <a:noFill/>
+                    </a:ln>
+                    <a:extLst>
+                      <a:ext uri="{53640926-AAD7-44D8-BBD7-CCE9431645EC}">
+                        <a14:shadowObscured xmlns:a14="http://schemas.microsoft.com/office/drawing/2010/main"/>
+                      </a:ext>
+                    </a:extLst>
+                  </pic:spPr>
+                </pic:pic>
+              </a:graphicData>
+            </a:graphic>
+          </wp:inline>
+        </w:drawing>
+      </w:r>
+    </w:p>
+    <w:p>
+      <w:pPr>
+        <w:pStyle w:val="Caption"/>
+        <w:jc w:val="center"/>
+        <w:rPr>
+          <w:lang w:val="pt-PT"/>
+        </w:rPr>
+      </w:pPr>
+      <w:r>
+        <w:rPr>
+          <w:lang w:val="pt-PT"/>
+        </w:rPr>
+        <w:t xml:space="preserve">Figura </w:t>
+      </w:r>
+      <w:r>
+        <w:fldChar w:fldCharType="begin"/>
+      </w:r>
+      <w:r>
+        <w:rPr>
+          <w:lang w:val="pt-PT"/>
+        </w:rPr>
+        <w:instrText xml:space="preserve"> SEQ Figura \* ARABIC </w:instrText>
+      </w:r>
+      <w:r>
+        <w:fldChar w:fldCharType="separate"/>
+      </w:r>
+      <w:r>
+        <w:rPr>
+          <w:noProof/>
+          <w:lang w:val="pt-PT"/>
+        </w:rPr>
+        <w:t>8</w:t>
+      </w:r>
+      <w:r>
+        <w:fldChar w:fldCharType="end"/>
+      </w:r>
+      <w:r>
+        <w:rPr>
+          <w:lang w:val="pt-PT"/>
+        </w:rPr>
+        <w:t xml:space="preserve">: Configuração do GitHub </w:t>
+      </w:r>
+      <w:proofErr w:type="spellStart"/>
+      <w:r>
+        <w:rPr>
+          <w:lang w:val="pt-PT"/>
+        </w:rPr>
+        <w:t>Pages</w:t>
+      </w:r>
+      <w:proofErr w:type="spellEnd"/>
+      <w:r>
+        <w:rPr>
+          <w:lang w:val="pt-PT"/>
+        </w:rPr>
+        <w:t xml:space="preserve"> para publicação do website</w:t>
+      </w:r>
+    </w:p>
+    <w:p>
+      <w:pPr>
+        <w:keepNext/>
+      </w:pPr>
+      <w:r>
+        <w:rPr>
+          <w:lang w:val="pt-PT"/>
+        </w:rPr>
+        <w:drawing>
+          <wp:inline distT="0" distB="0" distL="0" distR="0" wp14:anchorId="0CBC0FE2" wp14:editId="51168FD3">
+            <wp:extent cx="5943600" cy="3341370"/>
+            <wp:effectExtent l="0" t="0" r="0" b="0"/>
+            <wp:docPr id="1400711507" name="Picture 1"/>
+            <wp:cNvGraphicFramePr>
+              <a:graphicFrameLocks xmlns:a="http://schemas.openxmlformats.org/drawingml/2006/main" noChangeAspect="1"/>
+            </wp:cNvGraphicFramePr>
+            <a:graphic xmlns:a="http://schemas.openxmlformats.org/drawingml/2006/main">
+              <a:graphicData uri="http://schemas.openxmlformats.org/drawingml/2006/picture">
+                <pic:pic xmlns:pic="http://schemas.openxmlformats.org/drawingml/2006/picture">
+                  <pic:nvPicPr>
+                    <pic:cNvPr id="1400711507" name=""/>
+                    <pic:cNvPicPr/>
+                  </pic:nvPicPr>
+                  <pic:blipFill>
+                    <a:blip r:embed="rId18"/>
+                    <a:stretch>
+                      <a:fillRect/>
+                    </a:stretch>
+                  </pic:blipFill>
+                  <pic:spPr>
+                    <a:xfrm>
+                      <a:off x="0" y="0"/>
+                      <a:ext cx="5943600" cy="3341370"/>
+                    </a:xfrm>
+                    <a:prstGeom prst="rect">
+                      <a:avLst/>
+                    </a:prstGeom>
+                  </pic:spPr>
+                </pic:pic>
+              </a:graphicData>
+            </a:graphic>
+          </wp:inline>
+        </w:drawing>
+      </w:r>
+    </w:p>
+    <w:p>
+      <w:pPr>
+        <w:pStyle w:val="Caption"/>
+        <w:jc w:val="center"/>
+        <w:rPr>
+          <w:lang w:val="pt-PT"/>
+        </w:rPr>
+      </w:pPr>
+      <w:r>
+        <w:rPr>
+          <w:lang w:val="pt-PT"/>
+        </w:rPr>
+        <w:t xml:space="preserve">Figura </w:t>
+      </w:r>
+      <w:r>
+        <w:fldChar w:fldCharType="begin"/>
+      </w:r>
+      <w:r>
+        <w:rPr>
+          <w:lang w:val="pt-PT"/>
+        </w:rPr>
+        <w:instrText xml:space="preserve"> SEQ Figura \* ARABIC </w:instrText>
+      </w:r>
+      <w:r>
+        <w:fldChar w:fldCharType="separate"/>
+      </w:r>
+      <w:r>
+        <w:rPr>
+          <w:noProof/>
+          <w:lang w:val="pt-PT"/>
+        </w:rPr>
+        <w:t>9</w:t>
+      </w:r>
+      <w:r>
+        <w:fldChar w:fldCharType="end"/>
+      </w:r>
+      <w:r>
+        <w:rPr>
+          <w:lang w:val="pt-PT"/>
+        </w:rPr>
+        <w:t xml:space="preserve">: Website </w:t>
+      </w:r>
+      <w:proofErr w:type="spellStart"/>
+      <w:r>
+        <w:rPr>
+          <w:lang w:val="pt-PT"/>
+        </w:rPr>
+        <w:t>InfoTech</w:t>
+      </w:r>
+      <w:proofErr w:type="spellEnd"/>
+      <w:r>
+        <w:rPr>
+          <w:lang w:val="pt-PT"/>
+        </w:rPr>
+        <w:t xml:space="preserve"> publicado no GitHub </w:t>
+      </w:r>
+      <w:proofErr w:type="spellStart"/>
+      <w:r>
+        <w:rPr>
+          <w:lang w:val="pt-PT"/>
+        </w:rPr>
+        <w:t>Pages</w:t>
+      </w:r>
+      <w:proofErr w:type="spellEnd"/>
+    </w:p>
+    <w:p>
+      <w:pPr>
+        <w:rPr>
+          <w:i/>
+          <w:iCs/>
+          <w:lang w:val="pt-PT"/>
+        </w:rPr>
+      </w:pPr>
+      <w:r>
+        <w:rPr>
+          <w:lang w:val="pt-PT"/>
+        </w:rPr>
+        <w:t>Link do website publicado:</w:t>
+      </w:r>
+      <w:r>
+        <w:rPr>
+          <w:lang w:val="pt-PT"/>
+        </w:rPr>
+        <w:t xml:space="preserve"> </w:t>
+      </w:r>
+      <w:hyperlink r:id="rId19" w:history="1">
+        <w:r>
+          <w:rPr>
+            <w:rStyle w:val="Hyperlink"/>
+            <w:i/>
+            <w:iCs/>
+            <w:color w:val="508999" w:themeColor="hyperlink" w:themeTint="E6"/>
+            <w:lang w:val="pt-PT"/>
+          </w:rPr>
+          <w:t>https://julex258.github.io/infotech</w:t>
+        </w:r>
+        <w:r>
+          <w:rPr>
+            <w:rStyle w:val="Hyperlink"/>
+            <w:i/>
+            <w:iCs/>
+            <w:lang w:val="pt-PT"/>
+          </w:rPr>
+          <w:t>/</w:t>
+        </w:r>
+      </w:hyperlink>
+    </w:p>
+    <w:p>
+      <w:pPr>
+        <w:rPr>
+          <w:lang w:val="pt-PT"/>
+        </w:rPr>
+      </w:pPr>
+    </w:p>
+    <w:p>
+      <w:pPr>
+        <w:rPr>
+          <w:lang w:val="pt-PT"/>
+        </w:rPr>
+      </w:pPr>
+      <w:r>
+        <w:rPr>
+          <w:b/>
+          <w:bCs/>
+          <w:lang w:val="pt-PT"/>
+        </w:rPr>
+        <w:t>Resultado</w:t>
+      </w:r>
+      <w:r>
+        <w:rPr>
+          <w:lang w:val="pt-PT"/>
+        </w:rPr>
+        <w:t xml:space="preserve">: </w:t>
+      </w:r>
+      <w:r>
+        <w:rPr>
+          <w:lang w:val="pt-PT"/>
+        </w:rPr>
+        <w:t xml:space="preserve">Como resultado, o website </w:t>
+      </w:r>
+      <w:proofErr w:type="spellStart"/>
+      <w:r>
+        <w:rPr>
+          <w:lang w:val="pt-PT"/>
+        </w:rPr>
+        <w:t>InfoTech</w:t>
+      </w:r>
+      <w:proofErr w:type="spellEnd"/>
+      <w:r>
+        <w:rPr>
+          <w:lang w:val="pt-PT"/>
+        </w:rPr>
+        <w:t xml:space="preserve"> ficou publicado e acessível através da Internet. A utilização do GitHub </w:t>
+      </w:r>
+      <w:proofErr w:type="spellStart"/>
+      <w:r>
+        <w:rPr>
+          <w:lang w:val="pt-PT"/>
+        </w:rPr>
+        <w:t>Pages</w:t>
+      </w:r>
+      <w:proofErr w:type="spellEnd"/>
+      <w:r>
+        <w:rPr>
+          <w:lang w:val="pt-PT"/>
+        </w:rPr>
+        <w:t xml:space="preserve"> permitiu disponibilizar o </w:t>
+      </w:r>
+      <w:proofErr w:type="spellStart"/>
+      <w:r>
+        <w:rPr>
+          <w:lang w:val="pt-PT"/>
+        </w:rPr>
+        <w:t>projecto</w:t>
+      </w:r>
+      <w:proofErr w:type="spellEnd"/>
+      <w:r>
+        <w:rPr>
+          <w:lang w:val="pt-PT"/>
+        </w:rPr>
+        <w:t xml:space="preserve"> de forma gratuita, mantendo os ficheiros organizados num repositório e facilitando futuras </w:t>
+      </w:r>
+      <w:proofErr w:type="spellStart"/>
+      <w:r>
+        <w:rPr>
+          <w:lang w:val="pt-PT"/>
+        </w:rPr>
+        <w:t>actualizações</w:t>
+      </w:r>
+      <w:proofErr w:type="spellEnd"/>
+      <w:r>
+        <w:rPr>
+          <w:lang w:val="pt-PT"/>
+        </w:rPr>
+        <w:t xml:space="preserve"> do conteúdo.</w:t>
+      </w:r>
+    </w:p>
+    <w:p>
+      <w:pPr>
+        <w:pStyle w:val="Heading2"/>
+        <w:numPr>
+          <w:ilvl w:val="1"/>
+          <w:numId w:val="2"/>
+        </w:numPr>
+        <w:rPr>
+          <w:lang w:val="pt-PT"/>
+        </w:rPr>
+      </w:pPr>
+      <w:r>
+        <w:rPr>
+          <w:lang w:val="pt-PT"/>
+        </w:rPr>
+        <w:lastRenderedPageBreak/>
+        <w:t xml:space="preserve"> </w:t>
+      </w:r>
+      <w:bookmarkStart w:id="12" w:name="_Toc238892675"/>
+      <w:r>
+        <w:rPr>
+          <w:lang w:val="pt-PT"/>
+        </w:rPr>
+        <w:t xml:space="preserve">Apresentação do </w:t>
+      </w:r>
+      <w:proofErr w:type="spellStart"/>
+      <w:r>
+        <w:rPr>
+          <w:lang w:val="pt-PT"/>
+        </w:rPr>
+        <w:t>Projecto</w:t>
+      </w:r>
+      <w:bookmarkEnd w:id="12"/>
+      <w:proofErr w:type="spellEnd"/>
+    </w:p>
+    <w:p>
+      <w:pPr>
+        <w:rPr>
+          <w:lang w:val="pt-PT"/>
+        </w:rPr>
+      </w:pPr>
+      <w:r>
+        <w:rPr>
+          <w:lang w:val="pt-PT"/>
+        </w:rPr>
+        <w:t xml:space="preserve">A apresentação do </w:t>
+      </w:r>
+      <w:proofErr w:type="spellStart"/>
+      <w:r>
+        <w:rPr>
+          <w:lang w:val="pt-PT"/>
+        </w:rPr>
+        <w:t>projecto</w:t>
+      </w:r>
+      <w:proofErr w:type="spellEnd"/>
+      <w:r>
+        <w:rPr>
+          <w:lang w:val="pt-PT"/>
+        </w:rPr>
+        <w:t xml:space="preserve"> será realizada através da demonstração do website </w:t>
+      </w:r>
+      <w:proofErr w:type="spellStart"/>
+      <w:r>
+        <w:rPr>
+          <w:rStyle w:val="EstrageirasChar"/>
+        </w:rPr>
+        <w:t>InfoTech</w:t>
+      </w:r>
+      <w:proofErr w:type="spellEnd"/>
+      <w:r>
+        <w:rPr>
+          <w:lang w:val="pt-PT"/>
+        </w:rPr>
+        <w:t xml:space="preserve"> no navegador. Durante a apresentação, serão mostradas as páginas principais, a organização do menu, os conteúdos sobre as áreas da informática, os recursos multimédia e as funcionalidades </w:t>
+      </w:r>
+      <w:proofErr w:type="spellStart"/>
+      <w:r>
+        <w:rPr>
+          <w:lang w:val="pt-PT"/>
+        </w:rPr>
+        <w:t>interactivas</w:t>
+      </w:r>
+      <w:proofErr w:type="spellEnd"/>
+      <w:r>
+        <w:rPr>
+          <w:lang w:val="pt-PT"/>
+        </w:rPr>
+        <w:t>.</w:t>
+      </w:r>
+    </w:p>
+    <w:p>
+      <w:pPr>
+        <w:rPr>
+          <w:lang w:val="pt-PT"/>
+        </w:rPr>
+      </w:pPr>
+      <w:r>
+        <w:rPr>
+          <w:lang w:val="pt-PT"/>
+        </w:rPr>
+        <w:t xml:space="preserve">Inicialmente será apresentada a </w:t>
+      </w:r>
+      <w:proofErr w:type="spellStart"/>
+      <w:r>
+        <w:rPr>
+          <w:rStyle w:val="EstrageirasChar"/>
+        </w:rPr>
+        <w:t>Home</w:t>
+      </w:r>
+      <w:proofErr w:type="spellEnd"/>
+      <w:r>
+        <w:rPr>
+          <w:rStyle w:val="EstrageirasChar"/>
+        </w:rPr>
+        <w:t xml:space="preserve"> </w:t>
+      </w:r>
+      <w:proofErr w:type="spellStart"/>
+      <w:r>
+        <w:rPr>
+          <w:rStyle w:val="EstrageirasChar"/>
+        </w:rPr>
+        <w:t>Page</w:t>
+      </w:r>
+      <w:proofErr w:type="spellEnd"/>
+      <w:r>
+        <w:rPr>
+          <w:lang w:val="pt-PT"/>
+        </w:rPr>
+        <w:t xml:space="preserve">, destacando o nome do </w:t>
+      </w:r>
+      <w:proofErr w:type="spellStart"/>
+      <w:r>
+        <w:rPr>
+          <w:lang w:val="pt-PT"/>
+        </w:rPr>
+        <w:t>projecto</w:t>
+      </w:r>
+      <w:proofErr w:type="spellEnd"/>
+      <w:r>
+        <w:rPr>
+          <w:lang w:val="pt-PT"/>
+        </w:rPr>
+        <w:t xml:space="preserve">, o menu de navegação, o botão de alteração de tema e as áreas em destaque. Em seguida, serão apresentadas as páginas </w:t>
+      </w:r>
+      <w:proofErr w:type="gramStart"/>
+      <w:r>
+        <w:rPr>
+          <w:lang w:val="pt-PT"/>
+        </w:rPr>
+        <w:t>Sobre, Áreas</w:t>
+      </w:r>
+      <w:proofErr w:type="gramEnd"/>
+      <w:r>
+        <w:rPr>
+          <w:lang w:val="pt-PT"/>
+        </w:rPr>
+        <w:t>, Galeria e Contacto.</w:t>
+      </w:r>
+    </w:p>
+    <w:p>
+      <w:pPr>
+        <w:rPr>
+          <w:lang w:val="pt-PT"/>
+        </w:rPr>
+      </w:pPr>
+      <w:r>
+        <w:rPr>
+          <w:lang w:val="pt-PT"/>
+        </w:rPr>
+        <w:t xml:space="preserve">Na página Áreas será demonstrado o funcionamento dos cartões expansíveis. Na Galeria será demonstrado o carrossel, o áudio, o vídeo e as legendas. Na página Contacto serão apresentados o formulário e os links funcionais para telefone, </w:t>
+      </w:r>
+      <w:r>
+        <w:rPr>
+          <w:rStyle w:val="EstrageirasChar"/>
+        </w:rPr>
+        <w:t>e-mail</w:t>
+      </w:r>
+      <w:r>
+        <w:rPr>
+          <w:lang w:val="pt-PT"/>
+        </w:rPr>
+        <w:t xml:space="preserve"> e </w:t>
+      </w:r>
+      <w:r>
+        <w:rPr>
+          <w:rStyle w:val="EstrageirasChar"/>
+        </w:rPr>
+        <w:t>WhatsApp</w:t>
+      </w:r>
+      <w:r>
+        <w:rPr>
+          <w:lang w:val="pt-PT"/>
+        </w:rPr>
+        <w:t>.</w:t>
+      </w:r>
+    </w:p>
+    <w:p>
+      <w:pPr>
+        <w:rPr>
+          <w:lang w:val="pt-PT"/>
+        </w:rPr>
+      </w:pPr>
+      <w:r>
+        <w:rPr>
+          <w:lang w:val="pt-PT"/>
+        </w:rPr>
+        <w:t xml:space="preserve">A apresentação permitirá demonstrar não apenas o produto final, mas também as competências adquiridas durante o desenvolvimento, incluindo organização de conteúdos, estruturação de páginas, integração de recursos multimédia, utilização de estilos </w:t>
+      </w:r>
+      <w:r>
+        <w:rPr>
+          <w:rStyle w:val="EstrageirasChar"/>
+        </w:rPr>
+        <w:t>CSS</w:t>
+      </w:r>
+      <w:r>
+        <w:rPr>
+          <w:lang w:val="pt-PT"/>
+        </w:rPr>
+        <w:t xml:space="preserve"> e programação </w:t>
+      </w:r>
+      <w:r>
+        <w:rPr>
+          <w:rStyle w:val="EstrageirasChar"/>
+        </w:rPr>
+        <w:t>JavaScript</w:t>
+      </w:r>
+      <w:r>
+        <w:rPr>
+          <w:lang w:val="pt-PT"/>
+        </w:rPr>
+        <w:t>.</w:t>
+      </w:r>
+    </w:p>
+    <w:p>
+      <w:pPr>
+        <w:rPr>
+          <w:lang w:val="pt-PT"/>
+        </w:rPr>
+      </w:pPr>
+    </w:p>
+    <w:p>
+      <w:pPr>
+        <w:rPr>
+          <w:lang w:val="pt-PT"/>
+        </w:rPr>
+      </w:pPr>
+      <w:r>
+        <w:rPr>
+          <w:lang w:val="pt-PT"/>
+        </w:rPr>
+        <w:t xml:space="preserve">Como </w:t>
+      </w:r>
+      <w:proofErr w:type="gramStart"/>
+      <w:r>
+        <w:rPr>
+          <w:lang w:val="pt-PT"/>
+        </w:rPr>
+        <w:t>resultado final</w:t>
+      </w:r>
+      <w:proofErr w:type="gramEnd"/>
+      <w:r>
+        <w:rPr>
+          <w:lang w:val="pt-PT"/>
+        </w:rPr>
+        <w:t xml:space="preserve">, foi desenvolvido o website educativo </w:t>
+      </w:r>
+      <w:proofErr w:type="spellStart"/>
+      <w:r>
+        <w:rPr>
+          <w:rStyle w:val="EstrageirasChar"/>
+        </w:rPr>
+        <w:t>InfoTech</w:t>
+      </w:r>
+      <w:proofErr w:type="spellEnd"/>
+      <w:r>
+        <w:rPr>
+          <w:lang w:val="pt-PT"/>
+        </w:rPr>
+        <w:t xml:space="preserve">: Áreas da Informática, composto por páginas interligadas, conteúdos organizados, recursos multimédia, formulário de contacto, menu responsivo, tema claro e escuro e elementos </w:t>
+      </w:r>
+      <w:proofErr w:type="spellStart"/>
+      <w:r>
+        <w:rPr>
+          <w:lang w:val="pt-PT"/>
+        </w:rPr>
+        <w:t>interactivos</w:t>
+      </w:r>
+      <w:proofErr w:type="spellEnd"/>
+      <w:r>
+        <w:rPr>
+          <w:lang w:val="pt-PT"/>
+        </w:rPr>
+        <w:t>.</w:t>
+      </w:r>
+    </w:p>
+    <w:p>
+      <w:pPr>
+        <w:jc w:val="left"/>
+        <w:rPr>
+          <w:lang w:val="pt-PT"/>
+        </w:rPr>
+      </w:pPr>
+      <w:r>
+        <w:rPr>
+          <w:lang w:val="pt-PT"/>
+        </w:rPr>
+        <w:br w:type="page"/>
+      </w:r>
+    </w:p>
+    <w:p>
+      <w:pPr>
+        <w:pStyle w:val="Heading1"/>
+        <w:numPr>
+          <w:ilvl w:val="0"/>
+          <w:numId w:val="2"/>
+        </w:numPr>
+        <w:rPr>
+          <w:lang w:val="pt-PT"/>
+        </w:rPr>
+      </w:pPr>
+      <w:bookmarkStart w:id="13" w:name="_Toc238892676"/>
+      <w:r>
+        <w:rPr>
+          <w:lang w:val="pt-PT"/>
+        </w:rPr>
+        <w:lastRenderedPageBreak/>
+        <w:t>CONCLUSÃO</w:t>
+      </w:r>
+      <w:bookmarkEnd w:id="13"/>
+    </w:p>
+    <w:p>
+      <w:pPr>
+        <w:rPr>
+          <w:lang w:val="pt-PT"/>
+        </w:rPr>
+      </w:pPr>
+      <w:r>
+        <w:rPr>
+          <w:lang w:val="pt-PT"/>
+        </w:rPr>
+        <w:t xml:space="preserve">A realização do </w:t>
+      </w:r>
+      <w:proofErr w:type="spellStart"/>
+      <w:r>
+        <w:rPr>
+          <w:lang w:val="pt-PT"/>
+        </w:rPr>
+        <w:t>projecto</w:t>
+      </w:r>
+      <w:proofErr w:type="spellEnd"/>
+      <w:r>
+        <w:rPr>
+          <w:lang w:val="pt-PT"/>
+        </w:rPr>
+        <w:t xml:space="preserve"> </w:t>
+      </w:r>
+      <w:proofErr w:type="spellStart"/>
+      <w:r>
+        <w:rPr>
+          <w:rStyle w:val="EstrageirasChar"/>
+        </w:rPr>
+        <w:t>InfoTech</w:t>
+      </w:r>
+      <w:proofErr w:type="spellEnd"/>
+      <w:r>
+        <w:rPr>
+          <w:lang w:val="pt-PT"/>
+        </w:rPr>
+        <w:t xml:space="preserve">: Áreas da Informática permitiu aplicar, de forma prática, os conhecimentos adquiridos no módulo de Desenvolvimento de Páginas </w:t>
+      </w:r>
+      <w:r>
+        <w:rPr>
+          <w:rStyle w:val="EstrageirasChar"/>
+        </w:rPr>
+        <w:t xml:space="preserve">Web </w:t>
+      </w:r>
+      <w:r>
+        <w:rPr>
+          <w:lang w:val="pt-PT"/>
+        </w:rPr>
+        <w:t xml:space="preserve">em </w:t>
+      </w:r>
+      <w:r>
+        <w:rPr>
+          <w:rStyle w:val="EstrageirasChar"/>
+        </w:rPr>
+        <w:t xml:space="preserve">HTML </w:t>
+      </w:r>
+      <w:r>
+        <w:rPr>
+          <w:lang w:val="pt-PT"/>
+        </w:rPr>
+        <w:t xml:space="preserve">(DPWHTML). Ao longo do desenvolvimento, foi possível planear, estruturar, implementar, testar e publicar um </w:t>
+      </w:r>
+      <w:r>
+        <w:rPr>
+          <w:rStyle w:val="EstrageirasChar"/>
+        </w:rPr>
+        <w:t xml:space="preserve">website </w:t>
+      </w:r>
+      <w:r>
+        <w:rPr>
+          <w:lang w:val="pt-PT"/>
+        </w:rPr>
+        <w:t xml:space="preserve">educativo com conteúdos organizados e funcionalidades </w:t>
+      </w:r>
+      <w:proofErr w:type="spellStart"/>
+      <w:r>
+        <w:rPr>
+          <w:lang w:val="pt-PT"/>
+        </w:rPr>
+        <w:t>interactivas</w:t>
+      </w:r>
+      <w:proofErr w:type="spellEnd"/>
+      <w:r>
+        <w:rPr>
+          <w:lang w:val="pt-PT"/>
+        </w:rPr>
+        <w:t>.</w:t>
+      </w:r>
+    </w:p>
+    <w:p>
+      <w:pPr>
+        <w:rPr>
+          <w:lang w:val="pt-PT"/>
+        </w:rPr>
+      </w:pPr>
+      <w:r>
+        <w:rPr>
+          <w:lang w:val="pt-PT"/>
+        </w:rPr>
+        <w:t xml:space="preserve">O </w:t>
+      </w:r>
+      <w:proofErr w:type="spellStart"/>
+      <w:r>
+        <w:rPr>
+          <w:lang w:val="pt-PT"/>
+        </w:rPr>
+        <w:t>projecto</w:t>
+      </w:r>
+      <w:proofErr w:type="spellEnd"/>
+      <w:r>
+        <w:rPr>
+          <w:lang w:val="pt-PT"/>
+        </w:rPr>
+        <w:t xml:space="preserve"> cumpriu a sua finalidade ao apresentar informações introdutórias sobre as principais áreas da informática, utilizando uma linguagem simples e uma navegação acessível. A integração de </w:t>
+      </w:r>
+      <w:r>
+        <w:rPr>
+          <w:rStyle w:val="EstrageirasChar"/>
+        </w:rPr>
+        <w:t>HTML5</w:t>
       </w:r>
       <w:r>
         <w:rPr>
@@ -6274,31 +8098,7 @@
         <w:rPr>
           <w:rStyle w:val="EstrageirasChar"/>
         </w:rPr>
-        <w:t>sobre.html</w:t>
-      </w:r>
-      <w:r>
-        <w:rPr>
-          <w:lang w:val="pt-PT"/>
-        </w:rPr>
-        <w:t xml:space="preserve">, </w:t>
-      </w:r>
-      <w:r>
-        <w:rPr>
-          <w:rStyle w:val="EstrageirasChar"/>
-        </w:rPr>
-        <w:t>areas.html</w:t>
-      </w:r>
-      <w:r>
-        <w:rPr>
-          <w:lang w:val="pt-PT"/>
-        </w:rPr>
-        <w:t xml:space="preserve">, </w:t>
-      </w:r>
-      <w:r>
-        <w:rPr>
-          <w:rStyle w:val="EstrageirasChar"/>
-        </w:rPr>
-        <w:t>galeria.html</w:t>
+        <w:t>CSS3</w:t>
       </w:r>
       <w:r>
         <w:rPr>
@@ -6310,37 +8110,50 @@
         <w:rPr>
           <w:rStyle w:val="EstrageirasChar"/>
         </w:rPr>
-        <w:t>contacto.html</w:t>
-      </w:r>
-      <w:r>
-        <w:rPr>
-          <w:lang w:val="pt-PT"/>
-        </w:rPr>
-        <w:t xml:space="preserve">, bem como as pastas destinadas aos estilos </w:t>
-      </w:r>
-      <w:r>
-        <w:rPr>
-          <w:rStyle w:val="EstrageirasChar"/>
-        </w:rPr>
-        <w:t>CSS</w:t>
-      </w:r>
-      <w:r>
-        <w:rPr>
-          <w:lang w:val="pt-PT"/>
-        </w:rPr>
-        <w:t xml:space="preserve">, </w:t>
-      </w:r>
-      <w:r>
-        <w:rPr>
-          <w:rStyle w:val="EstrageirasChar"/>
-        </w:rPr>
-        <w:t>scripts JavaScript</w:t>
-      </w:r>
-      <w:r>
-        <w:rPr>
-          <w:lang w:val="pt-PT"/>
-        </w:rPr>
-        <w:t xml:space="preserve">, imagens, áudio, vídeos e documentos. Em seguida, os ficheiros foram enviados para o repositório e a funcionalidade </w:t>
+        <w:t>JavaScript</w:t>
+      </w:r>
+      <w:r>
+        <w:rPr>
+          <w:lang w:val="pt-PT"/>
+        </w:rPr>
+        <w:t xml:space="preserve"> possibilitou a criação de páginas interligadas, um </w:t>
+      </w:r>
+      <w:r>
+        <w:rPr>
+          <w:rStyle w:val="EstrageirasChar"/>
+        </w:rPr>
+        <w:t xml:space="preserve">layout </w:t>
+      </w:r>
+      <w:r>
+        <w:rPr>
+          <w:lang w:val="pt-PT"/>
+        </w:rPr>
+        <w:t xml:space="preserve">responsivo, menu de navegação, cartões expansíveis, carrossel de imagens, formulário de contacto e recursos multimédia, tornando o </w:t>
+      </w:r>
+      <w:r>
+        <w:rPr>
+          <w:rStyle w:val="EstrageirasChar"/>
+        </w:rPr>
+        <w:t>site</w:t>
+      </w:r>
+      <w:r>
+        <w:rPr>
+          <w:lang w:val="pt-PT"/>
+        </w:rPr>
+        <w:t xml:space="preserve"> mais dinâmico e funcional.</w:t>
+      </w:r>
+    </w:p>
+    <w:p>
+      <w:pPr>
+        <w:rPr>
+          <w:lang w:val="pt-PT"/>
+        </w:rPr>
+      </w:pPr>
+      <w:r>
+        <w:rPr>
+          <w:lang w:val="pt-PT"/>
+        </w:rPr>
+        <w:t xml:space="preserve">A utilização de princípios de acessibilidade e usabilidade contribuiu para melhorar a experiência do utilizador, facilitando a leitura, a navegação e a adaptação do conteúdo a diferentes dispositivos. A publicação através do </w:t>
       </w:r>
       <w:r>
         <w:rPr>
@@ -6360,21 +8173,7 @@
         <w:rPr>
           <w:lang w:val="pt-PT"/>
         </w:rPr>
-        <w:t xml:space="preserve"> foi </w:t>
-      </w:r>
-      <w:proofErr w:type="spellStart"/>
-      <w:r>
-        <w:rPr>
-          <w:lang w:val="pt-PT"/>
-        </w:rPr>
-        <w:t>activada</w:t>
-      </w:r>
-      <w:proofErr w:type="spellEnd"/>
-      <w:r>
-        <w:rPr>
-          <w:lang w:val="pt-PT"/>
-        </w:rPr>
-        <w:t xml:space="preserve"> nas definições do </w:t>
+        <w:t xml:space="preserve"> permitiu disponibilizar o </w:t>
       </w:r>
       <w:proofErr w:type="spellStart"/>
       <w:r>
@@ -6388,6 +8187,30 @@
         <w:rPr>
           <w:lang w:val="pt-PT"/>
         </w:rPr>
+        <w:t xml:space="preserve"> </w:t>
+      </w:r>
+      <w:r>
+        <w:rPr>
+          <w:rStyle w:val="EstrageirasChar"/>
+        </w:rPr>
+        <w:t>online</w:t>
+      </w:r>
+      <w:r>
+        <w:rPr>
+          <w:lang w:val="pt-PT"/>
+        </w:rPr>
+        <w:t xml:space="preserve">, tornando-o acessível através de um endereço </w:t>
+      </w:r>
+      <w:r>
+        <w:rPr>
+          <w:rStyle w:val="EstrageirasChar"/>
+        </w:rPr>
+        <w:t>web</w:t>
+      </w:r>
+      <w:r>
+        <w:rPr>
+          <w:lang w:val="pt-PT"/>
+        </w:rPr>
         <w:t>.</w:t>
       </w:r>
     </w:p>
@@ -6401,30 +8224,104 @@
         <w:rPr>
           <w:lang w:val="pt-PT"/>
         </w:rPr>
-        <w:t xml:space="preserve">A publicação foi configurada a partir da </w:t>
-      </w:r>
-      <w:proofErr w:type="spellStart"/>
-      <w:r>
-        <w:rPr>
-          <w:rStyle w:val="EstrageirasChar"/>
-        </w:rPr>
-        <w:t>branch</w:t>
-      </w:r>
-      <w:proofErr w:type="spellEnd"/>
-      <w:r>
-        <w:rPr>
-          <w:lang w:val="pt-PT"/>
-        </w:rPr>
-        <w:t xml:space="preserve"> principal do repositório, permitindo que o </w:t>
-      </w:r>
-      <w:r>
-        <w:rPr>
-          <w:rStyle w:val="EstrageirasChar"/>
-        </w:rPr>
-        <w:t>GitHub</w:t>
-      </w:r>
-      <w:r>
-        <w:rPr>
+        <w:t xml:space="preserve">Em termos gerais, o </w:t>
+      </w:r>
+      <w:proofErr w:type="spellStart"/>
+      <w:r>
+        <w:rPr>
+          <w:lang w:val="pt-PT"/>
+        </w:rPr>
+        <w:t>projecto</w:t>
+      </w:r>
+      <w:proofErr w:type="spellEnd"/>
+      <w:r>
+        <w:rPr>
+          <w:lang w:val="pt-PT"/>
+        </w:rPr>
+        <w:t xml:space="preserve"> foi importante para consolidar conhecimentos teóricos e desenvolver competências práticas relacionadas com o desenvolvimento </w:t>
+      </w:r>
+      <w:r>
+        <w:rPr>
+          <w:rStyle w:val="EstrageirasChar"/>
+        </w:rPr>
+        <w:t>web</w:t>
+      </w:r>
+      <w:r>
+        <w:rPr>
+          <w:lang w:val="pt-PT"/>
+        </w:rPr>
+        <w:t>. Para além disso, serviu como exercício de organização, criatividade e resolução de problemas, demonstrando a capacidade de transformar conteúdos estudados em sala de aula num produto digital funcional e educativo</w:t>
+      </w:r>
+      <w:r>
+        <w:rPr>
+          <w:lang w:val="pt-PT"/>
+        </w:rPr>
+        <w:t>.</w:t>
+      </w:r>
+    </w:p>
+    <w:p>
+      <w:pPr>
+        <w:jc w:val="left"/>
+        <w:rPr>
+          <w:lang w:val="pt-PT"/>
+        </w:rPr>
+      </w:pPr>
+      <w:r>
+        <w:rPr>
+          <w:lang w:val="pt-PT"/>
+        </w:rPr>
+        <w:br w:type="page"/>
+      </w:r>
+    </w:p>
+    <w:p>
+      <w:pPr>
+        <w:pStyle w:val="Heading1"/>
+        <w:rPr>
+          <w:lang w:val="pt-PT"/>
+        </w:rPr>
+      </w:pPr>
+      <w:bookmarkStart w:id="14" w:name="_Toc238892677"/>
+      <w:r>
+        <w:rPr>
+          <w:lang w:val="pt-PT"/>
+        </w:rPr>
+        <w:lastRenderedPageBreak/>
+        <w:t>Referências</w:t>
+      </w:r>
+      <w:bookmarkEnd w:id="14"/>
+    </w:p>
+    <w:p>
+      <w:pPr>
+        <w:jc w:val="left"/>
+      </w:pPr>
+      <w:r>
+        <w:rPr>
+          <w:lang w:val="pt-PT"/>
+        </w:rPr>
+        <w:t xml:space="preserve">MDN WEB DOCS. </w:t>
+      </w:r>
+      <w:r>
+        <w:rPr>
+          <w:b/>
+          <w:bCs/>
+          <w:lang w:val="pt-PT"/>
+        </w:rPr>
+        <w:t xml:space="preserve">HTML: </w:t>
+      </w:r>
+      <w:proofErr w:type="spellStart"/>
+      <w:r>
+        <w:rPr>
+          <w:b/>
+          <w:bCs/>
+          <w:lang w:val="pt-PT"/>
+        </w:rPr>
+        <w:t>HyperText</w:t>
+      </w:r>
+      <w:proofErr w:type="spellEnd"/>
+      <w:r>
+        <w:rPr>
+          <w:b/>
+          <w:bCs/>
           <w:lang w:val="pt-PT"/>
         </w:rPr>
         <w:t xml:space="preserve"> </w:t>
@@ -6432,219 +8329,17 @@
       <w:proofErr w:type="spellStart"/>
       <w:r>
         <w:rPr>
-          <w:rStyle w:val="EstrageirasChar"/>
-        </w:rPr>
-        <w:t>Pages</w:t>
-      </w:r>
-      <w:proofErr w:type="spellEnd"/>
-      <w:r>
-        <w:rPr>
-          <w:lang w:val="pt-PT"/>
-        </w:rPr>
-        <w:t xml:space="preserve"> disponibilizasse automaticamente o conteúdo do </w:t>
-      </w:r>
-      <w:proofErr w:type="spellStart"/>
-      <w:r>
-        <w:rPr>
-          <w:lang w:val="pt-PT"/>
-        </w:rPr>
-        <w:t>projecto</w:t>
-      </w:r>
-      <w:proofErr w:type="spellEnd"/>
-      <w:r>
-        <w:rPr>
-          <w:lang w:val="pt-PT"/>
-        </w:rPr>
-        <w:t xml:space="preserve"> através de um endereço </w:t>
-      </w:r>
-      <w:r>
-        <w:rPr>
-          <w:rStyle w:val="EstrageirasChar"/>
-        </w:rPr>
-        <w:t>web</w:t>
-      </w:r>
-      <w:r>
-        <w:rPr>
-          <w:lang w:val="pt-PT"/>
-        </w:rPr>
-        <w:t xml:space="preserve">. Sempre que são realizadas alterações e enviadas para o repositório, o website pode ser </w:t>
-      </w:r>
-      <w:proofErr w:type="spellStart"/>
-      <w:r>
-        <w:rPr>
-          <w:lang w:val="pt-PT"/>
-        </w:rPr>
-        <w:t>actualizado</w:t>
-      </w:r>
-      <w:proofErr w:type="spellEnd"/>
-      <w:r>
-        <w:rPr>
-          <w:lang w:val="pt-PT"/>
-        </w:rPr>
-        <w:t xml:space="preserve"> com a nova versão dos ficheiros. O </w:t>
-      </w:r>
-      <w:r>
-        <w:rPr>
-          <w:rStyle w:val="EstrageirasChar"/>
-        </w:rPr>
-        <w:t xml:space="preserve">GitHub </w:t>
-      </w:r>
-      <w:proofErr w:type="spellStart"/>
-      <w:r>
-        <w:rPr>
-          <w:rStyle w:val="EstrageirasChar"/>
-        </w:rPr>
-        <w:t>Pages</w:t>
-      </w:r>
-      <w:proofErr w:type="spellEnd"/>
-      <w:r>
-        <w:rPr>
-          <w:lang w:val="pt-PT"/>
-        </w:rPr>
-        <w:t xml:space="preserve"> permite publicar um </w:t>
-      </w:r>
-      <w:r>
-        <w:rPr>
-          <w:rStyle w:val="EstrageirasChar"/>
-        </w:rPr>
-        <w:t>site</w:t>
-      </w:r>
-      <w:r>
-        <w:rPr>
-          <w:lang w:val="pt-PT"/>
-        </w:rPr>
-        <w:t xml:space="preserve"> a partir de uma </w:t>
-      </w:r>
-      <w:proofErr w:type="spellStart"/>
-      <w:r>
-        <w:rPr>
-          <w:rStyle w:val="EstrageirasChar"/>
-        </w:rPr>
-        <w:t>branch</w:t>
-      </w:r>
-      <w:proofErr w:type="spellEnd"/>
-      <w:r>
-        <w:rPr>
-          <w:lang w:val="pt-PT"/>
-        </w:rPr>
-        <w:t xml:space="preserve"> configurada ou através de um fluxo de trabalho de implantação.</w:t>
-      </w:r>
-    </w:p>
-    <w:p>
-      <w:pPr>
-        <w:rPr>
-          <w:lang w:val="pt-PT"/>
-        </w:rPr>
-      </w:pPr>
-      <w:r>
-        <w:rPr>
-          <w:lang w:val="pt-PT"/>
-        </w:rPr>
-        <w:t xml:space="preserve">Após a </w:t>
-      </w:r>
-      <w:proofErr w:type="spellStart"/>
-      <w:r>
-        <w:rPr>
-          <w:lang w:val="pt-PT"/>
-        </w:rPr>
-        <w:t>activação</w:t>
-      </w:r>
-      <w:proofErr w:type="spellEnd"/>
-      <w:r>
-        <w:rPr>
-          <w:lang w:val="pt-PT"/>
-        </w:rPr>
-        <w:t xml:space="preserve"> da hospedagem, foi realizado um novo teste através do endereço publicado. Foram verificados o carregamento das páginas, os </w:t>
-      </w:r>
-      <w:r>
-        <w:rPr>
-          <w:rStyle w:val="EstrageirasChar"/>
-        </w:rPr>
-        <w:t>links</w:t>
-      </w:r>
-      <w:r>
-        <w:rPr>
-          <w:lang w:val="pt-PT"/>
-        </w:rPr>
-        <w:t xml:space="preserve"> de navegação, o funcionamento do menu, a apresentação das imagens, o carrossel, o formulário de contacto, os recursos multimédia e a adaptação do conteúdo a diferentes tamanhos de ecrã.</w:t>
-      </w:r>
-    </w:p>
-    <w:p>
-      <w:pPr>
-        <w:rPr>
-          <w:lang w:val="pt-PT"/>
-        </w:rPr>
-      </w:pPr>
-    </w:p>
-    <w:p>
-      <w:pPr>
-        <w:rPr>
-          <w:lang w:val="pt-PT"/>
-        </w:rPr>
-      </w:pPr>
-      <w:r>
-        <w:rPr>
-          <w:lang w:val="pt-PT"/>
-        </w:rPr>
-        <w:t>Evidência</w:t>
-      </w:r>
-    </w:p>
-    <w:p>
-      <w:pPr>
-        <w:rPr>
-          <w:lang w:val="pt-PT"/>
-        </w:rPr>
-      </w:pPr>
-      <w:r>
-        <w:rPr>
-          <w:lang w:val="pt-PT"/>
-        </w:rPr>
-        <w:t xml:space="preserve">Inserir uma captura de ecrã do repositório do GitHub, mostrando os ficheiros do </w:t>
-      </w:r>
-      <w:proofErr w:type="spellStart"/>
-      <w:r>
-        <w:rPr>
-          <w:lang w:val="pt-PT"/>
-        </w:rPr>
-        <w:t>projecto</w:t>
-      </w:r>
-      <w:proofErr w:type="spellEnd"/>
-      <w:r>
-        <w:rPr>
-          <w:lang w:val="pt-PT"/>
-        </w:rPr>
-        <w:t>.</w:t>
-      </w:r>
-    </w:p>
-    <w:p>
-      <w:pPr>
-        <w:rPr>
-          <w:lang w:val="pt-PT"/>
-        </w:rPr>
-      </w:pPr>
-    </w:p>
-    <w:p>
-      <w:pPr>
-        <w:rPr>
-          <w:lang w:val="pt-PT"/>
-        </w:rPr>
-      </w:pPr>
-      <w:r>
-        <w:rPr>
-          <w:lang w:val="pt-PT"/>
-        </w:rPr>
-        <w:t xml:space="preserve">Figura 8 — Repositório do </w:t>
-      </w:r>
-      <w:proofErr w:type="spellStart"/>
-      <w:r>
-        <w:rPr>
-          <w:lang w:val="pt-PT"/>
-        </w:rPr>
-        <w:t>projecto</w:t>
-      </w:r>
-      <w:proofErr w:type="spellEnd"/>
-      <w:r>
-        <w:rPr>
+          <w:b/>
+          <w:bCs/>
+          <w:lang w:val="pt-PT"/>
+        </w:rPr>
+        <w:t>Markup</w:t>
+      </w:r>
+      <w:proofErr w:type="spellEnd"/>
+      <w:r>
+        <w:rPr>
+          <w:b/>
+          <w:bCs/>
           <w:lang w:val="pt-PT"/>
         </w:rPr>
         <w:t xml:space="preserve"> </w:t>
@@ -6652,487 +8347,313 @@
       <w:proofErr w:type="spellStart"/>
       <w:r>
         <w:rPr>
-          <w:lang w:val="pt-PT"/>
-        </w:rPr>
-        <w:t>InfoTech</w:t>
-      </w:r>
-      <w:proofErr w:type="spellEnd"/>
-      <w:r>
-        <w:rPr>
-          <w:lang w:val="pt-PT"/>
-        </w:rPr>
-        <w:t xml:space="preserve"> no GitHub.</w:t>
-      </w:r>
-    </w:p>
-    <w:p>
-      <w:pPr>
-        <w:rPr>
-          <w:lang w:val="pt-PT"/>
-        </w:rPr>
-      </w:pPr>
-    </w:p>
-    <w:p>
-      <w:pPr>
-        <w:rPr>
-          <w:lang w:val="pt-PT"/>
-        </w:rPr>
-      </w:pPr>
-      <w:r>
-        <w:rPr>
-          <w:lang w:val="pt-PT"/>
-        </w:rPr>
-        <w:t xml:space="preserve">Inserir uma captura de ecrã da secção </w:t>
-      </w:r>
-      <w:proofErr w:type="spellStart"/>
-      <w:r>
-        <w:rPr>
-          <w:lang w:val="pt-PT"/>
-        </w:rPr>
-        <w:t>Settings</w:t>
-      </w:r>
-      <w:proofErr w:type="spellEnd"/>
-      <w:r>
-        <w:rPr>
-          <w:lang w:val="pt-PT"/>
-        </w:rPr>
-        <w:t xml:space="preserve"> → </w:t>
-      </w:r>
-      <w:proofErr w:type="spellStart"/>
-      <w:r>
-        <w:rPr>
-          <w:lang w:val="pt-PT"/>
-        </w:rPr>
-        <w:t>Pages</w:t>
-      </w:r>
-      <w:proofErr w:type="spellEnd"/>
-      <w:r>
-        <w:rPr>
-          <w:lang w:val="pt-PT"/>
-        </w:rPr>
-        <w:t xml:space="preserve">, mostrando a publicação </w:t>
-      </w:r>
-      <w:proofErr w:type="spellStart"/>
-      <w:r>
-        <w:rPr>
-          <w:lang w:val="pt-PT"/>
-        </w:rPr>
-        <w:t>activa</w:t>
-      </w:r>
-      <w:proofErr w:type="spellEnd"/>
-      <w:r>
-        <w:rPr>
-          <w:lang w:val="pt-PT"/>
-        </w:rPr>
-        <w:t>.</w:t>
-      </w:r>
-    </w:p>
-    <w:p>
-      <w:pPr>
-        <w:rPr>
-          <w:lang w:val="pt-PT"/>
-        </w:rPr>
-      </w:pPr>
-    </w:p>
-    <w:p>
-      <w:pPr>
-        <w:rPr>
-          <w:lang w:val="pt-PT"/>
-        </w:rPr>
-      </w:pPr>
-      <w:r>
-        <w:rPr>
-          <w:lang w:val="pt-PT"/>
-        </w:rPr>
-        <w:t xml:space="preserve">Figura 9 — Configuração do GitHub </w:t>
-      </w:r>
-      <w:proofErr w:type="spellStart"/>
-      <w:r>
-        <w:rPr>
-          <w:lang w:val="pt-PT"/>
-        </w:rPr>
-        <w:t>Pages</w:t>
-      </w:r>
-      <w:proofErr w:type="spellEnd"/>
-      <w:r>
-        <w:rPr>
-          <w:lang w:val="pt-PT"/>
-        </w:rPr>
-        <w:t xml:space="preserve"> para publicação do website.</w:t>
-      </w:r>
-    </w:p>
-    <w:p>
-      <w:pPr>
-        <w:rPr>
-          <w:lang w:val="pt-PT"/>
-        </w:rPr>
-      </w:pPr>
-    </w:p>
-    <w:p>
-      <w:pPr>
-        <w:rPr>
-          <w:lang w:val="pt-PT"/>
-        </w:rPr>
-      </w:pPr>
-      <w:r>
-        <w:rPr>
-          <w:lang w:val="pt-PT"/>
-        </w:rPr>
-        <w:t>Inserir uma captura de ecrã do website aberto através do link publicado.</w:t>
-      </w:r>
-    </w:p>
-    <w:p>
-      <w:pPr>
-        <w:rPr>
-          <w:lang w:val="pt-PT"/>
-        </w:rPr>
-      </w:pPr>
-    </w:p>
-    <w:p>
-      <w:pPr>
-        <w:rPr>
-          <w:lang w:val="pt-PT"/>
-        </w:rPr>
-      </w:pPr>
-      <w:r>
-        <w:rPr>
-          <w:lang w:val="pt-PT"/>
-        </w:rPr>
-        <w:t xml:space="preserve">Figura 10 — Website </w:t>
-      </w:r>
-      <w:proofErr w:type="spellStart"/>
-      <w:r>
-        <w:rPr>
-          <w:lang w:val="pt-PT"/>
-        </w:rPr>
-        <w:t>InfoTech</w:t>
-      </w:r>
-      <w:proofErr w:type="spellEnd"/>
-      <w:r>
-        <w:rPr>
-          <w:lang w:val="pt-PT"/>
-        </w:rPr>
-        <w:t xml:space="preserve"> publicado no GitHub </w:t>
-      </w:r>
-      <w:proofErr w:type="spellStart"/>
-      <w:r>
-        <w:rPr>
-          <w:lang w:val="pt-PT"/>
-        </w:rPr>
-        <w:t>Pages</w:t>
-      </w:r>
-      <w:proofErr w:type="spellEnd"/>
-      <w:r>
-        <w:rPr>
-          <w:lang w:val="pt-PT"/>
-        </w:rPr>
-        <w:t>.</w:t>
-      </w:r>
-    </w:p>
-    <w:p>
-      <w:pPr>
-        <w:rPr>
-          <w:lang w:val="pt-PT"/>
-        </w:rPr>
-      </w:pPr>
-    </w:p>
-    <w:p>
-      <w:pPr>
-        <w:rPr>
-          <w:lang w:val="pt-PT"/>
-        </w:rPr>
-      </w:pPr>
-      <w:r>
-        <w:rPr>
-          <w:lang w:val="pt-PT"/>
-        </w:rPr>
-        <w:t>Também deve ser indicado o endereço real do website:</w:t>
-      </w:r>
-    </w:p>
-    <w:p>
-      <w:pPr>
-        <w:rPr>
-          <w:lang w:val="pt-PT"/>
-        </w:rPr>
-      </w:pPr>
-    </w:p>
-    <w:p>
-      <w:pPr>
-        <w:rPr>
-          <w:lang w:val="pt-PT"/>
-        </w:rPr>
-      </w:pPr>
-      <w:proofErr w:type="spellStart"/>
-      <w:r>
-        <w:rPr>
-          <w:lang w:val="pt-PT"/>
-        </w:rPr>
-        <w:t>text</w:t>
-      </w:r>
-      <w:proofErr w:type="spellEnd"/>
-    </w:p>
-    <w:p>
-      <w:pPr>
-        <w:rPr>
-          <w:lang w:val="pt-PT"/>
-        </w:rPr>
-      </w:pPr>
-    </w:p>
-    <w:p>
-      <w:pPr>
-        <w:rPr>
-          <w:lang w:val="pt-PT"/>
-        </w:rPr>
-      </w:pPr>
-      <w:r>
-        <w:rPr>
-          <w:lang w:val="pt-PT"/>
-        </w:rPr>
-        <w:t>Link do website publicado:</w:t>
-      </w:r>
-    </w:p>
-    <w:p>
-      <w:pPr>
-        <w:rPr>
-          <w:lang w:val="pt-PT"/>
-        </w:rPr>
-      </w:pPr>
-      <w:r>
-        <w:rPr>
-          <w:lang w:val="pt-PT"/>
-        </w:rPr>
-        <w:t>[COLOCAR AQUI O LINK DO GITHUB PAGES]</w:t>
-      </w:r>
-    </w:p>
-    <w:p>
-      <w:pPr>
-        <w:rPr>
-          <w:lang w:val="pt-PT"/>
-        </w:rPr>
-      </w:pPr>
-      <w:r>
-        <w:rPr>
-          <w:lang w:val="pt-PT"/>
-        </w:rPr>
-        <w:t xml:space="preserve">Exemplo de formato de endereço para um </w:t>
-      </w:r>
-      <w:proofErr w:type="spellStart"/>
-      <w:r>
-        <w:rPr>
-          <w:lang w:val="pt-PT"/>
-        </w:rPr>
-        <w:t>projecto</w:t>
-      </w:r>
-      <w:proofErr w:type="spellEnd"/>
-      <w:r>
-        <w:rPr>
-          <w:lang w:val="pt-PT"/>
-        </w:rPr>
-        <w:t>:</w:t>
-      </w:r>
-    </w:p>
-    <w:p>
-      <w:pPr>
-        <w:rPr>
-          <w:lang w:val="pt-PT"/>
-        </w:rPr>
-      </w:pPr>
-    </w:p>
-    <w:p>
-      <w:pPr>
-        <w:rPr>
-          <w:lang w:val="pt-PT"/>
-        </w:rPr>
-      </w:pPr>
-      <w:proofErr w:type="spellStart"/>
-      <w:r>
-        <w:rPr>
-          <w:lang w:val="pt-PT"/>
-        </w:rPr>
-        <w:t>text</w:t>
-      </w:r>
-      <w:proofErr w:type="spellEnd"/>
-    </w:p>
-    <w:p>
-      <w:pPr>
-        <w:rPr>
-          <w:lang w:val="pt-PT"/>
-        </w:rPr>
-      </w:pPr>
-    </w:p>
-    <w:p>
-      <w:pPr>
-        <w:rPr>
-          <w:lang w:val="pt-PT"/>
-        </w:rPr>
-      </w:pPr>
-      <w:r>
-        <w:rPr>
-          <w:lang w:val="pt-PT"/>
-        </w:rPr>
-        <w:t>https://nome-do-utilizador.github.io/nome-do-repositorio/</w:t>
-      </w:r>
-    </w:p>
-    <w:p>
-      <w:pPr>
-        <w:rPr>
-          <w:lang w:val="pt-PT"/>
-        </w:rPr>
-      </w:pPr>
-      <w:r>
-        <w:rPr>
-          <w:lang w:val="pt-PT"/>
-        </w:rPr>
-        <w:t xml:space="preserve">Os sites de </w:t>
-      </w:r>
-      <w:proofErr w:type="spellStart"/>
-      <w:r>
-        <w:rPr>
-          <w:lang w:val="pt-PT"/>
-        </w:rPr>
-        <w:t>projecto</w:t>
-      </w:r>
-      <w:proofErr w:type="spellEnd"/>
-      <w:r>
-        <w:rPr>
-          <w:lang w:val="pt-PT"/>
-        </w:rPr>
-        <w:t xml:space="preserve"> no GitHub </w:t>
-      </w:r>
-      <w:proofErr w:type="spellStart"/>
-      <w:r>
-        <w:rPr>
-          <w:lang w:val="pt-PT"/>
-        </w:rPr>
-        <w:t>Pages</w:t>
-      </w:r>
-      <w:proofErr w:type="spellEnd"/>
-      <w:r>
-        <w:rPr>
-          <w:lang w:val="pt-PT"/>
-        </w:rPr>
-        <w:t xml:space="preserve"> são normalmente publicados no formato https://&lt;utilizador</w:t>
+          <w:b/>
+          <w:bCs/>
+          <w:lang w:val="pt-PT"/>
+        </w:rPr>
+        <w:t>Language</w:t>
+      </w:r>
+      <w:proofErr w:type="spellEnd"/>
+      <w:r>
+        <w:rPr>
+          <w:lang w:val="pt-PT"/>
+        </w:rPr>
+        <w:t xml:space="preserve">. Disponível em: &lt;https://developer.mozilla.org/en-US/docs/Web/HTML&gt;. </w:t>
+      </w:r>
+      <w:proofErr w:type="spellStart"/>
+      <w:r>
+        <w:t>Acesso</w:t>
+      </w:r>
+      <w:proofErr w:type="spellEnd"/>
+      <w:r>
+        <w:t xml:space="preserve"> </w:t>
+      </w:r>
+      <w:proofErr w:type="spellStart"/>
+      <w:r>
+        <w:t>em</w:t>
+      </w:r>
+      <w:proofErr w:type="spellEnd"/>
+      <w:r>
+        <w:t>: 2</w:t>
+      </w:r>
+      <w:r>
+        <w:t>0</w:t>
+      </w:r>
+      <w:r>
+        <w:t xml:space="preserve"> ago. 2026.</w:t>
+      </w:r>
+      <w:hyperlink r:id="rId20" w:tgtFrame="_blank" w:history="1">
+        <w:proofErr w:type="gramStart"/>
+        <w:r>
+          <w:rPr>
+            <w:rStyle w:val="Hyperlink"/>
+          </w:rPr>
+          <w:t>developer.mozilla</w:t>
+        </w:r>
+        <w:proofErr w:type="gramEnd"/>
+      </w:hyperlink>
+    </w:p>
+    <w:p>
+      <w:pPr>
+        <w:jc w:val="left"/>
+      </w:pPr>
+      <w:r>
+        <w:t xml:space="preserve">MDN WEB DOCS. </w:t>
+      </w:r>
+      <w:r>
+        <w:rPr>
+          <w:b/>
+          <w:bCs/>
+        </w:rPr>
+        <w:t>CSS: Cascading Style Sheets</w:t>
+      </w:r>
+      <w:r>
+        <w:t xml:space="preserve">. </w:t>
+      </w:r>
+      <w:r>
+        <w:rPr>
+          <w:lang w:val="pt-PT"/>
+        </w:rPr>
+        <w:t xml:space="preserve">Disponível em: &lt;https://developer.mozilla.org/en-US/docs/Web/CSS&gt;. </w:t>
+      </w:r>
+      <w:proofErr w:type="spellStart"/>
+      <w:r>
+        <w:t>Acesso</w:t>
+      </w:r>
+      <w:proofErr w:type="spellEnd"/>
+      <w:r>
+        <w:t xml:space="preserve"> </w:t>
+      </w:r>
+      <w:proofErr w:type="spellStart"/>
+      <w:r>
+        <w:t>em</w:t>
+      </w:r>
+      <w:proofErr w:type="spellEnd"/>
+      <w:r>
+        <w:t>: 2</w:t>
+      </w:r>
+      <w:r>
+        <w:t>0</w:t>
+      </w:r>
+      <w:r>
+        <w:t xml:space="preserve"> ago. 2026.</w:t>
+      </w:r>
+      <w:hyperlink r:id="rId21" w:tgtFrame="_blank" w:history="1">
+        <w:proofErr w:type="gramStart"/>
+        <w:r>
+          <w:rPr>
+            <w:rStyle w:val="Hyperlink"/>
+          </w:rPr>
+          <w:t>developer.mozilla</w:t>
+        </w:r>
+        <w:proofErr w:type="gramEnd"/>
+      </w:hyperlink>
+    </w:p>
+    <w:p>
+      <w:pPr>
+        <w:jc w:val="left"/>
+      </w:pPr>
+      <w:r>
+        <w:t xml:space="preserve">MDN WEB DOCS. </w:t>
+      </w:r>
+      <w:r>
+        <w:rPr>
+          <w:b/>
+          <w:bCs/>
+        </w:rPr>
+        <w:t>JavaScript technologies overview</w:t>
+      </w:r>
+      <w:r>
+        <w:t xml:space="preserve">. </w:t>
+      </w:r>
+      <w:r>
+        <w:rPr>
+          <w:lang w:val="pt-PT"/>
+        </w:rPr>
+        <w:t xml:space="preserve">Disponível em: &lt;https://developer.mozilla.org/en-US/docs/Web/JavaScript/Reference/JavaScript_technologies_overview&gt;. </w:t>
+      </w:r>
+      <w:proofErr w:type="spellStart"/>
+      <w:r>
+        <w:t>Acesso</w:t>
+      </w:r>
+      <w:proofErr w:type="spellEnd"/>
+      <w:r>
+        <w:t xml:space="preserve"> </w:t>
+      </w:r>
+      <w:proofErr w:type="spellStart"/>
+      <w:r>
+        <w:t>em</w:t>
+      </w:r>
+      <w:proofErr w:type="spellEnd"/>
+      <w:r>
+        <w:t>: 2</w:t>
+      </w:r>
+      <w:r>
+        <w:t>2</w:t>
+      </w:r>
+      <w:r>
+        <w:t xml:space="preserve"> ago. 2026.</w:t>
+      </w:r>
+      <w:hyperlink r:id="rId22" w:tgtFrame="_blank" w:history="1">
+        <w:proofErr w:type="gramStart"/>
+        <w:r>
+          <w:rPr>
+            <w:rStyle w:val="Hyperlink"/>
+          </w:rPr>
+          <w:t>developer.mozilla</w:t>
+        </w:r>
+        <w:proofErr w:type="gramEnd"/>
+      </w:hyperlink>
+    </w:p>
+    <w:p>
+      <w:pPr>
+        <w:jc w:val="left"/>
+      </w:pPr>
+      <w:r>
+        <w:t xml:space="preserve">GITHUB DOCS. </w:t>
+      </w:r>
+      <w:r>
+        <w:rPr>
+          <w:b/>
+          <w:bCs/>
+        </w:rPr>
+        <w:t xml:space="preserve">What </w:t>
       </w:r>
       <w:proofErr w:type="gramStart"/>
       <w:r>
         <w:rPr>
-          <w:lang w:val="pt-PT"/>
-        </w:rPr>
-        <w:t>&gt;.github.io</w:t>
+          <w:b/>
+          <w:bCs/>
+        </w:rPr>
+        <w:t>is</w:t>
       </w:r>
       <w:proofErr w:type="gramEnd"/>
       <w:r>
         <w:rPr>
-          <w:lang w:val="pt-PT"/>
-        </w:rPr>
-        <w:t>/&lt;repositorio&gt;/.</w:t>
-      </w:r>
-    </w:p>
-    <w:p>
-      <w:pPr>
-        <w:rPr>
-          <w:lang w:val="pt-PT"/>
-        </w:rPr>
-      </w:pPr>
-      <w:proofErr w:type="spellStart"/>
-      <w:r>
-        <w:rPr>
-          <w:lang w:val="pt-PT"/>
-        </w:rPr>
-        <w:t>github</w:t>
-      </w:r>
-      <w:proofErr w:type="spellEnd"/>
-    </w:p>
-    <w:p>
-      <w:pPr>
-        <w:rPr>
-          <w:lang w:val="pt-PT"/>
-        </w:rPr>
-      </w:pPr>
-    </w:p>
-    <w:p>
-      <w:pPr>
-        <w:rPr>
-          <w:lang w:val="pt-PT"/>
-        </w:rPr>
-      </w:pPr>
-      <w:r>
-        <w:rPr>
-          <w:lang w:val="pt-PT"/>
-        </w:rPr>
-        <w:t>Resultado</w:t>
-      </w:r>
-    </w:p>
-    <w:p>
-      <w:pPr>
-        <w:rPr>
-          <w:lang w:val="pt-PT"/>
-        </w:rPr>
-      </w:pPr>
-      <w:r>
-        <w:rPr>
-          <w:lang w:val="pt-PT"/>
-        </w:rPr>
-        <w:t xml:space="preserve">Como resultado, o website </w:t>
-      </w:r>
-      <w:proofErr w:type="spellStart"/>
-      <w:r>
-        <w:rPr>
-          <w:lang w:val="pt-PT"/>
-        </w:rPr>
-        <w:t>InfoTech</w:t>
-      </w:r>
-      <w:proofErr w:type="spellEnd"/>
-      <w:r>
-        <w:rPr>
-          <w:lang w:val="pt-PT"/>
-        </w:rPr>
-        <w:t xml:space="preserve"> ficou publicado e acessível através da Internet. A utilização do GitHub </w:t>
-      </w:r>
-      <w:proofErr w:type="spellStart"/>
-      <w:r>
-        <w:rPr>
-          <w:lang w:val="pt-PT"/>
-        </w:rPr>
-        <w:t>Pages</w:t>
-      </w:r>
-      <w:proofErr w:type="spellEnd"/>
-      <w:r>
-        <w:rPr>
-          <w:lang w:val="pt-PT"/>
-        </w:rPr>
-        <w:t xml:space="preserve"> permitiu disponibilizar o </w:t>
-      </w:r>
-      <w:proofErr w:type="spellStart"/>
-      <w:r>
-        <w:rPr>
-          <w:lang w:val="pt-PT"/>
-        </w:rPr>
-        <w:t>projecto</w:t>
-      </w:r>
-      <w:proofErr w:type="spellEnd"/>
-      <w:r>
-        <w:rPr>
-          <w:lang w:val="pt-PT"/>
-        </w:rPr>
-        <w:t xml:space="preserve"> de forma gratuita, mantendo os ficheiros organizados num repositório e facilitando futuras </w:t>
-      </w:r>
-      <w:proofErr w:type="spellStart"/>
-      <w:r>
-        <w:rPr>
-          <w:lang w:val="pt-PT"/>
-        </w:rPr>
-        <w:t>actualizações</w:t>
-      </w:r>
-      <w:proofErr w:type="spellEnd"/>
-      <w:r>
-        <w:rPr>
-          <w:lang w:val="pt-PT"/>
-        </w:rPr>
-        <w:t xml:space="preserve"> do conteúdo.</w:t>
-      </w:r>
+          <w:b/>
+          <w:bCs/>
+        </w:rPr>
+        <w:t xml:space="preserve"> GitHub Pages?</w:t>
+      </w:r>
+      <w:r>
+        <w:t xml:space="preserve"> </w:t>
+      </w:r>
+      <w:r>
+        <w:rPr>
+          <w:lang w:val="pt-PT"/>
+        </w:rPr>
+        <w:t xml:space="preserve">Disponível em: &lt;https://docs.github.com/en/pages/getting-started-with-github-pages/what-is-github-pages&gt;. </w:t>
+      </w:r>
+      <w:proofErr w:type="spellStart"/>
+      <w:r>
+        <w:t>Acesso</w:t>
+      </w:r>
+      <w:proofErr w:type="spellEnd"/>
+      <w:r>
+        <w:t xml:space="preserve"> </w:t>
+      </w:r>
+      <w:proofErr w:type="spellStart"/>
+      <w:r>
+        <w:t>em</w:t>
+      </w:r>
+      <w:proofErr w:type="spellEnd"/>
+      <w:r>
+        <w:t>: 2</w:t>
+      </w:r>
+      <w:r>
+        <w:t>8</w:t>
+      </w:r>
+      <w:r>
+        <w:t xml:space="preserve"> ago. 2026.</w:t>
+      </w:r>
+      <w:hyperlink r:id="rId23" w:tgtFrame="_blank" w:history="1">
+        <w:r>
+          <w:rPr>
+            <w:rStyle w:val="Hyperlink"/>
+          </w:rPr>
+          <w:t>github</w:t>
+        </w:r>
+      </w:hyperlink>
+    </w:p>
+    <w:p>
+      <w:pPr>
+        <w:jc w:val="left"/>
+      </w:pPr>
+      <w:r>
+        <w:t xml:space="preserve">GITHUB DOCS. </w:t>
+      </w:r>
+      <w:proofErr w:type="spellStart"/>
+      <w:r>
+        <w:rPr>
+          <w:b/>
+          <w:bCs/>
+        </w:rPr>
+        <w:t>Quickstart</w:t>
+      </w:r>
+      <w:proofErr w:type="spellEnd"/>
+      <w:r>
+        <w:rPr>
+          <w:b/>
+          <w:bCs/>
+        </w:rPr>
+        <w:t xml:space="preserve"> for GitHub Pages</w:t>
+      </w:r>
+      <w:r>
+        <w:t xml:space="preserve">. </w:t>
+      </w:r>
+      <w:r>
+        <w:rPr>
+          <w:lang w:val="pt-PT"/>
+        </w:rPr>
+        <w:t xml:space="preserve">Disponível em: &lt;https://docs.github.com/pages/quickstart&gt;. </w:t>
+      </w:r>
+      <w:proofErr w:type="spellStart"/>
+      <w:r>
+        <w:t>Acesso</w:t>
+      </w:r>
+      <w:proofErr w:type="spellEnd"/>
+      <w:r>
+        <w:t xml:space="preserve"> </w:t>
+      </w:r>
+      <w:proofErr w:type="spellStart"/>
+      <w:r>
+        <w:t>em</w:t>
+      </w:r>
+      <w:proofErr w:type="spellEnd"/>
+      <w:r>
+        <w:t>: 2</w:t>
+      </w:r>
+      <w:r>
+        <w:t>8</w:t>
+      </w:r>
+      <w:r>
+        <w:t xml:space="preserve"> ago. 2026.</w:t>
+      </w:r>
+      <w:hyperlink r:id="rId24" w:tgtFrame="_blank" w:history="1">
+        <w:r>
+          <w:rPr>
+            <w:rStyle w:val="Hyperlink"/>
+          </w:rPr>
+          <w:t>github</w:t>
+        </w:r>
+      </w:hyperlink>
+    </w:p>
+    <w:p>
+      <w:pPr>
+        <w:rPr>
+          <w:lang w:val="pt-PT"/>
+        </w:rPr>
+      </w:pPr>
+    </w:p>
+    <w:p>
+      <w:pPr>
+        <w:rPr>
+          <w:lang w:val="pt-PT"/>
+        </w:rPr>
+      </w:pPr>
     </w:p>
     <w:sectPr>
-      <w:footerReference w:type="default" r:id="rId16"/>
+      <w:footerReference w:type="default" r:id="rId25"/>
       <w:pgSz w:w="12240" w:h="15840"/>
       <w:pgMar w:top="1440" w:right="1440" w:bottom="1440" w:left="1440" w:header="720" w:footer="720" w:gutter="0"/>
       <w:cols w:space="720"/>

</xml_diff>

<commit_message>
Fix profile photo styling
Adjust the owner photo container and image rules to ensure a consistent circular crop and full-coverage display. This also updates the project documentation file in the docs folder.
</commit_message>
<xml_diff>
--- a/doc/Documentação - InfoTech by Júlio Mulhanga.docx
+++ b/doc/Documentação - InfoTech by Júlio Mulhanga.docx
@@ -47,8 +47,6 @@
             </w:tabs>
             <w:rPr>
               <w:rFonts w:asciiTheme="minorHAnsi" w:eastAsiaTheme="minorEastAsia" w:hAnsiTheme="minorHAnsi"/>
-              <w:noProof/>
-              <w:lang w:val="en-US"/>
             </w:rPr>
           </w:pPr>
           <w:r>
@@ -60,58 +58,50 @@
           <w:r>
             <w:fldChar w:fldCharType="separate"/>
           </w:r>
-          <w:hyperlink w:anchor="_Toc239531971" w:history="1">
+          <w:hyperlink w:anchor="_Toc240048709" w:history="1">
             <w:r>
               <w:rPr>
                 <w:rStyle w:val="Hyperlink"/>
-                <w:noProof/>
               </w:rPr>
               <w:t>RESUMO</w:t>
             </w:r>
             <w:r>
               <w:rPr>
-                <w:noProof/>
                 <w:webHidden/>
               </w:rPr>
               <w:tab/>
             </w:r>
             <w:r>
               <w:rPr>
-                <w:noProof/>
                 <w:webHidden/>
               </w:rPr>
               <w:fldChar w:fldCharType="begin"/>
             </w:r>
             <w:r>
               <w:rPr>
-                <w:noProof/>
-                <w:webHidden/>
-              </w:rPr>
-              <w:instrText xml:space="preserve"> PAGEREF _Toc239531971 \h </w:instrText>
-            </w:r>
-            <w:r>
-              <w:rPr>
-                <w:noProof/>
-                <w:webHidden/>
-              </w:rPr>
-            </w:r>
-            <w:r>
-              <w:rPr>
-                <w:noProof/>
+                <w:webHidden/>
+              </w:rPr>
+              <w:instrText xml:space="preserve"> PAGEREF _Toc240048709 \h </w:instrText>
+            </w:r>
+            <w:r>
+              <w:rPr>
+                <w:webHidden/>
+              </w:rPr>
+            </w:r>
+            <w:r>
+              <w:rPr>
                 <w:webHidden/>
               </w:rPr>
               <w:fldChar w:fldCharType="separate"/>
             </w:r>
             <w:r>
               <w:rPr>
-                <w:noProof/>
                 <w:webHidden/>
               </w:rPr>
               <w:t>2</w:t>
             </w:r>
             <w:r>
               <w:rPr>
-                <w:noProof/>
                 <w:webHidden/>
               </w:rPr>
               <w:fldChar w:fldCharType="end"/>
@@ -127,77 +117,64 @@
             </w:tabs>
             <w:rPr>
               <w:rFonts w:asciiTheme="minorHAnsi" w:eastAsiaTheme="minorEastAsia" w:hAnsiTheme="minorHAnsi"/>
-              <w:noProof/>
-              <w:lang w:val="en-US"/>
             </w:rPr>
           </w:pPr>
-          <w:hyperlink w:anchor="_Toc239531972" w:history="1">
+          <w:hyperlink w:anchor="_Toc240048710" w:history="1">
             <w:r>
               <w:rPr>
                 <w:rStyle w:val="Hyperlink"/>
-                <w:noProof/>
               </w:rPr>
               <w:t>1.</w:t>
             </w:r>
             <w:r>
               <w:rPr>
                 <w:rFonts w:asciiTheme="minorHAnsi" w:eastAsiaTheme="minorEastAsia" w:hAnsiTheme="minorHAnsi"/>
-                <w:noProof/>
-                <w:lang w:val="en-US"/>
               </w:rPr>
               <w:tab/>
             </w:r>
             <w:r>
               <w:rPr>
                 <w:rStyle w:val="Hyperlink"/>
-                <w:noProof/>
               </w:rPr>
               <w:t>INTRODUÇÃO</w:t>
             </w:r>
             <w:r>
               <w:rPr>
-                <w:noProof/>
                 <w:webHidden/>
               </w:rPr>
               <w:tab/>
             </w:r>
             <w:r>
               <w:rPr>
-                <w:noProof/>
                 <w:webHidden/>
               </w:rPr>
               <w:fldChar w:fldCharType="begin"/>
             </w:r>
             <w:r>
               <w:rPr>
-                <w:noProof/>
-                <w:webHidden/>
-              </w:rPr>
-              <w:instrText xml:space="preserve"> PAGEREF _Toc239531972 \h </w:instrText>
-            </w:r>
-            <w:r>
-              <w:rPr>
-                <w:noProof/>
-                <w:webHidden/>
-              </w:rPr>
-            </w:r>
-            <w:r>
-              <w:rPr>
-                <w:noProof/>
+                <w:webHidden/>
+              </w:rPr>
+              <w:instrText xml:space="preserve"> PAGEREF _Toc240048710 \h </w:instrText>
+            </w:r>
+            <w:r>
+              <w:rPr>
+                <w:webHidden/>
+              </w:rPr>
+            </w:r>
+            <w:r>
+              <w:rPr>
                 <w:webHidden/>
               </w:rPr>
               <w:fldChar w:fldCharType="separate"/>
             </w:r>
             <w:r>
               <w:rPr>
-                <w:noProof/>
                 <w:webHidden/>
               </w:rPr>
               <w:t>3</w:t>
             </w:r>
             <w:r>
               <w:rPr>
-                <w:noProof/>
                 <w:webHidden/>
               </w:rPr>
               <w:fldChar w:fldCharType="end"/>
@@ -213,77 +190,64 @@
             </w:tabs>
             <w:rPr>
               <w:rFonts w:asciiTheme="minorHAnsi" w:eastAsiaTheme="minorEastAsia" w:hAnsiTheme="minorHAnsi"/>
-              <w:noProof/>
-              <w:lang w:val="en-US"/>
             </w:rPr>
           </w:pPr>
-          <w:hyperlink w:anchor="_Toc239531973" w:history="1">
+          <w:hyperlink w:anchor="_Toc240048711" w:history="1">
             <w:r>
               <w:rPr>
                 <w:rStyle w:val="Hyperlink"/>
-                <w:noProof/>
               </w:rPr>
               <w:t>2.</w:t>
             </w:r>
             <w:r>
               <w:rPr>
                 <w:rFonts w:asciiTheme="minorHAnsi" w:eastAsiaTheme="minorEastAsia" w:hAnsiTheme="minorHAnsi"/>
-                <w:noProof/>
-                <w:lang w:val="en-US"/>
               </w:rPr>
               <w:tab/>
             </w:r>
             <w:r>
               <w:rPr>
                 <w:rStyle w:val="Hyperlink"/>
-                <w:noProof/>
               </w:rPr>
               <w:t>DESENVOLVIMENTO</w:t>
             </w:r>
             <w:r>
               <w:rPr>
-                <w:noProof/>
                 <w:webHidden/>
               </w:rPr>
               <w:tab/>
             </w:r>
             <w:r>
               <w:rPr>
-                <w:noProof/>
                 <w:webHidden/>
               </w:rPr>
               <w:fldChar w:fldCharType="begin"/>
             </w:r>
             <w:r>
               <w:rPr>
-                <w:noProof/>
-                <w:webHidden/>
-              </w:rPr>
-              <w:instrText xml:space="preserve"> PAGEREF _Toc239531973 \h </w:instrText>
-            </w:r>
-            <w:r>
-              <w:rPr>
-                <w:noProof/>
-                <w:webHidden/>
-              </w:rPr>
-            </w:r>
-            <w:r>
-              <w:rPr>
-                <w:noProof/>
+                <w:webHidden/>
+              </w:rPr>
+              <w:instrText xml:space="preserve"> PAGEREF _Toc240048711 \h </w:instrText>
+            </w:r>
+            <w:r>
+              <w:rPr>
+                <w:webHidden/>
+              </w:rPr>
+            </w:r>
+            <w:r>
+              <w:rPr>
                 <w:webHidden/>
               </w:rPr>
               <w:fldChar w:fldCharType="separate"/>
             </w:r>
             <w:r>
               <w:rPr>
-                <w:noProof/>
                 <w:webHidden/>
               </w:rPr>
               <w:t>4</w:t>
             </w:r>
             <w:r>
               <w:rPr>
-                <w:noProof/>
                 <w:webHidden/>
               </w:rPr>
               <w:fldChar w:fldCharType="end"/>
@@ -299,77 +263,64 @@
             </w:tabs>
             <w:rPr>
               <w:rFonts w:asciiTheme="minorHAnsi" w:eastAsiaTheme="minorEastAsia" w:hAnsiTheme="minorHAnsi"/>
-              <w:noProof/>
-              <w:lang w:val="en-US"/>
             </w:rPr>
           </w:pPr>
-          <w:hyperlink w:anchor="_Toc239531974" w:history="1">
+          <w:hyperlink w:anchor="_Toc240048712" w:history="1">
             <w:r>
               <w:rPr>
                 <w:rStyle w:val="Hyperlink"/>
-                <w:noProof/>
               </w:rPr>
               <w:t>2.1.</w:t>
             </w:r>
             <w:r>
               <w:rPr>
                 <w:rFonts w:asciiTheme="minorHAnsi" w:eastAsiaTheme="minorEastAsia" w:hAnsiTheme="minorHAnsi"/>
-                <w:noProof/>
-                <w:lang w:val="en-US"/>
               </w:rPr>
               <w:tab/>
             </w:r>
             <w:r>
               <w:rPr>
                 <w:rStyle w:val="Hyperlink"/>
-                <w:noProof/>
               </w:rPr>
               <w:t>Metodologia</w:t>
             </w:r>
             <w:r>
               <w:rPr>
-                <w:noProof/>
                 <w:webHidden/>
               </w:rPr>
               <w:tab/>
             </w:r>
             <w:r>
               <w:rPr>
-                <w:noProof/>
                 <w:webHidden/>
               </w:rPr>
               <w:fldChar w:fldCharType="begin"/>
             </w:r>
             <w:r>
               <w:rPr>
-                <w:noProof/>
-                <w:webHidden/>
-              </w:rPr>
-              <w:instrText xml:space="preserve"> PAGEREF _Toc239531974 \h </w:instrText>
-            </w:r>
-            <w:r>
-              <w:rPr>
-                <w:noProof/>
-                <w:webHidden/>
-              </w:rPr>
-            </w:r>
-            <w:r>
-              <w:rPr>
-                <w:noProof/>
+                <w:webHidden/>
+              </w:rPr>
+              <w:instrText xml:space="preserve"> PAGEREF _Toc240048712 \h </w:instrText>
+            </w:r>
+            <w:r>
+              <w:rPr>
+                <w:webHidden/>
+              </w:rPr>
+            </w:r>
+            <w:r>
+              <w:rPr>
                 <w:webHidden/>
               </w:rPr>
               <w:fldChar w:fldCharType="separate"/>
             </w:r>
             <w:r>
               <w:rPr>
-                <w:noProof/>
                 <w:webHidden/>
               </w:rPr>
               <w:t>4</w:t>
             </w:r>
             <w:r>
               <w:rPr>
-                <w:noProof/>
                 <w:webHidden/>
               </w:rPr>
               <w:fldChar w:fldCharType="end"/>
@@ -385,77 +336,64 @@
             </w:tabs>
             <w:rPr>
               <w:rFonts w:asciiTheme="minorHAnsi" w:eastAsiaTheme="minorEastAsia" w:hAnsiTheme="minorHAnsi"/>
-              <w:noProof/>
-              <w:lang w:val="en-US"/>
             </w:rPr>
           </w:pPr>
-          <w:hyperlink w:anchor="_Toc239531975" w:history="1">
+          <w:hyperlink w:anchor="_Toc240048713" w:history="1">
             <w:r>
               <w:rPr>
                 <w:rStyle w:val="Hyperlink"/>
-                <w:noProof/>
               </w:rPr>
               <w:t>2.2.</w:t>
             </w:r>
             <w:r>
               <w:rPr>
                 <w:rFonts w:asciiTheme="minorHAnsi" w:eastAsiaTheme="minorEastAsia" w:hAnsiTheme="minorHAnsi"/>
-                <w:noProof/>
-                <w:lang w:val="en-US"/>
               </w:rPr>
               <w:tab/>
             </w:r>
             <w:r>
               <w:rPr>
                 <w:rStyle w:val="Hyperlink"/>
-                <w:noProof/>
               </w:rPr>
               <w:t>Tipo de Site</w:t>
             </w:r>
             <w:r>
               <w:rPr>
-                <w:noProof/>
                 <w:webHidden/>
               </w:rPr>
               <w:tab/>
             </w:r>
             <w:r>
               <w:rPr>
-                <w:noProof/>
                 <w:webHidden/>
               </w:rPr>
               <w:fldChar w:fldCharType="begin"/>
             </w:r>
             <w:r>
               <w:rPr>
-                <w:noProof/>
-                <w:webHidden/>
-              </w:rPr>
-              <w:instrText xml:space="preserve"> PAGEREF _Toc239531975 \h </w:instrText>
-            </w:r>
-            <w:r>
-              <w:rPr>
-                <w:noProof/>
-                <w:webHidden/>
-              </w:rPr>
-            </w:r>
-            <w:r>
-              <w:rPr>
-                <w:noProof/>
+                <w:webHidden/>
+              </w:rPr>
+              <w:instrText xml:space="preserve"> PAGEREF _Toc240048713 \h </w:instrText>
+            </w:r>
+            <w:r>
+              <w:rPr>
+                <w:webHidden/>
+              </w:rPr>
+            </w:r>
+            <w:r>
+              <w:rPr>
                 <w:webHidden/>
               </w:rPr>
               <w:fldChar w:fldCharType="separate"/>
             </w:r>
             <w:r>
               <w:rPr>
-                <w:noProof/>
                 <w:webHidden/>
               </w:rPr>
               <w:t>4</w:t>
             </w:r>
             <w:r>
               <w:rPr>
-                <w:noProof/>
                 <w:webHidden/>
               </w:rPr>
               <w:fldChar w:fldCharType="end"/>
@@ -471,77 +409,64 @@
             </w:tabs>
             <w:rPr>
               <w:rFonts w:asciiTheme="minorHAnsi" w:eastAsiaTheme="minorEastAsia" w:hAnsiTheme="minorHAnsi"/>
-              <w:noProof/>
-              <w:lang w:val="en-US"/>
             </w:rPr>
           </w:pPr>
-          <w:hyperlink w:anchor="_Toc239531976" w:history="1">
+          <w:hyperlink w:anchor="_Toc240048714" w:history="1">
             <w:r>
               <w:rPr>
                 <w:rStyle w:val="Hyperlink"/>
-                <w:noProof/>
               </w:rPr>
               <w:t>2.3.</w:t>
             </w:r>
             <w:r>
               <w:rPr>
                 <w:rFonts w:asciiTheme="minorHAnsi" w:eastAsiaTheme="minorEastAsia" w:hAnsiTheme="minorHAnsi"/>
-                <w:noProof/>
-                <w:lang w:val="en-US"/>
               </w:rPr>
               <w:tab/>
             </w:r>
             <w:r>
               <w:rPr>
                 <w:rStyle w:val="Hyperlink"/>
-                <w:noProof/>
               </w:rPr>
               <w:t>Arquitetura da Informação</w:t>
             </w:r>
             <w:r>
               <w:rPr>
-                <w:noProof/>
                 <w:webHidden/>
               </w:rPr>
               <w:tab/>
             </w:r>
             <w:r>
               <w:rPr>
-                <w:noProof/>
                 <w:webHidden/>
               </w:rPr>
               <w:fldChar w:fldCharType="begin"/>
             </w:r>
             <w:r>
               <w:rPr>
-                <w:noProof/>
-                <w:webHidden/>
-              </w:rPr>
-              <w:instrText xml:space="preserve"> PAGEREF _Toc239531976 \h </w:instrText>
-            </w:r>
-            <w:r>
-              <w:rPr>
-                <w:noProof/>
-                <w:webHidden/>
-              </w:rPr>
-            </w:r>
-            <w:r>
-              <w:rPr>
-                <w:noProof/>
+                <w:webHidden/>
+              </w:rPr>
+              <w:instrText xml:space="preserve"> PAGEREF _Toc240048714 \h </w:instrText>
+            </w:r>
+            <w:r>
+              <w:rPr>
+                <w:webHidden/>
+              </w:rPr>
+            </w:r>
+            <w:r>
+              <w:rPr>
                 <w:webHidden/>
               </w:rPr>
               <w:fldChar w:fldCharType="separate"/>
             </w:r>
             <w:r>
               <w:rPr>
-                <w:noProof/>
                 <w:webHidden/>
               </w:rPr>
               <w:t>5</w:t>
             </w:r>
             <w:r>
               <w:rPr>
-                <w:noProof/>
                 <w:webHidden/>
               </w:rPr>
               <w:fldChar w:fldCharType="end"/>
@@ -557,23 +482,18 @@
             </w:tabs>
             <w:rPr>
               <w:rFonts w:asciiTheme="minorHAnsi" w:eastAsiaTheme="minorEastAsia" w:hAnsiTheme="minorHAnsi"/>
-              <w:noProof/>
-              <w:lang w:val="en-US"/>
             </w:rPr>
           </w:pPr>
-          <w:hyperlink w:anchor="_Toc239531977" w:history="1">
+          <w:hyperlink w:anchor="_Toc240048715" w:history="1">
             <w:r>
               <w:rPr>
                 <w:rStyle w:val="Hyperlink"/>
-                <w:noProof/>
               </w:rPr>
               <w:t>2.4.</w:t>
             </w:r>
             <w:r>
               <w:rPr>
                 <w:rFonts w:asciiTheme="minorHAnsi" w:eastAsiaTheme="minorEastAsia" w:hAnsiTheme="minorHAnsi"/>
-                <w:noProof/>
-                <w:lang w:val="en-US"/>
               </w:rPr>
               <w:tab/>
             </w:r>
@@ -581,14 +501,12 @@
               <w:rPr>
                 <w:rStyle w:val="Hyperlink"/>
                 <w:i/>
-                <w:noProof/>
               </w:rPr>
               <w:t>Layout</w:t>
             </w:r>
             <w:r>
               <w:rPr>
                 <w:rStyle w:val="Hyperlink"/>
-                <w:noProof/>
               </w:rPr>
               <w:t xml:space="preserve"> da </w:t>
             </w:r>
@@ -596,14 +514,12 @@
               <w:rPr>
                 <w:rStyle w:val="Hyperlink"/>
                 <w:i/>
-                <w:noProof/>
               </w:rPr>
               <w:t>Home</w:t>
             </w:r>
             <w:r>
               <w:rPr>
                 <w:rStyle w:val="Hyperlink"/>
-                <w:noProof/>
               </w:rPr>
               <w:t xml:space="preserve"> </w:t>
             </w:r>
@@ -611,54 +527,46 @@
               <w:rPr>
                 <w:rStyle w:val="Hyperlink"/>
                 <w:i/>
-                <w:noProof/>
               </w:rPr>
               <w:t>Page</w:t>
             </w:r>
             <w:r>
               <w:rPr>
-                <w:noProof/>
                 <w:webHidden/>
               </w:rPr>
               <w:tab/>
             </w:r>
             <w:r>
               <w:rPr>
-                <w:noProof/>
                 <w:webHidden/>
               </w:rPr>
               <w:fldChar w:fldCharType="begin"/>
             </w:r>
             <w:r>
               <w:rPr>
-                <w:noProof/>
-                <w:webHidden/>
-              </w:rPr>
-              <w:instrText xml:space="preserve"> PAGEREF _Toc239531977 \h </w:instrText>
-            </w:r>
-            <w:r>
-              <w:rPr>
-                <w:noProof/>
-                <w:webHidden/>
-              </w:rPr>
-            </w:r>
-            <w:r>
-              <w:rPr>
-                <w:noProof/>
+                <w:webHidden/>
+              </w:rPr>
+              <w:instrText xml:space="preserve"> PAGEREF _Toc240048715 \h </w:instrText>
+            </w:r>
+            <w:r>
+              <w:rPr>
+                <w:webHidden/>
+              </w:rPr>
+            </w:r>
+            <w:r>
+              <w:rPr>
                 <w:webHidden/>
               </w:rPr>
               <w:fldChar w:fldCharType="separate"/>
             </w:r>
             <w:r>
               <w:rPr>
-                <w:noProof/>
                 <w:webHidden/>
               </w:rPr>
               <w:t>6</w:t>
             </w:r>
             <w:r>
               <w:rPr>
-                <w:noProof/>
                 <w:webHidden/>
               </w:rPr>
               <w:fldChar w:fldCharType="end"/>
@@ -674,77 +582,64 @@
             </w:tabs>
             <w:rPr>
               <w:rFonts w:asciiTheme="minorHAnsi" w:eastAsiaTheme="minorEastAsia" w:hAnsiTheme="minorHAnsi"/>
-              <w:noProof/>
-              <w:lang w:val="en-US"/>
             </w:rPr>
           </w:pPr>
-          <w:hyperlink w:anchor="_Toc239531978" w:history="1">
+          <w:hyperlink w:anchor="_Toc240048716" w:history="1">
             <w:r>
               <w:rPr>
                 <w:rStyle w:val="Hyperlink"/>
-                <w:noProof/>
               </w:rPr>
               <w:t>2.5.</w:t>
             </w:r>
             <w:r>
               <w:rPr>
                 <w:rFonts w:asciiTheme="minorHAnsi" w:eastAsiaTheme="minorEastAsia" w:hAnsiTheme="minorHAnsi"/>
-                <w:noProof/>
-                <w:lang w:val="en-US"/>
               </w:rPr>
               <w:tab/>
             </w:r>
             <w:r>
               <w:rPr>
                 <w:rStyle w:val="Hyperlink"/>
-                <w:noProof/>
               </w:rPr>
               <w:t>Diagramação das Páginas</w:t>
             </w:r>
             <w:r>
               <w:rPr>
-                <w:noProof/>
                 <w:webHidden/>
               </w:rPr>
               <w:tab/>
             </w:r>
             <w:r>
               <w:rPr>
-                <w:noProof/>
                 <w:webHidden/>
               </w:rPr>
               <w:fldChar w:fldCharType="begin"/>
             </w:r>
             <w:r>
               <w:rPr>
-                <w:noProof/>
-                <w:webHidden/>
-              </w:rPr>
-              <w:instrText xml:space="preserve"> PAGEREF _Toc239531978 \h </w:instrText>
-            </w:r>
-            <w:r>
-              <w:rPr>
-                <w:noProof/>
-                <w:webHidden/>
-              </w:rPr>
-            </w:r>
-            <w:r>
-              <w:rPr>
-                <w:noProof/>
+                <w:webHidden/>
+              </w:rPr>
+              <w:instrText xml:space="preserve"> PAGEREF _Toc240048716 \h </w:instrText>
+            </w:r>
+            <w:r>
+              <w:rPr>
+                <w:webHidden/>
+              </w:rPr>
+            </w:r>
+            <w:r>
+              <w:rPr>
                 <w:webHidden/>
               </w:rPr>
               <w:fldChar w:fldCharType="separate"/>
             </w:r>
             <w:r>
               <w:rPr>
-                <w:noProof/>
                 <w:webHidden/>
               </w:rPr>
               <w:t>7</w:t>
             </w:r>
             <w:r>
               <w:rPr>
-                <w:noProof/>
                 <w:webHidden/>
               </w:rPr>
               <w:fldChar w:fldCharType="end"/>
@@ -760,30 +655,24 @@
             </w:tabs>
             <w:rPr>
               <w:rFonts w:asciiTheme="minorHAnsi" w:eastAsiaTheme="minorEastAsia" w:hAnsiTheme="minorHAnsi"/>
-              <w:noProof/>
-              <w:lang w:val="en-US"/>
             </w:rPr>
           </w:pPr>
-          <w:hyperlink w:anchor="_Toc239531979" w:history="1">
+          <w:hyperlink w:anchor="_Toc240048717" w:history="1">
             <w:r>
               <w:rPr>
                 <w:rStyle w:val="Hyperlink"/>
-                <w:noProof/>
               </w:rPr>
               <w:t>2.6.</w:t>
             </w:r>
             <w:r>
               <w:rPr>
                 <w:rFonts w:asciiTheme="minorHAnsi" w:eastAsiaTheme="minorEastAsia" w:hAnsiTheme="minorHAnsi"/>
-                <w:noProof/>
-                <w:lang w:val="en-US"/>
               </w:rPr>
               <w:tab/>
             </w:r>
             <w:r>
               <w:rPr>
                 <w:rStyle w:val="Hyperlink"/>
-                <w:noProof/>
               </w:rPr>
               <w:t xml:space="preserve">Desenvolvimento das Páginas em </w:t>
             </w:r>
@@ -791,54 +680,46 @@
               <w:rPr>
                 <w:rStyle w:val="Hyperlink"/>
                 <w:i/>
-                <w:noProof/>
               </w:rPr>
               <w:t>HTML</w:t>
             </w:r>
             <w:r>
               <w:rPr>
-                <w:noProof/>
                 <w:webHidden/>
               </w:rPr>
               <w:tab/>
             </w:r>
             <w:r>
               <w:rPr>
-                <w:noProof/>
                 <w:webHidden/>
               </w:rPr>
               <w:fldChar w:fldCharType="begin"/>
             </w:r>
             <w:r>
               <w:rPr>
-                <w:noProof/>
-                <w:webHidden/>
-              </w:rPr>
-              <w:instrText xml:space="preserve"> PAGEREF _Toc239531979 \h </w:instrText>
-            </w:r>
-            <w:r>
-              <w:rPr>
-                <w:noProof/>
-                <w:webHidden/>
-              </w:rPr>
-            </w:r>
-            <w:r>
-              <w:rPr>
-                <w:noProof/>
+                <w:webHidden/>
+              </w:rPr>
+              <w:instrText xml:space="preserve"> PAGEREF _Toc240048717 \h </w:instrText>
+            </w:r>
+            <w:r>
+              <w:rPr>
+                <w:webHidden/>
+              </w:rPr>
+            </w:r>
+            <w:r>
+              <w:rPr>
                 <w:webHidden/>
               </w:rPr>
               <w:fldChar w:fldCharType="separate"/>
             </w:r>
             <w:r>
               <w:rPr>
-                <w:noProof/>
                 <w:webHidden/>
               </w:rPr>
               <w:t>8</w:t>
             </w:r>
             <w:r>
               <w:rPr>
-                <w:noProof/>
                 <w:webHidden/>
               </w:rPr>
               <w:fldChar w:fldCharType="end"/>
@@ -854,77 +735,64 @@
             </w:tabs>
             <w:rPr>
               <w:rFonts w:asciiTheme="minorHAnsi" w:eastAsiaTheme="minorEastAsia" w:hAnsiTheme="minorHAnsi"/>
-              <w:noProof/>
-              <w:lang w:val="en-US"/>
             </w:rPr>
           </w:pPr>
-          <w:hyperlink w:anchor="_Toc239531980" w:history="1">
+          <w:hyperlink w:anchor="_Toc240048718" w:history="1">
             <w:r>
               <w:rPr>
                 <w:rStyle w:val="Hyperlink"/>
-                <w:noProof/>
               </w:rPr>
               <w:t>2.7.</w:t>
             </w:r>
             <w:r>
               <w:rPr>
                 <w:rFonts w:asciiTheme="minorHAnsi" w:eastAsiaTheme="minorEastAsia" w:hAnsiTheme="minorHAnsi"/>
-                <w:noProof/>
-                <w:lang w:val="en-US"/>
               </w:rPr>
               <w:tab/>
             </w:r>
             <w:r>
               <w:rPr>
                 <w:rStyle w:val="Hyperlink"/>
-                <w:noProof/>
               </w:rPr>
               <w:t>Integração de Imagens, Áudio, Vídeo e Formulários</w:t>
             </w:r>
             <w:r>
               <w:rPr>
-                <w:noProof/>
                 <w:webHidden/>
               </w:rPr>
               <w:tab/>
             </w:r>
             <w:r>
               <w:rPr>
-                <w:noProof/>
                 <w:webHidden/>
               </w:rPr>
               <w:fldChar w:fldCharType="begin"/>
             </w:r>
             <w:r>
               <w:rPr>
-                <w:noProof/>
-                <w:webHidden/>
-              </w:rPr>
-              <w:instrText xml:space="preserve"> PAGEREF _Toc239531980 \h </w:instrText>
-            </w:r>
-            <w:r>
-              <w:rPr>
-                <w:noProof/>
-                <w:webHidden/>
-              </w:rPr>
-            </w:r>
-            <w:r>
-              <w:rPr>
-                <w:noProof/>
+                <w:webHidden/>
+              </w:rPr>
+              <w:instrText xml:space="preserve"> PAGEREF _Toc240048718 \h </w:instrText>
+            </w:r>
+            <w:r>
+              <w:rPr>
+                <w:webHidden/>
+              </w:rPr>
+            </w:r>
+            <w:r>
+              <w:rPr>
                 <w:webHidden/>
               </w:rPr>
               <w:fldChar w:fldCharType="separate"/>
             </w:r>
             <w:r>
               <w:rPr>
-                <w:noProof/>
                 <w:webHidden/>
               </w:rPr>
               <w:t>8</w:t>
             </w:r>
             <w:r>
               <w:rPr>
-                <w:noProof/>
                 <w:webHidden/>
               </w:rPr>
               <w:fldChar w:fldCharType="end"/>
@@ -940,77 +808,64 @@
             </w:tabs>
             <w:rPr>
               <w:rFonts w:asciiTheme="minorHAnsi" w:eastAsiaTheme="minorEastAsia" w:hAnsiTheme="minorHAnsi"/>
-              <w:noProof/>
-              <w:lang w:val="en-US"/>
             </w:rPr>
           </w:pPr>
-          <w:hyperlink w:anchor="_Toc239531981" w:history="1">
+          <w:hyperlink w:anchor="_Toc240048719" w:history="1">
             <w:r>
               <w:rPr>
                 <w:rStyle w:val="Hyperlink"/>
-                <w:noProof/>
               </w:rPr>
               <w:t>2.8.</w:t>
             </w:r>
             <w:r>
               <w:rPr>
                 <w:rFonts w:asciiTheme="minorHAnsi" w:eastAsiaTheme="minorEastAsia" w:hAnsiTheme="minorHAnsi"/>
-                <w:noProof/>
-                <w:lang w:val="en-US"/>
               </w:rPr>
               <w:tab/>
             </w:r>
             <w:r>
               <w:rPr>
                 <w:rStyle w:val="Hyperlink"/>
-                <w:noProof/>
               </w:rPr>
               <w:t>Testes e Correção de Erros</w:t>
             </w:r>
             <w:r>
               <w:rPr>
-                <w:noProof/>
                 <w:webHidden/>
               </w:rPr>
               <w:tab/>
             </w:r>
             <w:r>
               <w:rPr>
-                <w:noProof/>
                 <w:webHidden/>
               </w:rPr>
               <w:fldChar w:fldCharType="begin"/>
             </w:r>
             <w:r>
               <w:rPr>
-                <w:noProof/>
-                <w:webHidden/>
-              </w:rPr>
-              <w:instrText xml:space="preserve"> PAGEREF _Toc239531981 \h </w:instrText>
-            </w:r>
-            <w:r>
-              <w:rPr>
-                <w:noProof/>
-                <w:webHidden/>
-              </w:rPr>
-            </w:r>
-            <w:r>
-              <w:rPr>
-                <w:noProof/>
+                <w:webHidden/>
+              </w:rPr>
+              <w:instrText xml:space="preserve"> PAGEREF _Toc240048719 \h </w:instrText>
+            </w:r>
+            <w:r>
+              <w:rPr>
+                <w:webHidden/>
+              </w:rPr>
+            </w:r>
+            <w:r>
+              <w:rPr>
                 <w:webHidden/>
               </w:rPr>
               <w:fldChar w:fldCharType="separate"/>
             </w:r>
             <w:r>
               <w:rPr>
-                <w:noProof/>
                 <w:webHidden/>
               </w:rPr>
               <w:t>9</w:t>
             </w:r>
             <w:r>
               <w:rPr>
-                <w:noProof/>
                 <w:webHidden/>
               </w:rPr>
               <w:fldChar w:fldCharType="end"/>
@@ -1026,77 +881,64 @@
             </w:tabs>
             <w:rPr>
               <w:rFonts w:asciiTheme="minorHAnsi" w:eastAsiaTheme="minorEastAsia" w:hAnsiTheme="minorHAnsi"/>
-              <w:noProof/>
-              <w:lang w:val="en-US"/>
             </w:rPr>
           </w:pPr>
-          <w:hyperlink w:anchor="_Toc239531982" w:history="1">
+          <w:hyperlink w:anchor="_Toc240048720" w:history="1">
             <w:r>
               <w:rPr>
                 <w:rStyle w:val="Hyperlink"/>
-                <w:noProof/>
               </w:rPr>
               <w:t>2.9.</w:t>
             </w:r>
             <w:r>
               <w:rPr>
                 <w:rFonts w:asciiTheme="minorHAnsi" w:eastAsiaTheme="minorEastAsia" w:hAnsiTheme="minorHAnsi"/>
-                <w:noProof/>
-                <w:lang w:val="en-US"/>
               </w:rPr>
               <w:tab/>
             </w:r>
             <w:r>
               <w:rPr>
                 <w:rStyle w:val="Hyperlink"/>
-                <w:noProof/>
               </w:rPr>
               <w:t>Hospedagem e Publicação</w:t>
             </w:r>
             <w:r>
               <w:rPr>
-                <w:noProof/>
                 <w:webHidden/>
               </w:rPr>
               <w:tab/>
             </w:r>
             <w:r>
               <w:rPr>
-                <w:noProof/>
                 <w:webHidden/>
               </w:rPr>
               <w:fldChar w:fldCharType="begin"/>
             </w:r>
             <w:r>
               <w:rPr>
-                <w:noProof/>
-                <w:webHidden/>
-              </w:rPr>
-              <w:instrText xml:space="preserve"> PAGEREF _Toc239531982 \h </w:instrText>
-            </w:r>
-            <w:r>
-              <w:rPr>
-                <w:noProof/>
-                <w:webHidden/>
-              </w:rPr>
-            </w:r>
-            <w:r>
-              <w:rPr>
-                <w:noProof/>
+                <w:webHidden/>
+              </w:rPr>
+              <w:instrText xml:space="preserve"> PAGEREF _Toc240048720 \h </w:instrText>
+            </w:r>
+            <w:r>
+              <w:rPr>
+                <w:webHidden/>
+              </w:rPr>
+            </w:r>
+            <w:r>
+              <w:rPr>
                 <w:webHidden/>
               </w:rPr>
               <w:fldChar w:fldCharType="separate"/>
             </w:r>
             <w:r>
               <w:rPr>
-                <w:noProof/>
                 <w:webHidden/>
               </w:rPr>
               <w:t>10</w:t>
             </w:r>
             <w:r>
               <w:rPr>
-                <w:noProof/>
                 <w:webHidden/>
               </w:rPr>
               <w:fldChar w:fldCharType="end"/>
@@ -1112,77 +954,64 @@
             </w:tabs>
             <w:rPr>
               <w:rFonts w:asciiTheme="minorHAnsi" w:eastAsiaTheme="minorEastAsia" w:hAnsiTheme="minorHAnsi"/>
-              <w:noProof/>
-              <w:lang w:val="en-US"/>
             </w:rPr>
           </w:pPr>
-          <w:hyperlink w:anchor="_Toc239531983" w:history="1">
+          <w:hyperlink w:anchor="_Toc240048721" w:history="1">
             <w:r>
               <w:rPr>
                 <w:rStyle w:val="Hyperlink"/>
-                <w:noProof/>
               </w:rPr>
               <w:t>2.10.</w:t>
             </w:r>
             <w:r>
               <w:rPr>
                 <w:rFonts w:asciiTheme="minorHAnsi" w:eastAsiaTheme="minorEastAsia" w:hAnsiTheme="minorHAnsi"/>
-                <w:noProof/>
-                <w:lang w:val="en-US"/>
               </w:rPr>
               <w:tab/>
             </w:r>
             <w:r>
               <w:rPr>
                 <w:rStyle w:val="Hyperlink"/>
-                <w:noProof/>
               </w:rPr>
               <w:t>Apresentação do Projeto</w:t>
             </w:r>
             <w:r>
               <w:rPr>
-                <w:noProof/>
                 <w:webHidden/>
               </w:rPr>
               <w:tab/>
             </w:r>
             <w:r>
               <w:rPr>
-                <w:noProof/>
                 <w:webHidden/>
               </w:rPr>
               <w:fldChar w:fldCharType="begin"/>
             </w:r>
             <w:r>
               <w:rPr>
-                <w:noProof/>
-                <w:webHidden/>
-              </w:rPr>
-              <w:instrText xml:space="preserve"> PAGEREF _Toc239531983 \h </w:instrText>
-            </w:r>
-            <w:r>
-              <w:rPr>
-                <w:noProof/>
-                <w:webHidden/>
-              </w:rPr>
-            </w:r>
-            <w:r>
-              <w:rPr>
-                <w:noProof/>
+                <w:webHidden/>
+              </w:rPr>
+              <w:instrText xml:space="preserve"> PAGEREF _Toc240048721 \h </w:instrText>
+            </w:r>
+            <w:r>
+              <w:rPr>
+                <w:webHidden/>
+              </w:rPr>
+            </w:r>
+            <w:r>
+              <w:rPr>
                 <w:webHidden/>
               </w:rPr>
               <w:fldChar w:fldCharType="separate"/>
             </w:r>
             <w:r>
               <w:rPr>
-                <w:noProof/>
-                <w:webHidden/>
-              </w:rPr>
-              <w:t>12</w:t>
-            </w:r>
-            <w:r>
-              <w:rPr>
-                <w:noProof/>
+                <w:webHidden/>
+              </w:rPr>
+              <w:t>11</w:t>
+            </w:r>
+            <w:r>
+              <w:rPr>
                 <w:webHidden/>
               </w:rPr>
               <w:fldChar w:fldCharType="end"/>
@@ -1198,77 +1027,64 @@
             </w:tabs>
             <w:rPr>
               <w:rFonts w:asciiTheme="minorHAnsi" w:eastAsiaTheme="minorEastAsia" w:hAnsiTheme="minorHAnsi"/>
-              <w:noProof/>
-              <w:lang w:val="en-US"/>
             </w:rPr>
           </w:pPr>
-          <w:hyperlink w:anchor="_Toc239531984" w:history="1">
+          <w:hyperlink w:anchor="_Toc240048722" w:history="1">
             <w:r>
               <w:rPr>
                 <w:rStyle w:val="Hyperlink"/>
-                <w:noProof/>
               </w:rPr>
               <w:t>3.</w:t>
             </w:r>
             <w:r>
               <w:rPr>
                 <w:rFonts w:asciiTheme="minorHAnsi" w:eastAsiaTheme="minorEastAsia" w:hAnsiTheme="minorHAnsi"/>
-                <w:noProof/>
-                <w:lang w:val="en-US"/>
               </w:rPr>
               <w:tab/>
             </w:r>
             <w:r>
               <w:rPr>
                 <w:rStyle w:val="Hyperlink"/>
-                <w:noProof/>
               </w:rPr>
               <w:t>CONCLUSÃO</w:t>
             </w:r>
             <w:r>
               <w:rPr>
-                <w:noProof/>
                 <w:webHidden/>
               </w:rPr>
               <w:tab/>
             </w:r>
             <w:r>
               <w:rPr>
-                <w:noProof/>
                 <w:webHidden/>
               </w:rPr>
               <w:fldChar w:fldCharType="begin"/>
             </w:r>
             <w:r>
               <w:rPr>
-                <w:noProof/>
-                <w:webHidden/>
-              </w:rPr>
-              <w:instrText xml:space="preserve"> PAGEREF _Toc239531984 \h </w:instrText>
-            </w:r>
-            <w:r>
-              <w:rPr>
-                <w:noProof/>
-                <w:webHidden/>
-              </w:rPr>
-            </w:r>
-            <w:r>
-              <w:rPr>
-                <w:noProof/>
+                <w:webHidden/>
+              </w:rPr>
+              <w:instrText xml:space="preserve"> PAGEREF _Toc240048722 \h </w:instrText>
+            </w:r>
+            <w:r>
+              <w:rPr>
+                <w:webHidden/>
+              </w:rPr>
+            </w:r>
+            <w:r>
+              <w:rPr>
                 <w:webHidden/>
               </w:rPr>
               <w:fldChar w:fldCharType="separate"/>
             </w:r>
             <w:r>
               <w:rPr>
-                <w:noProof/>
-                <w:webHidden/>
-              </w:rPr>
-              <w:t>13</w:t>
-            </w:r>
-            <w:r>
-              <w:rPr>
-                <w:noProof/>
+                <w:webHidden/>
+              </w:rPr>
+              <w:t>12</w:t>
+            </w:r>
+            <w:r>
+              <w:rPr>
                 <w:webHidden/>
               </w:rPr>
               <w:fldChar w:fldCharType="end"/>
@@ -1283,62 +1099,52 @@
             </w:tabs>
             <w:rPr>
               <w:rFonts w:asciiTheme="minorHAnsi" w:eastAsiaTheme="minorEastAsia" w:hAnsiTheme="minorHAnsi"/>
-              <w:noProof/>
-              <w:lang w:val="en-US"/>
             </w:rPr>
           </w:pPr>
-          <w:hyperlink w:anchor="_Toc239531985" w:history="1">
+          <w:hyperlink w:anchor="_Toc240048723" w:history="1">
             <w:r>
               <w:rPr>
                 <w:rStyle w:val="Hyperlink"/>
-                <w:noProof/>
               </w:rPr>
               <w:t>Referências</w:t>
             </w:r>
             <w:r>
               <w:rPr>
-                <w:noProof/>
                 <w:webHidden/>
               </w:rPr>
               <w:tab/>
             </w:r>
             <w:r>
               <w:rPr>
-                <w:noProof/>
                 <w:webHidden/>
               </w:rPr>
               <w:fldChar w:fldCharType="begin"/>
             </w:r>
             <w:r>
               <w:rPr>
-                <w:noProof/>
-                <w:webHidden/>
-              </w:rPr>
-              <w:instrText xml:space="preserve"> PAGEREF _Toc239531985 \h </w:instrText>
-            </w:r>
-            <w:r>
-              <w:rPr>
-                <w:noProof/>
-                <w:webHidden/>
-              </w:rPr>
-            </w:r>
-            <w:r>
-              <w:rPr>
-                <w:noProof/>
+                <w:webHidden/>
+              </w:rPr>
+              <w:instrText xml:space="preserve"> PAGEREF _Toc240048723 \h </w:instrText>
+            </w:r>
+            <w:r>
+              <w:rPr>
+                <w:webHidden/>
+              </w:rPr>
+            </w:r>
+            <w:r>
+              <w:rPr>
                 <w:webHidden/>
               </w:rPr>
               <w:fldChar w:fldCharType="separate"/>
             </w:r>
             <w:r>
               <w:rPr>
-                <w:noProof/>
-                <w:webHidden/>
-              </w:rPr>
-              <w:t>14</w:t>
-            </w:r>
-            <w:r>
-              <w:rPr>
-                <w:noProof/>
+                <w:webHidden/>
+              </w:rPr>
+              <w:t>13</w:t>
+            </w:r>
+            <w:r>
+              <w:rPr>
                 <w:webHidden/>
               </w:rPr>
               <w:fldChar w:fldCharType="end"/>
@@ -1365,7 +1171,7 @@
       <w:pPr>
         <w:pStyle w:val="Heading1"/>
       </w:pPr>
-      <w:bookmarkStart w:id="0" w:name="_Toc239531971"/>
+      <w:bookmarkStart w:id="0" w:name="_Toc240048709"/>
       <w:r>
         <w:lastRenderedPageBreak/>
         <w:t>RESUMO</w:t>
@@ -1379,12 +1185,14 @@
       <w:r>
         <w:t xml:space="preserve">presente trabalho apresenta o desenvolvimento do </w:t>
       </w:r>
+      <w:proofErr w:type="spellStart"/>
       <w:r>
         <w:rPr>
           <w:rStyle w:val="EstrageirasChar"/>
         </w:rPr>
         <w:t>InfoTech</w:t>
       </w:r>
+      <w:proofErr w:type="spellEnd"/>
       <w:r>
         <w:t xml:space="preserve">, um </w:t>
       </w:r>
@@ -1455,11 +1263,16 @@
         <w:t>,</w:t>
       </w:r>
       <w:r>
-        <w:t xml:space="preserve"> sobre, </w:t>
+        <w:t xml:space="preserve"> </w:t>
+      </w:r>
+      <w:proofErr w:type="gramStart"/>
+      <w:r>
+        <w:t xml:space="preserve">sobre, </w:t>
       </w:r>
       <w:r>
         <w:t>galeria</w:t>
       </w:r>
+      <w:proofErr w:type="gramEnd"/>
       <w:r>
         <w:t xml:space="preserve">, </w:t>
       </w:r>
@@ -1531,7 +1344,7 @@
         </w:numPr>
         <w:jc w:val="left"/>
       </w:pPr>
-      <w:bookmarkStart w:id="1" w:name="_Toc239531972"/>
+      <w:bookmarkStart w:id="1" w:name="_Toc240048710"/>
       <w:r>
         <w:lastRenderedPageBreak/>
         <w:t>INTRODUÇÃO</w:t>
@@ -1540,10 +1353,7 @@
     </w:p>
     <w:p>
       <w:r>
-        <w:t xml:space="preserve">O </w:t>
-      </w:r>
-      <w:r>
-        <w:t xml:space="preserve">presente </w:t>
+        <w:t xml:space="preserve">O presente </w:t>
       </w:r>
       <w:r>
         <w:t>projeto</w:t>
@@ -1578,12 +1388,14 @@
       <w:r>
         <w:t xml:space="preserve"> </w:t>
       </w:r>
+      <w:proofErr w:type="spellStart"/>
       <w:r>
         <w:rPr>
           <w:rStyle w:val="EstrageirasChar"/>
         </w:rPr>
         <w:t>InfoTech</w:t>
       </w:r>
+      <w:proofErr w:type="spellEnd"/>
       <w:r>
         <w:t xml:space="preserve">: Áreas da Informática. O </w:t>
       </w:r>
@@ -1681,12 +1493,14 @@
       <w:r>
         <w:t xml:space="preserve">A realização do </w:t>
       </w:r>
+      <w:proofErr w:type="spellStart"/>
       <w:r>
         <w:rPr>
           <w:rStyle w:val="EstrageirasChar"/>
         </w:rPr>
         <w:t>InfoTech</w:t>
       </w:r>
+      <w:proofErr w:type="spellEnd"/>
       <w:r>
         <w:t xml:space="preserve"> contribui para consolidar competências de planeamento, desenvolvimento, organização, teste e publicação de páginas </w:t>
       </w:r>
@@ -1726,7 +1540,7 @@
           <w:numId w:val="2"/>
         </w:numPr>
       </w:pPr>
-      <w:bookmarkStart w:id="2" w:name="_Toc239531973"/>
+      <w:bookmarkStart w:id="2" w:name="_Toc240048711"/>
       <w:r>
         <w:lastRenderedPageBreak/>
         <w:t>DESENVOLVIMENTO</w:t>
@@ -1741,7 +1555,7 @@
           <w:numId w:val="2"/>
         </w:numPr>
       </w:pPr>
-      <w:bookmarkStart w:id="3" w:name="_Toc239531974"/>
+      <w:bookmarkStart w:id="3" w:name="_Toc240048712"/>
       <w:r>
         <w:t>Metodologia</w:t>
       </w:r>
@@ -1758,7 +1572,15 @@
         <w:t>projeto</w:t>
       </w:r>
       <w:r>
-        <w:t xml:space="preserve"> InfoTech seguiu uma metodologia prática, permitindo aplicar os conhecimentos adquiridos no módulo de Desenvolvimento de Páginas </w:t>
+        <w:t xml:space="preserve"> </w:t>
+      </w:r>
+      <w:proofErr w:type="spellStart"/>
+      <w:r>
+        <w:t>InfoTech</w:t>
+      </w:r>
+      <w:proofErr w:type="spellEnd"/>
+      <w:r>
+        <w:t xml:space="preserve"> seguiu uma metodologia prática, permitindo aplicar os conhecimentos adquiridos no módulo de Desenvolvimento de Páginas </w:t>
       </w:r>
       <w:r>
         <w:rPr>
@@ -1808,37 +1630,18 @@
     </w:p>
     <w:p>
       <w:r>
-        <w:t xml:space="preserve">Após a construção do </w:t>
-      </w:r>
-      <w:r>
-        <w:rPr>
-          <w:rStyle w:val="EstrageirasChar"/>
-        </w:rPr>
-        <w:t>website</w:t>
-      </w:r>
-      <w:r>
-        <w:t xml:space="preserve">, foram realizados testes aos links, imagens, áudio, vídeo, formulários, botões, menu responsivo, tema e carrossel de imagens. Os erros identificados foram corrigidos antes da publicação do </w:t>
-      </w:r>
-      <w:r>
-        <w:t>projeto</w:t>
-      </w:r>
-      <w:r>
-        <w:t>. Esta metodologia permitiu desenvolver competências de planeamento, organização, desenvolvimento, teste e resolução de problemas</w:t>
-      </w:r>
-      <w:r>
-        <w:t>.</w:t>
-      </w:r>
-    </w:p>
-    <w:p>
-      <w:pPr>
-        <w:keepNext/>
-        <w:jc w:val="center"/>
-      </w:pPr>
-      <w:r>
         <w:drawing>
-          <wp:inline distT="0" distB="0" distL="0" distR="0" wp14:anchorId="612167DE" wp14:editId="212337BE">
-            <wp:extent cx="6101576" cy="1400175"/>
+          <wp:anchor distT="0" distB="0" distL="114300" distR="114300" simplePos="0" relativeHeight="251658240" behindDoc="0" locked="0" layoutInCell="1" allowOverlap="1" wp14:anchorId="612167DE" wp14:editId="7B8725FB">
+            <wp:simplePos x="0" y="0"/>
+            <wp:positionH relativeFrom="margin">
+              <wp:align>center</wp:align>
+            </wp:positionH>
+            <wp:positionV relativeFrom="paragraph">
+              <wp:posOffset>939475</wp:posOffset>
+            </wp:positionV>
+            <wp:extent cx="6996396" cy="1605516"/>
             <wp:effectExtent l="0" t="0" r="0" b="0"/>
+            <wp:wrapSquare wrapText="bothSides"/>
             <wp:docPr id="1138878352" name="Picture 2"/>
             <wp:cNvGraphicFramePr>
               <a:graphicFrameLocks xmlns:a="http://schemas.openxmlformats.org/drawingml/2006/main" noChangeAspect="1"/>
@@ -1868,7 +1671,7 @@
                   <pic:spPr bwMode="auto">
                     <a:xfrm>
                       <a:off x="0" y="0"/>
-                      <a:ext cx="6115030" cy="1403262"/>
+                      <a:ext cx="6996396" cy="1605516"/>
                     </a:xfrm>
                     <a:prstGeom prst="rect">
                       <a:avLst/>
@@ -1886,8 +1689,29 @@
                 </pic:pic>
               </a:graphicData>
             </a:graphic>
-          </wp:inline>
+          </wp:anchor>
         </w:drawing>
+      </w:r>
+      <w:r>
+        <w:t xml:space="preserve">Após a construção do </w:t>
+      </w:r>
+      <w:r>
+        <w:rPr>
+          <w:rStyle w:val="EstrageirasChar"/>
+        </w:rPr>
+        <w:t>website</w:t>
+      </w:r>
+      <w:r>
+        <w:t xml:space="preserve">, foram realizados testes aos links, imagens, áudio, vídeo, formulários, botões, menu responsivo, tema e carrossel de imagens. Os erros identificados foram corrigidos antes da publicação do </w:t>
+      </w:r>
+      <w:r>
+        <w:t>projeto</w:t>
+      </w:r>
+      <w:r>
+        <w:t>. Esta metodologia permitiu desenvolver competências de planeamento, organização, desenvolvimento, teste e resolução de problemas</w:t>
+      </w:r>
+      <w:r>
+        <w:t>.</w:t>
       </w:r>
     </w:p>
     <w:p>
@@ -1920,8 +1744,13 @@
         <w:t>projeto</w:t>
       </w:r>
       <w:r>
-        <w:t xml:space="preserve"> InfoTech</w:t>
-      </w:r>
+        <w:t xml:space="preserve"> </w:t>
+      </w:r>
+      <w:proofErr w:type="spellStart"/>
+      <w:r>
+        <w:t>InfoTech</w:t>
+      </w:r>
+      <w:proofErr w:type="spellEnd"/>
     </w:p>
     <w:p/>
     <w:p>
@@ -1932,7 +1761,7 @@
           <w:numId w:val="2"/>
         </w:numPr>
       </w:pPr>
-      <w:bookmarkStart w:id="4" w:name="_Toc239531975"/>
+      <w:bookmarkStart w:id="4" w:name="_Toc240048713"/>
       <w:r>
         <w:t>Tipo de Site</w:t>
       </w:r>
@@ -1996,11 +1825,16 @@
         <w:t>software</w:t>
       </w:r>
       <w:r>
-        <w:t>, redes, programação, bases de dados, segurança informática e suporte técnico. Possui páginas interligadas por um menu de navegação: Início, Sobre,</w:t>
+        <w:t xml:space="preserve">, redes, programação, bases de dados, segurança informática e suporte técnico. Possui páginas interligadas por um menu de navegação: Início, </w:t>
+      </w:r>
+      <w:proofErr w:type="gramStart"/>
+      <w:r>
+        <w:t>Sobre,</w:t>
       </w:r>
       <w:r>
         <w:t xml:space="preserve"> Galeria</w:t>
       </w:r>
+      <w:proofErr w:type="gramEnd"/>
       <w:r>
         <w:t xml:space="preserve">, </w:t>
       </w:r>
@@ -2023,9 +1857,9 @@
       <w:r>
         <w:lastRenderedPageBreak/>
         <w:drawing>
-          <wp:inline distT="0" distB="0" distL="0" distR="0" wp14:anchorId="6531919D" wp14:editId="298BF1A7">
-            <wp:extent cx="5641816" cy="4430767"/>
-            <wp:effectExtent l="0" t="0" r="0" b="8255"/>
+          <wp:inline distT="0" distB="0" distL="0" distR="0" wp14:anchorId="6531919D" wp14:editId="440C06A1">
+            <wp:extent cx="5862269" cy="4603898"/>
+            <wp:effectExtent l="0" t="0" r="5715" b="6350"/>
             <wp:docPr id="151889886" name="Picture 6"/>
             <wp:cNvGraphicFramePr>
               <a:graphicFrameLocks xmlns:a="http://schemas.openxmlformats.org/drawingml/2006/main" noChangeAspect="1"/>
@@ -2054,7 +1888,7 @@
                   <pic:spPr bwMode="auto">
                     <a:xfrm>
                       <a:off x="0" y="0"/>
-                      <a:ext cx="5641816" cy="4430767"/>
+                      <a:ext cx="5908608" cy="4640290"/>
                     </a:xfrm>
                     <a:prstGeom prst="rect">
                       <a:avLst/>
@@ -2095,8 +1929,13 @@
         <w:fldChar w:fldCharType="end"/>
       </w:r>
       <w:r>
-        <w:t>: Página inicial do website InfoTech</w:t>
-      </w:r>
+        <w:t xml:space="preserve">: Página inicial do website </w:t>
+      </w:r>
+      <w:proofErr w:type="spellStart"/>
+      <w:r>
+        <w:t>InfoTech</w:t>
+      </w:r>
+      <w:proofErr w:type="spellEnd"/>
     </w:p>
     <w:p/>
     <w:p>
@@ -2107,7 +1946,7 @@
           <w:numId w:val="2"/>
         </w:numPr>
       </w:pPr>
-      <w:bookmarkStart w:id="5" w:name="_Toc239531976"/>
+      <w:bookmarkStart w:id="5" w:name="_Toc240048714"/>
       <w:r>
         <w:t>Arquitetura</w:t>
       </w:r>
@@ -2121,10 +1960,7 @@
         <w:t xml:space="preserve">A </w:t>
       </w:r>
       <w:r>
-        <w:t>arquitetura</w:t>
-      </w:r>
-      <w:r>
-        <w:t xml:space="preserve"> da informação do </w:t>
+        <w:t xml:space="preserve">arquitetura da informação do </w:t>
       </w:r>
       <w:r>
         <w:rPr>
@@ -2135,40 +1971,32 @@
       <w:r>
         <w:t xml:space="preserve"> </w:t>
       </w:r>
+      <w:proofErr w:type="spellStart"/>
       <w:r>
         <w:rPr>
           <w:rStyle w:val="EstrageirasChar"/>
         </w:rPr>
         <w:t>InfoTech</w:t>
       </w:r>
+      <w:proofErr w:type="spellEnd"/>
       <w:r>
         <w:t xml:space="preserve"> foi definida para organizar os conteúdos de forma lógica e facilitar a navegação dos utilizadores. Os conteúdos foram distribuídos por diferentes páginas, todas interligadas por um menu de navegação.</w:t>
       </w:r>
     </w:p>
     <w:p>
       <w:r>
-        <w:t xml:space="preserve">A página Início apresenta uma introdução ao </w:t>
-      </w:r>
-      <w:r>
-        <w:t>projeto</w:t>
-      </w:r>
-      <w:r>
-        <w:t xml:space="preserve"> e áreas em destaque. A página Sobre contém informações sobre o </w:t>
-      </w:r>
+        <w:t xml:space="preserve">A página Início apresenta uma introdução ao projeto e áreas em destaque. A página Sobre contém informações sobre o </w:t>
+      </w:r>
+      <w:proofErr w:type="spellStart"/>
       <w:r>
         <w:rPr>
           <w:rStyle w:val="EstrageirasChar"/>
         </w:rPr>
         <w:t>InfoTech</w:t>
       </w:r>
-      <w:r>
-        <w:t xml:space="preserve">, os seus </w:t>
-      </w:r>
-      <w:r>
-        <w:t>objetivos</w:t>
-      </w:r>
-      <w:r>
-        <w:t xml:space="preserve">, público-alvo e tecnologias utilizadas. A página Áreas apresenta conteúdos sobre </w:t>
+      <w:proofErr w:type="spellEnd"/>
+      <w:r>
+        <w:t xml:space="preserve">, os seus objetivos, público-alvo e tecnologias utilizadas. A página Áreas apresenta conteúdos sobre </w:t>
       </w:r>
       <w:r>
         <w:rPr>
@@ -2223,9 +2051,9 @@
       <w:r>
         <w:lastRenderedPageBreak/>
         <w:drawing>
-          <wp:inline distT="0" distB="0" distL="0" distR="0" wp14:anchorId="0C121C72" wp14:editId="012059BF">
-            <wp:extent cx="5534025" cy="4068688"/>
-            <wp:effectExtent l="0" t="0" r="0" b="8255"/>
+          <wp:inline distT="0" distB="0" distL="0" distR="0" wp14:anchorId="0C121C72" wp14:editId="5E15AE54">
+            <wp:extent cx="5900444" cy="4338084"/>
+            <wp:effectExtent l="0" t="0" r="5080" b="5715"/>
             <wp:docPr id="1218038662" name="Picture 8"/>
             <wp:cNvGraphicFramePr>
               <a:graphicFrameLocks xmlns:a="http://schemas.openxmlformats.org/drawingml/2006/main" noChangeAspect="1"/>
@@ -2255,7 +2083,7 @@
                   <pic:spPr bwMode="auto">
                     <a:xfrm>
                       <a:off x="0" y="0"/>
-                      <a:ext cx="5541438" cy="4074138"/>
+                      <a:ext cx="5918647" cy="4351467"/>
                     </a:xfrm>
                     <a:prstGeom prst="rect">
                       <a:avLst/>
@@ -2307,8 +2135,13 @@
         <w:t>Arquitetura</w:t>
       </w:r>
       <w:r>
-        <w:t xml:space="preserve"> da informação do website InfoTech</w:t>
-      </w:r>
+        <w:t xml:space="preserve"> da informação do website </w:t>
+      </w:r>
+      <w:proofErr w:type="spellStart"/>
+      <w:r>
+        <w:t>InfoTech</w:t>
+      </w:r>
+      <w:proofErr w:type="spellEnd"/>
     </w:p>
     <w:p/>
     <w:p>
@@ -2319,7 +2152,7 @@
           <w:numId w:val="2"/>
         </w:numPr>
       </w:pPr>
-      <w:bookmarkStart w:id="6" w:name="_Toc239531977"/>
+      <w:bookmarkStart w:id="6" w:name="_Toc240048715"/>
       <w:r>
         <w:rPr>
           <w:rStyle w:val="EstrageirasChar"/>
@@ -2329,15 +2162,18 @@
       <w:r>
         <w:t xml:space="preserve"> da </w:t>
       </w:r>
+      <w:proofErr w:type="spellStart"/>
       <w:r>
         <w:rPr>
           <w:rStyle w:val="EstrageirasChar"/>
         </w:rPr>
         <w:t>Home</w:t>
       </w:r>
+      <w:proofErr w:type="spellEnd"/>
       <w:r>
         <w:t xml:space="preserve"> </w:t>
       </w:r>
+      <w:proofErr w:type="spellStart"/>
       <w:r>
         <w:rPr>
           <w:rStyle w:val="EstrageirasChar"/>
@@ -2345,6 +2181,7 @@
         <w:t>Page</w:t>
       </w:r>
       <w:bookmarkEnd w:id="6"/>
+      <w:proofErr w:type="spellEnd"/>
     </w:p>
     <w:p>
       <w:r>
@@ -2359,40 +2196,46 @@
       <w:r>
         <w:t xml:space="preserve"> da </w:t>
       </w:r>
-      <w:r>
-        <w:rPr>
-          <w:rStyle w:val="EstrageirasChar"/>
-        </w:rPr>
-        <w:t>Home Page</w:t>
-      </w:r>
-      <w:r>
-        <w:t xml:space="preserve"> foi desenvolvido de forma simples, organizada e intuitiva. Na parte superior, foi criado um cabeçalho com o nome do </w:t>
-      </w:r>
-      <w:r>
-        <w:t>projeto</w:t>
-      </w:r>
-      <w:r>
+      <w:proofErr w:type="spellStart"/>
+      <w:r>
+        <w:rPr>
+          <w:rStyle w:val="EstrageirasChar"/>
+        </w:rPr>
+        <w:t>Home</w:t>
+      </w:r>
+      <w:proofErr w:type="spellEnd"/>
+      <w:r>
+        <w:rPr>
+          <w:rStyle w:val="EstrageirasChar"/>
+        </w:rPr>
         <w:t xml:space="preserve"> </w:t>
       </w:r>
+      <w:proofErr w:type="spellStart"/>
+      <w:r>
+        <w:rPr>
+          <w:rStyle w:val="EstrageirasChar"/>
+        </w:rPr>
+        <w:t>Page</w:t>
+      </w:r>
+      <w:proofErr w:type="spellEnd"/>
+      <w:r>
+        <w:t xml:space="preserve"> foi desenvolvido de forma simples, organizada e intuitiva. Na parte superior, foi criado um cabeçalho com o nome do projeto </w:t>
+      </w:r>
+      <w:proofErr w:type="spellStart"/>
       <w:r>
         <w:rPr>
           <w:rStyle w:val="EstrageirasChar"/>
         </w:rPr>
         <w:t>InfoTech</w:t>
       </w:r>
+      <w:proofErr w:type="spellEnd"/>
       <w:r>
         <w:t>, ícone de informática, menu de navegação e botão para alternar entre os temas claro e escuro.</w:t>
       </w:r>
     </w:p>
     <w:p>
       <w:r>
-        <w:t xml:space="preserve">A área principal apresenta um título, uma breve descrição do </w:t>
-      </w:r>
-      <w:r>
-        <w:t>projeto</w:t>
-      </w:r>
-      <w:r>
-        <w:t xml:space="preserve"> e botões de acesso às áreas da informática e à página de contacto. Também foram incluídos cartões com áreas em destaque, como </w:t>
+        <w:t xml:space="preserve">A área principal apresenta um título, uma breve descrição do projeto e botões de acesso às áreas da informática e à página de contacto. Também foram incluídos cartões com áreas em destaque, como </w:t>
       </w:r>
       <w:r>
         <w:rPr>
@@ -2444,9 +2287,9 @@
       <w:r>
         <w:lastRenderedPageBreak/>
         <w:drawing>
-          <wp:inline distT="0" distB="0" distL="0" distR="0" wp14:anchorId="7315E762" wp14:editId="3A3570B1">
-            <wp:extent cx="5332021" cy="4188714"/>
-            <wp:effectExtent l="0" t="0" r="2540" b="2540"/>
+          <wp:inline distT="0" distB="0" distL="0" distR="0" wp14:anchorId="7315E762" wp14:editId="754394A9">
+            <wp:extent cx="5332021" cy="4187471"/>
+            <wp:effectExtent l="0" t="0" r="2540" b="3810"/>
             <wp:docPr id="1256484974" name="Picture 9"/>
             <wp:cNvGraphicFramePr>
               <a:graphicFrameLocks xmlns:a="http://schemas.openxmlformats.org/drawingml/2006/main" noChangeAspect="1"/>
@@ -2455,7 +2298,7 @@
               <a:graphicData uri="http://schemas.openxmlformats.org/drawingml/2006/picture">
                 <pic:pic xmlns:pic="http://schemas.openxmlformats.org/drawingml/2006/picture">
                   <pic:nvPicPr>
-                    <pic:cNvPr id="0" name="Picture 32"/>
+                    <pic:cNvPr id="1256484974" name="Picture 9"/>
                     <pic:cNvPicPr>
                       <a:picLocks noChangeAspect="1" noChangeArrowheads="1"/>
                     </pic:cNvPicPr>
@@ -2468,7 +2311,6 @@
                         </a:ext>
                       </a:extLst>
                     </a:blip>
-                    <a:srcRect/>
                     <a:stretch>
                       <a:fillRect/>
                     </a:stretch>
@@ -2476,7 +2318,7 @@
                   <pic:spPr bwMode="auto">
                     <a:xfrm>
                       <a:off x="0" y="0"/>
-                      <a:ext cx="5332021" cy="4188714"/>
+                      <a:ext cx="5332021" cy="4187471"/>
                     </a:xfrm>
                     <a:prstGeom prst="rect">
                       <a:avLst/>
@@ -2517,8 +2359,37 @@
         <w:fldChar w:fldCharType="end"/>
       </w:r>
       <w:r>
-        <w:t>: Wireframe da Home Page do website InfoTech</w:t>
-      </w:r>
+        <w:t xml:space="preserve">: </w:t>
+      </w:r>
+      <w:proofErr w:type="spellStart"/>
+      <w:r>
+        <w:t>Wireframe</w:t>
+      </w:r>
+      <w:proofErr w:type="spellEnd"/>
+      <w:r>
+        <w:t xml:space="preserve"> da </w:t>
+      </w:r>
+      <w:proofErr w:type="spellStart"/>
+      <w:r>
+        <w:t>Home</w:t>
+      </w:r>
+      <w:proofErr w:type="spellEnd"/>
+      <w:r>
+        <w:t xml:space="preserve"> </w:t>
+      </w:r>
+      <w:proofErr w:type="spellStart"/>
+      <w:r>
+        <w:t>Page</w:t>
+      </w:r>
+      <w:proofErr w:type="spellEnd"/>
+      <w:r>
+        <w:t xml:space="preserve"> do website </w:t>
+      </w:r>
+      <w:proofErr w:type="spellStart"/>
+      <w:r>
+        <w:t>InfoTech</w:t>
+      </w:r>
+      <w:proofErr w:type="spellEnd"/>
     </w:p>
     <w:p/>
     <w:p>
@@ -2529,7 +2400,7 @@
           <w:numId w:val="2"/>
         </w:numPr>
       </w:pPr>
-      <w:bookmarkStart w:id="7" w:name="_Toc239531978"/>
+      <w:bookmarkStart w:id="7" w:name="_Toc240048716"/>
       <w:r>
         <w:t>Diagramação das Páginas</w:t>
       </w:r>
@@ -2546,8 +2417,16 @@
         <w:rPr>
           <w:rStyle w:val="EstrageirasChar"/>
         </w:rPr>
-        <w:t>website InfoTech</w:t>
-      </w:r>
+        <w:t xml:space="preserve">website </w:t>
+      </w:r>
+      <w:proofErr w:type="spellStart"/>
+      <w:r>
+        <w:rPr>
+          <w:rStyle w:val="EstrageirasChar"/>
+        </w:rPr>
+        <w:t>InfoTech</w:t>
+      </w:r>
+      <w:proofErr w:type="spellEnd"/>
       <w:r>
         <w:t xml:space="preserve"> foi organizada para manter uma estrutura visual uniforme. Foram utilizados elementos comuns, como cabeçalho, menu de navegação, área de conteúdos, cartões informativos, botões e rodapé.</w:t>
       </w:r>
@@ -2578,7 +2457,7 @@
       </w:pPr>
       <w:r>
         <w:drawing>
-          <wp:inline distT="0" distB="0" distL="0" distR="0" wp14:anchorId="6A3F3C18" wp14:editId="6C48E7E0">
+          <wp:inline distT="0" distB="0" distL="0" distR="0" wp14:anchorId="6A3F3C18" wp14:editId="673C36B0">
             <wp:extent cx="5926016" cy="344385"/>
             <wp:effectExtent l="0" t="0" r="0" b="0"/>
             <wp:docPr id="1940681245" name="Picture 6"/>
@@ -2610,7 +2489,7 @@
                   <pic:spPr bwMode="auto">
                     <a:xfrm>
                       <a:off x="0" y="0"/>
-                      <a:ext cx="6132635" cy="356392"/>
+                      <a:ext cx="5926016" cy="344385"/>
                     </a:xfrm>
                     <a:prstGeom prst="rect">
                       <a:avLst/>
@@ -2656,9 +2535,659 @@
         <w:fldChar w:fldCharType="end"/>
       </w:r>
       <w:r>
-        <w:t>: Menu nas páginas do website InfoTech</w:t>
-      </w:r>
-    </w:p>
+        <w:t xml:space="preserve">: Menu nas páginas do website </w:t>
+      </w:r>
+      <w:proofErr w:type="spellStart"/>
+      <w:r>
+        <w:t>InfoTech</w:t>
+      </w:r>
+      <w:proofErr w:type="spellEnd"/>
+    </w:p>
+    <w:p>
+      <w:pPr>
+        <w:pStyle w:val="Heading3"/>
+        <w:numPr>
+          <w:ilvl w:val="2"/>
+          <w:numId w:val="2"/>
+        </w:numPr>
+      </w:pPr>
+      <w:r>
+        <w:lastRenderedPageBreak/>
+        <w:t>Paleta de Cores</w:t>
+      </w:r>
+    </w:p>
+    <w:p>
+      <w:r>
+        <w:t xml:space="preserve">A paleta de cores do website </w:t>
+      </w:r>
+      <w:proofErr w:type="spellStart"/>
+      <w:r>
+        <w:t>InfoTech</w:t>
+      </w:r>
+      <w:proofErr w:type="spellEnd"/>
+      <w:r>
+        <w:t xml:space="preserve"> foi definida para garantir boa legibilidade, contraste adequado e consistência visual em todas as páginas. Foram utilizadas cores escuras para o fundo, cores claras para o texto e uma cor de destaque para botões, links e elementos </w:t>
+      </w:r>
+      <w:r>
+        <w:t>interativos</w:t>
+      </w:r>
+      <w:r>
+        <w:t>.</w:t>
+      </w:r>
+    </w:p>
+    <w:p>
+      <w:pPr>
+        <w:pStyle w:val="Caption"/>
+        <w:keepNext/>
+      </w:pPr>
+      <w:r>
+        <w:t xml:space="preserve">Tabela </w:t>
+      </w:r>
+      <w:r>
+        <w:fldChar w:fldCharType="begin"/>
+      </w:r>
+      <w:r>
+        <w:instrText xml:space="preserve"> SEQ Tabela \* ARABIC </w:instrText>
+      </w:r>
+      <w:r>
+        <w:fldChar w:fldCharType="separate"/>
+      </w:r>
+      <w:r>
+        <w:rPr>
+          <w:noProof/>
+        </w:rPr>
+        <w:t>1</w:t>
+      </w:r>
+      <w:r>
+        <w:fldChar w:fldCharType="end"/>
+      </w:r>
+      <w:r>
+        <w:t>: Paleta de Cores</w:t>
+      </w:r>
+    </w:p>
+    <w:tbl>
+      <w:tblPr>
+        <w:tblStyle w:val="ListTable3"/>
+        <w:tblW w:w="5000" w:type="pct"/>
+        <w:tblLook w:val="04A0" w:firstRow="1" w:lastRow="0" w:firstColumn="1" w:lastColumn="0" w:noHBand="0" w:noVBand="1"/>
+      </w:tblPr>
+      <w:tblGrid>
+        <w:gridCol w:w="2874"/>
+        <w:gridCol w:w="2700"/>
+        <w:gridCol w:w="1532"/>
+        <w:gridCol w:w="2244"/>
+      </w:tblGrid>
+      <w:tr>
+        <w:trPr>
+          <w:cnfStyle w:val="100000000000" w:firstRow="1" w:lastRow="0" w:firstColumn="0" w:lastColumn="0" w:oddVBand="0" w:evenVBand="0" w:oddHBand="0" w:evenHBand="0" w:firstRowFirstColumn="0" w:firstRowLastColumn="0" w:lastRowFirstColumn="0" w:lastRowLastColumn="0"/>
+        </w:trPr>
+        <w:tc>
+          <w:tcPr>
+            <w:cnfStyle w:val="001000000100" w:firstRow="0" w:lastRow="0" w:firstColumn="1" w:lastColumn="0" w:oddVBand="0" w:evenVBand="0" w:oddHBand="0" w:evenHBand="0" w:firstRowFirstColumn="1" w:firstRowLastColumn="0" w:lastRowFirstColumn="0" w:lastRowLastColumn="0"/>
+            <w:tcW w:w="1537" w:type="pct"/>
+            <w:hideMark/>
+          </w:tcPr>
+          <w:p>
+            <w:pPr>
+              <w:spacing w:after="160" w:line="278" w:lineRule="auto"/>
+            </w:pPr>
+            <w:r>
+              <w:t>Função</w:t>
+            </w:r>
+          </w:p>
+        </w:tc>
+        <w:tc>
+          <w:tcPr>
+            <w:tcW w:w="1444" w:type="pct"/>
+            <w:hideMark/>
+          </w:tcPr>
+          <w:p>
+            <w:pPr>
+              <w:spacing w:after="160" w:line="278" w:lineRule="auto"/>
+              <w:cnfStyle w:val="100000000000" w:firstRow="1" w:lastRow="0" w:firstColumn="0" w:lastColumn="0" w:oddVBand="0" w:evenVBand="0" w:oddHBand="0" w:evenHBand="0" w:firstRowFirstColumn="0" w:firstRowLastColumn="0" w:lastRowFirstColumn="0" w:lastRowLastColumn="0"/>
+            </w:pPr>
+            <w:r>
+              <w:t>Cor</w:t>
+            </w:r>
+          </w:p>
+        </w:tc>
+        <w:tc>
+          <w:tcPr>
+            <w:tcW w:w="819" w:type="pct"/>
+            <w:hideMark/>
+          </w:tcPr>
+          <w:p>
+            <w:pPr>
+              <w:spacing w:after="160" w:line="278" w:lineRule="auto"/>
+              <w:cnfStyle w:val="100000000000" w:firstRow="1" w:lastRow="0" w:firstColumn="0" w:lastColumn="0" w:oddVBand="0" w:evenVBand="0" w:oddHBand="0" w:evenHBand="0" w:firstRowFirstColumn="0" w:firstRowLastColumn="0" w:lastRowFirstColumn="0" w:lastRowLastColumn="0"/>
+            </w:pPr>
+            <w:r>
+              <w:t xml:space="preserve">Código </w:t>
+            </w:r>
+            <w:proofErr w:type="spellStart"/>
+            <w:r>
+              <w:t>Hex</w:t>
+            </w:r>
+            <w:proofErr w:type="spellEnd"/>
+          </w:p>
+        </w:tc>
+        <w:tc>
+          <w:tcPr>
+            <w:tcW w:w="1201" w:type="pct"/>
+          </w:tcPr>
+          <w:p>
+            <w:pPr>
+              <w:jc w:val="center"/>
+              <w:cnfStyle w:val="100000000000" w:firstRow="1" w:lastRow="0" w:firstColumn="0" w:lastColumn="0" w:oddVBand="0" w:evenVBand="0" w:oddHBand="0" w:evenHBand="0" w:firstRowFirstColumn="0" w:firstRowLastColumn="0" w:lastRowFirstColumn="0" w:lastRowLastColumn="0"/>
+              <w:rPr>
+                <w:b w:val="0"/>
+                <w:bCs w:val="0"/>
+              </w:rPr>
+            </w:pPr>
+            <w:r>
+              <w:rPr>
+                <w:b w:val="0"/>
+                <w:bCs w:val="0"/>
+              </w:rPr>
+              <w:t>Ilustração</w:t>
+            </w:r>
+          </w:p>
+        </w:tc>
+      </w:tr>
+      <w:tr>
+        <w:trPr>
+          <w:cnfStyle w:val="000000100000" w:firstRow="0" w:lastRow="0" w:firstColumn="0" w:lastColumn="0" w:oddVBand="0" w:evenVBand="0" w:oddHBand="1" w:evenHBand="0" w:firstRowFirstColumn="0" w:firstRowLastColumn="0" w:lastRowFirstColumn="0" w:lastRowLastColumn="0"/>
+        </w:trPr>
+        <w:tc>
+          <w:tcPr>
+            <w:cnfStyle w:val="001000000000" w:firstRow="0" w:lastRow="0" w:firstColumn="1" w:lastColumn="0" w:oddVBand="0" w:evenVBand="0" w:oddHBand="0" w:evenHBand="0" w:firstRowFirstColumn="0" w:firstRowLastColumn="0" w:lastRowFirstColumn="0" w:lastRowLastColumn="0"/>
+            <w:tcW w:w="1537" w:type="pct"/>
+            <w:hideMark/>
+          </w:tcPr>
+          <w:p>
+            <w:pPr>
+              <w:spacing w:after="160" w:line="278" w:lineRule="auto"/>
+            </w:pPr>
+            <w:r>
+              <w:t>Fundo principal</w:t>
+            </w:r>
+          </w:p>
+        </w:tc>
+        <w:tc>
+          <w:tcPr>
+            <w:tcW w:w="1444" w:type="pct"/>
+            <w:hideMark/>
+          </w:tcPr>
+          <w:p>
+            <w:pPr>
+              <w:spacing w:after="160" w:line="278" w:lineRule="auto"/>
+              <w:cnfStyle w:val="000000100000" w:firstRow="0" w:lastRow="0" w:firstColumn="0" w:lastColumn="0" w:oddVBand="0" w:evenVBand="0" w:oddHBand="1" w:evenHBand="0" w:firstRowFirstColumn="0" w:firstRowLastColumn="0" w:lastRowFirstColumn="0" w:lastRowLastColumn="0"/>
+              <w:rPr>
+                <w:b/>
+                <w:bCs/>
+              </w:rPr>
+            </w:pPr>
+            <w:r>
+              <w:rPr>
+                <w:b/>
+                <w:bCs/>
+              </w:rPr>
+              <w:t>Azul muito escuro</w:t>
+            </w:r>
+          </w:p>
+        </w:tc>
+        <w:tc>
+          <w:tcPr>
+            <w:tcW w:w="819" w:type="pct"/>
+            <w:hideMark/>
+          </w:tcPr>
+          <w:p>
+            <w:pPr>
+              <w:spacing w:after="160" w:line="278" w:lineRule="auto"/>
+              <w:cnfStyle w:val="000000100000" w:firstRow="0" w:lastRow="0" w:firstColumn="0" w:lastColumn="0" w:oddVBand="0" w:evenVBand="0" w:oddHBand="1" w:evenHBand="0" w:firstRowFirstColumn="0" w:firstRowLastColumn="0" w:lastRowFirstColumn="0" w:lastRowLastColumn="0"/>
+              <w:rPr>
+                <w:b/>
+                <w:bCs/>
+              </w:rPr>
+            </w:pPr>
+            <w:r>
+              <w:rPr>
+                <w:b/>
+                <w:bCs/>
+              </w:rPr>
+              <w:t>#07111f</w:t>
+            </w:r>
+          </w:p>
+        </w:tc>
+        <w:tc>
+          <w:tcPr>
+            <w:tcW w:w="1201" w:type="pct"/>
+            <w:shd w:val="clear" w:color="auto" w:fill="07111F"/>
+          </w:tcPr>
+          <w:p>
+            <w:pPr>
+              <w:jc w:val="center"/>
+              <w:cnfStyle w:val="000000100000" w:firstRow="0" w:lastRow="0" w:firstColumn="0" w:lastColumn="0" w:oddVBand="0" w:evenVBand="0" w:oddHBand="1" w:evenHBand="0" w:firstRowFirstColumn="0" w:firstRowLastColumn="0" w:lastRowFirstColumn="0" w:lastRowLastColumn="0"/>
+              <w:rPr>
+                <w:b/>
+                <w:bCs/>
+              </w:rPr>
+            </w:pPr>
+          </w:p>
+        </w:tc>
+      </w:tr>
+      <w:tr>
+        <w:tc>
+          <w:tcPr>
+            <w:cnfStyle w:val="001000000000" w:firstRow="0" w:lastRow="0" w:firstColumn="1" w:lastColumn="0" w:oddVBand="0" w:evenVBand="0" w:oddHBand="0" w:evenHBand="0" w:firstRowFirstColumn="0" w:firstRowLastColumn="0" w:lastRowFirstColumn="0" w:lastRowLastColumn="0"/>
+            <w:tcW w:w="1537" w:type="pct"/>
+            <w:hideMark/>
+          </w:tcPr>
+          <w:p>
+            <w:pPr>
+              <w:spacing w:after="160" w:line="278" w:lineRule="auto"/>
+            </w:pPr>
+            <w:r>
+              <w:t>Superfície / cartões</w:t>
+            </w:r>
+          </w:p>
+        </w:tc>
+        <w:tc>
+          <w:tcPr>
+            <w:tcW w:w="1444" w:type="pct"/>
+            <w:hideMark/>
+          </w:tcPr>
+          <w:p>
+            <w:pPr>
+              <w:spacing w:after="160" w:line="278" w:lineRule="auto"/>
+              <w:cnfStyle w:val="000000000000" w:firstRow="0" w:lastRow="0" w:firstColumn="0" w:lastColumn="0" w:oddVBand="0" w:evenVBand="0" w:oddHBand="0" w:evenHBand="0" w:firstRowFirstColumn="0" w:firstRowLastColumn="0" w:lastRowFirstColumn="0" w:lastRowLastColumn="0"/>
+              <w:rPr>
+                <w:b/>
+                <w:bCs/>
+              </w:rPr>
+            </w:pPr>
+            <w:r>
+              <w:rPr>
+                <w:b/>
+                <w:bCs/>
+              </w:rPr>
+              <w:t>Cinza-azulado escuro</w:t>
+            </w:r>
+          </w:p>
+        </w:tc>
+        <w:tc>
+          <w:tcPr>
+            <w:tcW w:w="819" w:type="pct"/>
+            <w:hideMark/>
+          </w:tcPr>
+          <w:p>
+            <w:pPr>
+              <w:spacing w:after="160" w:line="278" w:lineRule="auto"/>
+              <w:cnfStyle w:val="000000000000" w:firstRow="0" w:lastRow="0" w:firstColumn="0" w:lastColumn="0" w:oddVBand="0" w:evenVBand="0" w:oddHBand="0" w:evenHBand="0" w:firstRowFirstColumn="0" w:firstRowLastColumn="0" w:lastRowFirstColumn="0" w:lastRowLastColumn="0"/>
+              <w:rPr>
+                <w:b/>
+                <w:bCs/>
+              </w:rPr>
+            </w:pPr>
+            <w:r>
+              <w:rPr>
+                <w:b/>
+                <w:bCs/>
+              </w:rPr>
+              <w:t>#111827</w:t>
+            </w:r>
+          </w:p>
+        </w:tc>
+        <w:tc>
+          <w:tcPr>
+            <w:tcW w:w="1201" w:type="pct"/>
+            <w:shd w:val="clear" w:color="auto" w:fill="111827"/>
+          </w:tcPr>
+          <w:p>
+            <w:pPr>
+              <w:jc w:val="center"/>
+              <w:cnfStyle w:val="000000000000" w:firstRow="0" w:lastRow="0" w:firstColumn="0" w:lastColumn="0" w:oddVBand="0" w:evenVBand="0" w:oddHBand="0" w:evenHBand="0" w:firstRowFirstColumn="0" w:firstRowLastColumn="0" w:lastRowFirstColumn="0" w:lastRowLastColumn="0"/>
+              <w:rPr>
+                <w:b/>
+                <w:bCs/>
+              </w:rPr>
+            </w:pPr>
+          </w:p>
+        </w:tc>
+      </w:tr>
+      <w:tr>
+        <w:trPr>
+          <w:cnfStyle w:val="000000100000" w:firstRow="0" w:lastRow="0" w:firstColumn="0" w:lastColumn="0" w:oddVBand="0" w:evenVBand="0" w:oddHBand="1" w:evenHBand="0" w:firstRowFirstColumn="0" w:firstRowLastColumn="0" w:lastRowFirstColumn="0" w:lastRowLastColumn="0"/>
+        </w:trPr>
+        <w:tc>
+          <w:tcPr>
+            <w:cnfStyle w:val="001000000000" w:firstRow="0" w:lastRow="0" w:firstColumn="1" w:lastColumn="0" w:oddVBand="0" w:evenVBand="0" w:oddHBand="0" w:evenHBand="0" w:firstRowFirstColumn="0" w:firstRowLastColumn="0" w:lastRowFirstColumn="0" w:lastRowLastColumn="0"/>
+            <w:tcW w:w="1537" w:type="pct"/>
+            <w:hideMark/>
+          </w:tcPr>
+          <w:p>
+            <w:pPr>
+              <w:spacing w:after="160" w:line="278" w:lineRule="auto"/>
+            </w:pPr>
+            <w:r>
+              <w:t>Texto principal</w:t>
+            </w:r>
+          </w:p>
+        </w:tc>
+        <w:tc>
+          <w:tcPr>
+            <w:tcW w:w="1444" w:type="pct"/>
+            <w:hideMark/>
+          </w:tcPr>
+          <w:p>
+            <w:pPr>
+              <w:spacing w:after="160" w:line="278" w:lineRule="auto"/>
+              <w:cnfStyle w:val="000000100000" w:firstRow="0" w:lastRow="0" w:firstColumn="0" w:lastColumn="0" w:oddVBand="0" w:evenVBand="0" w:oddHBand="1" w:evenHBand="0" w:firstRowFirstColumn="0" w:firstRowLastColumn="0" w:lastRowFirstColumn="0" w:lastRowLastColumn="0"/>
+              <w:rPr>
+                <w:b/>
+                <w:bCs/>
+              </w:rPr>
+            </w:pPr>
+            <w:r>
+              <w:rPr>
+                <w:b/>
+                <w:bCs/>
+              </w:rPr>
+              <w:t>Branco suave</w:t>
+            </w:r>
+          </w:p>
+        </w:tc>
+        <w:tc>
+          <w:tcPr>
+            <w:tcW w:w="819" w:type="pct"/>
+            <w:hideMark/>
+          </w:tcPr>
+          <w:p>
+            <w:pPr>
+              <w:spacing w:after="160" w:line="278" w:lineRule="auto"/>
+              <w:cnfStyle w:val="000000100000" w:firstRow="0" w:lastRow="0" w:firstColumn="0" w:lastColumn="0" w:oddVBand="0" w:evenVBand="0" w:oddHBand="1" w:evenHBand="0" w:firstRowFirstColumn="0" w:firstRowLastColumn="0" w:lastRowFirstColumn="0" w:lastRowLastColumn="0"/>
+              <w:rPr>
+                <w:b/>
+                <w:bCs/>
+              </w:rPr>
+            </w:pPr>
+            <w:r>
+              <w:rPr>
+                <w:b/>
+                <w:bCs/>
+              </w:rPr>
+              <w:t>#f8fafc</w:t>
+            </w:r>
+          </w:p>
+        </w:tc>
+        <w:tc>
+          <w:tcPr>
+            <w:tcW w:w="1201" w:type="pct"/>
+            <w:shd w:val="clear" w:color="auto" w:fill="F8FAFC"/>
+          </w:tcPr>
+          <w:p>
+            <w:pPr>
+              <w:jc w:val="center"/>
+              <w:cnfStyle w:val="000000100000" w:firstRow="0" w:lastRow="0" w:firstColumn="0" w:lastColumn="0" w:oddVBand="0" w:evenVBand="0" w:oddHBand="1" w:evenHBand="0" w:firstRowFirstColumn="0" w:firstRowLastColumn="0" w:lastRowFirstColumn="0" w:lastRowLastColumn="0"/>
+              <w:rPr>
+                <w:b/>
+                <w:bCs/>
+              </w:rPr>
+            </w:pPr>
+          </w:p>
+        </w:tc>
+      </w:tr>
+      <w:tr>
+        <w:tc>
+          <w:tcPr>
+            <w:cnfStyle w:val="001000000000" w:firstRow="0" w:lastRow="0" w:firstColumn="1" w:lastColumn="0" w:oddVBand="0" w:evenVBand="0" w:oddHBand="0" w:evenHBand="0" w:firstRowFirstColumn="0" w:firstRowLastColumn="0" w:lastRowFirstColumn="0" w:lastRowLastColumn="0"/>
+            <w:tcW w:w="1537" w:type="pct"/>
+            <w:hideMark/>
+          </w:tcPr>
+          <w:p>
+            <w:pPr>
+              <w:spacing w:after="160" w:line="278" w:lineRule="auto"/>
+            </w:pPr>
+            <w:r>
+              <w:t>Destaque (botões, links)</w:t>
+            </w:r>
+          </w:p>
+        </w:tc>
+        <w:tc>
+          <w:tcPr>
+            <w:tcW w:w="1444" w:type="pct"/>
+            <w:hideMark/>
+          </w:tcPr>
+          <w:p>
+            <w:pPr>
+              <w:spacing w:after="160" w:line="278" w:lineRule="auto"/>
+              <w:cnfStyle w:val="000000000000" w:firstRow="0" w:lastRow="0" w:firstColumn="0" w:lastColumn="0" w:oddVBand="0" w:evenVBand="0" w:oddHBand="0" w:evenHBand="0" w:firstRowFirstColumn="0" w:firstRowLastColumn="0" w:lastRowFirstColumn="0" w:lastRowLastColumn="0"/>
+              <w:rPr>
+                <w:b/>
+                <w:bCs/>
+              </w:rPr>
+            </w:pPr>
+            <w:r>
+              <w:rPr>
+                <w:b/>
+                <w:bCs/>
+              </w:rPr>
+              <w:t>Azul vibrante</w:t>
+            </w:r>
+          </w:p>
+        </w:tc>
+        <w:tc>
+          <w:tcPr>
+            <w:tcW w:w="819" w:type="pct"/>
+            <w:hideMark/>
+          </w:tcPr>
+          <w:p>
+            <w:pPr>
+              <w:spacing w:after="160" w:line="278" w:lineRule="auto"/>
+              <w:cnfStyle w:val="000000000000" w:firstRow="0" w:lastRow="0" w:firstColumn="0" w:lastColumn="0" w:oddVBand="0" w:evenVBand="0" w:oddHBand="0" w:evenHBand="0" w:firstRowFirstColumn="0" w:firstRowLastColumn="0" w:lastRowFirstColumn="0" w:lastRowLastColumn="0"/>
+              <w:rPr>
+                <w:b/>
+                <w:bCs/>
+              </w:rPr>
+            </w:pPr>
+            <w:r>
+              <w:rPr>
+                <w:b/>
+                <w:bCs/>
+              </w:rPr>
+              <w:t>#3b82f6</w:t>
+            </w:r>
+          </w:p>
+        </w:tc>
+        <w:tc>
+          <w:tcPr>
+            <w:tcW w:w="1201" w:type="pct"/>
+            <w:shd w:val="clear" w:color="auto" w:fill="3B82F6"/>
+          </w:tcPr>
+          <w:p>
+            <w:pPr>
+              <w:jc w:val="center"/>
+              <w:cnfStyle w:val="000000000000" w:firstRow="0" w:lastRow="0" w:firstColumn="0" w:lastColumn="0" w:oddVBand="0" w:evenVBand="0" w:oddHBand="0" w:evenHBand="0" w:firstRowFirstColumn="0" w:firstRowLastColumn="0" w:lastRowFirstColumn="0" w:lastRowLastColumn="0"/>
+              <w:rPr>
+                <w:b/>
+                <w:bCs/>
+              </w:rPr>
+            </w:pPr>
+          </w:p>
+        </w:tc>
+      </w:tr>
+      <w:tr>
+        <w:trPr>
+          <w:cnfStyle w:val="000000100000" w:firstRow="0" w:lastRow="0" w:firstColumn="0" w:lastColumn="0" w:oddVBand="0" w:evenVBand="0" w:oddHBand="1" w:evenHBand="0" w:firstRowFirstColumn="0" w:firstRowLastColumn="0" w:lastRowFirstColumn="0" w:lastRowLastColumn="0"/>
+        </w:trPr>
+        <w:tc>
+          <w:tcPr>
+            <w:cnfStyle w:val="001000000000" w:firstRow="0" w:lastRow="0" w:firstColumn="1" w:lastColumn="0" w:oddVBand="0" w:evenVBand="0" w:oddHBand="0" w:evenHBand="0" w:firstRowFirstColumn="0" w:firstRowLastColumn="0" w:lastRowFirstColumn="0" w:lastRowLastColumn="0"/>
+            <w:tcW w:w="1537" w:type="pct"/>
+            <w:hideMark/>
+          </w:tcPr>
+          <w:p>
+            <w:pPr>
+              <w:spacing w:after="160" w:line="278" w:lineRule="auto"/>
+            </w:pPr>
+            <w:r>
+              <w:t>Destaque secundário</w:t>
+            </w:r>
+          </w:p>
+        </w:tc>
+        <w:tc>
+          <w:tcPr>
+            <w:tcW w:w="1444" w:type="pct"/>
+            <w:hideMark/>
+          </w:tcPr>
+          <w:p>
+            <w:pPr>
+              <w:spacing w:after="160" w:line="278" w:lineRule="auto"/>
+              <w:cnfStyle w:val="000000100000" w:firstRow="0" w:lastRow="0" w:firstColumn="0" w:lastColumn="0" w:oddVBand="0" w:evenVBand="0" w:oddHBand="1" w:evenHBand="0" w:firstRowFirstColumn="0" w:firstRowLastColumn="0" w:lastRowFirstColumn="0" w:lastRowLastColumn="0"/>
+              <w:rPr>
+                <w:b/>
+                <w:bCs/>
+              </w:rPr>
+            </w:pPr>
+            <w:r>
+              <w:rPr>
+                <w:b/>
+                <w:bCs/>
+              </w:rPr>
+              <w:t>Azul-claro</w:t>
+            </w:r>
+          </w:p>
+        </w:tc>
+        <w:tc>
+          <w:tcPr>
+            <w:tcW w:w="819" w:type="pct"/>
+            <w:hideMark/>
+          </w:tcPr>
+          <w:p>
+            <w:pPr>
+              <w:spacing w:after="160" w:line="278" w:lineRule="auto"/>
+              <w:cnfStyle w:val="000000100000" w:firstRow="0" w:lastRow="0" w:firstColumn="0" w:lastColumn="0" w:oddVBand="0" w:evenVBand="0" w:oddHBand="1" w:evenHBand="0" w:firstRowFirstColumn="0" w:firstRowLastColumn="0" w:lastRowFirstColumn="0" w:lastRowLastColumn="0"/>
+              <w:rPr>
+                <w:b/>
+                <w:bCs/>
+              </w:rPr>
+            </w:pPr>
+            <w:r>
+              <w:rPr>
+                <w:b/>
+                <w:bCs/>
+              </w:rPr>
+              <w:t>#60a5fa</w:t>
+            </w:r>
+          </w:p>
+        </w:tc>
+        <w:tc>
+          <w:tcPr>
+            <w:tcW w:w="1201" w:type="pct"/>
+            <w:shd w:val="clear" w:color="auto" w:fill="60A5FA"/>
+          </w:tcPr>
+          <w:p>
+            <w:pPr>
+              <w:jc w:val="center"/>
+              <w:cnfStyle w:val="000000100000" w:firstRow="0" w:lastRow="0" w:firstColumn="0" w:lastColumn="0" w:oddVBand="0" w:evenVBand="0" w:oddHBand="1" w:evenHBand="0" w:firstRowFirstColumn="0" w:firstRowLastColumn="0" w:lastRowFirstColumn="0" w:lastRowLastColumn="0"/>
+              <w:rPr>
+                <w:b/>
+                <w:bCs/>
+              </w:rPr>
+            </w:pPr>
+          </w:p>
+        </w:tc>
+      </w:tr>
+      <w:tr>
+        <w:tc>
+          <w:tcPr>
+            <w:cnfStyle w:val="001000000000" w:firstRow="0" w:lastRow="0" w:firstColumn="1" w:lastColumn="0" w:oddVBand="0" w:evenVBand="0" w:oddHBand="0" w:evenHBand="0" w:firstRowFirstColumn="0" w:firstRowLastColumn="0" w:lastRowFirstColumn="0" w:lastRowLastColumn="0"/>
+            <w:tcW w:w="1537" w:type="pct"/>
+            <w:hideMark/>
+          </w:tcPr>
+          <w:p>
+            <w:pPr>
+              <w:spacing w:after="160" w:line="278" w:lineRule="auto"/>
+            </w:pPr>
+            <w:r>
+              <w:t>Bordas</w:t>
+            </w:r>
+          </w:p>
+        </w:tc>
+        <w:tc>
+          <w:tcPr>
+            <w:tcW w:w="1444" w:type="pct"/>
+            <w:hideMark/>
+          </w:tcPr>
+          <w:p>
+            <w:pPr>
+              <w:spacing w:after="160" w:line="278" w:lineRule="auto"/>
+              <w:cnfStyle w:val="000000000000" w:firstRow="0" w:lastRow="0" w:firstColumn="0" w:lastColumn="0" w:oddVBand="0" w:evenVBand="0" w:oddHBand="0" w:evenHBand="0" w:firstRowFirstColumn="0" w:firstRowLastColumn="0" w:lastRowFirstColumn="0" w:lastRowLastColumn="0"/>
+              <w:rPr>
+                <w:b/>
+                <w:bCs/>
+              </w:rPr>
+            </w:pPr>
+            <w:r>
+              <w:rPr>
+                <w:b/>
+                <w:bCs/>
+              </w:rPr>
+              <w:t>Cinza-escuro</w:t>
+            </w:r>
+          </w:p>
+        </w:tc>
+        <w:tc>
+          <w:tcPr>
+            <w:tcW w:w="819" w:type="pct"/>
+            <w:hideMark/>
+          </w:tcPr>
+          <w:p>
+            <w:pPr>
+              <w:spacing w:after="160" w:line="278" w:lineRule="auto"/>
+              <w:cnfStyle w:val="000000000000" w:firstRow="0" w:lastRow="0" w:firstColumn="0" w:lastColumn="0" w:oddVBand="0" w:evenVBand="0" w:oddHBand="0" w:evenHBand="0" w:firstRowFirstColumn="0" w:firstRowLastColumn="0" w:lastRowFirstColumn="0" w:lastRowLastColumn="0"/>
+              <w:rPr>
+                <w:b/>
+                <w:bCs/>
+              </w:rPr>
+            </w:pPr>
+            <w:r>
+              <w:rPr>
+                <w:b/>
+                <w:bCs/>
+              </w:rPr>
+              <w:t>#1f2937</w:t>
+            </w:r>
+          </w:p>
+        </w:tc>
+        <w:tc>
+          <w:tcPr>
+            <w:tcW w:w="1201" w:type="pct"/>
+            <w:shd w:val="clear" w:color="auto" w:fill="1F2937"/>
+          </w:tcPr>
+          <w:p>
+            <w:pPr>
+              <w:jc w:val="center"/>
+              <w:cnfStyle w:val="000000000000" w:firstRow="0" w:lastRow="0" w:firstColumn="0" w:lastColumn="0" w:oddVBand="0" w:evenVBand="0" w:oddHBand="0" w:evenHBand="0" w:firstRowFirstColumn="0" w:firstRowLastColumn="0" w:lastRowFirstColumn="0" w:lastRowLastColumn="0"/>
+            </w:pPr>
+          </w:p>
+        </w:tc>
+      </w:tr>
+    </w:tbl>
+    <w:p>
+      <w:pPr>
+        <w:rPr>
+          <w:b/>
+          <w:bCs/>
+        </w:rPr>
+      </w:pPr>
+    </w:p>
+    <w:p>
+      <w:r>
+        <w:t>Esta combinação de cores permite criar contraste suficiente entre texto e fundo, facilitando a leitura e contribuindo para a acessibilidade do site.</w:t>
+      </w:r>
+    </w:p>
+    <w:p/>
     <w:p>
       <w:pPr>
         <w:pStyle w:val="Heading2"/>
@@ -2667,9 +3196,8 @@
           <w:numId w:val="2"/>
         </w:numPr>
       </w:pPr>
-      <w:bookmarkStart w:id="8" w:name="_Toc239531979"/>
-      <w:r>
-        <w:lastRenderedPageBreak/>
+      <w:bookmarkStart w:id="8" w:name="_Toc240048717"/>
+      <w:r>
         <w:t xml:space="preserve">Desenvolvimento das Páginas em </w:t>
       </w:r>
       <w:r>
@@ -2715,7 +3243,21 @@
         <w:rPr>
           <w:rStyle w:val="EstrageirasChar"/>
         </w:rPr>
-        <w:t xml:space="preserve">&lt;head&gt; </w:t>
+        <w:t>&lt;</w:t>
+      </w:r>
+      <w:proofErr w:type="spellStart"/>
+      <w:r>
+        <w:rPr>
+          <w:rStyle w:val="EstrageirasChar"/>
+        </w:rPr>
+        <w:t>head</w:t>
+      </w:r>
+      <w:proofErr w:type="spellEnd"/>
+      <w:r>
+        <w:rPr>
+          <w:rStyle w:val="EstrageirasChar"/>
+        </w:rPr>
+        <w:t xml:space="preserve">&gt; </w:t>
       </w:r>
       <w:r>
         <w:t xml:space="preserve">e </w:t>
@@ -2735,7 +3277,21 @@
         <w:rPr>
           <w:rStyle w:val="EstrageirasChar"/>
         </w:rPr>
-        <w:t xml:space="preserve">&lt;head&gt; </w:t>
+        <w:t>&lt;</w:t>
+      </w:r>
+      <w:proofErr w:type="spellStart"/>
+      <w:r>
+        <w:rPr>
+          <w:rStyle w:val="EstrageirasChar"/>
+        </w:rPr>
+        <w:t>head</w:t>
+      </w:r>
+      <w:proofErr w:type="spellEnd"/>
+      <w:r>
+        <w:rPr>
+          <w:rStyle w:val="EstrageirasChar"/>
+        </w:rPr>
+        <w:t xml:space="preserve">&gt; </w:t>
       </w:r>
       <w:r>
         <w:t xml:space="preserve">foram definidos a codificação </w:t>
@@ -2829,19 +3385,27 @@
         <w:t>contacto.html</w:t>
       </w:r>
       <w:r>
-        <w:t xml:space="preserve">, com destaque para a página </w:t>
-      </w:r>
-      <w:r>
-        <w:t>atual</w:t>
-      </w:r>
-      <w:r>
-        <w:t xml:space="preserve">. Também foram utilizados elementos semânticos como </w:t>
-      </w:r>
-      <w:r>
-        <w:rPr>
-          <w:rStyle w:val="EstrageirasChar"/>
-        </w:rPr>
-        <w:t>&lt;header&gt;</w:t>
+        <w:t xml:space="preserve">, com destaque para a página atual. Também foram utilizados elementos semânticos como </w:t>
+      </w:r>
+      <w:r>
+        <w:rPr>
+          <w:rStyle w:val="EstrageirasChar"/>
+        </w:rPr>
+        <w:t>&lt;</w:t>
+      </w:r>
+      <w:proofErr w:type="spellStart"/>
+      <w:r>
+        <w:rPr>
+          <w:rStyle w:val="EstrageirasChar"/>
+        </w:rPr>
+        <w:t>header</w:t>
+      </w:r>
+      <w:proofErr w:type="spellEnd"/>
+      <w:r>
+        <w:rPr>
+          <w:rStyle w:val="EstrageirasChar"/>
+        </w:rPr>
+        <w:t>&gt;</w:t>
       </w:r>
       <w:r>
         <w:t xml:space="preserve">, </w:t>
@@ -2850,7 +3414,21 @@
         <w:rPr>
           <w:rStyle w:val="EstrageirasChar"/>
         </w:rPr>
-        <w:t>&lt;nav&gt;</w:t>
+        <w:t>&lt;</w:t>
+      </w:r>
+      <w:proofErr w:type="spellStart"/>
+      <w:r>
+        <w:rPr>
+          <w:rStyle w:val="EstrageirasChar"/>
+        </w:rPr>
+        <w:t>nav</w:t>
+      </w:r>
+      <w:proofErr w:type="spellEnd"/>
+      <w:r>
+        <w:rPr>
+          <w:rStyle w:val="EstrageirasChar"/>
+        </w:rPr>
+        <w:t>&gt;</w:t>
       </w:r>
       <w:r>
         <w:t xml:space="preserve">, </w:t>
@@ -2859,7 +3437,21 @@
         <w:rPr>
           <w:rStyle w:val="EstrageirasChar"/>
         </w:rPr>
-        <w:t>&lt;main&gt;</w:t>
+        <w:t>&lt;</w:t>
+      </w:r>
+      <w:proofErr w:type="spellStart"/>
+      <w:r>
+        <w:rPr>
+          <w:rStyle w:val="EstrageirasChar"/>
+        </w:rPr>
+        <w:t>main</w:t>
+      </w:r>
+      <w:proofErr w:type="spellEnd"/>
+      <w:r>
+        <w:rPr>
+          <w:rStyle w:val="EstrageirasChar"/>
+        </w:rPr>
+        <w:t>&gt;</w:t>
       </w:r>
       <w:r>
         <w:t xml:space="preserve">, </w:t>
@@ -2868,7 +3460,21 @@
         <w:rPr>
           <w:rStyle w:val="EstrageirasChar"/>
         </w:rPr>
-        <w:t>&lt;section&gt;</w:t>
+        <w:t>&lt;</w:t>
+      </w:r>
+      <w:proofErr w:type="spellStart"/>
+      <w:r>
+        <w:rPr>
+          <w:rStyle w:val="EstrageirasChar"/>
+        </w:rPr>
+        <w:t>section</w:t>
+      </w:r>
+      <w:proofErr w:type="spellEnd"/>
+      <w:r>
+        <w:rPr>
+          <w:rStyle w:val="EstrageirasChar"/>
+        </w:rPr>
+        <w:t>&gt;</w:t>
       </w:r>
       <w:r>
         <w:t xml:space="preserve">, </w:t>
@@ -2877,7 +3483,21 @@
         <w:rPr>
           <w:rStyle w:val="EstrageirasChar"/>
         </w:rPr>
-        <w:t>&lt;article&gt;</w:t>
+        <w:t>&lt;</w:t>
+      </w:r>
+      <w:proofErr w:type="spellStart"/>
+      <w:r>
+        <w:rPr>
+          <w:rStyle w:val="EstrageirasChar"/>
+        </w:rPr>
+        <w:t>article</w:t>
+      </w:r>
+      <w:proofErr w:type="spellEnd"/>
+      <w:r>
+        <w:rPr>
+          <w:rStyle w:val="EstrageirasChar"/>
+        </w:rPr>
+        <w:t>&gt;</w:t>
       </w:r>
       <w:r>
         <w:t xml:space="preserve"> e </w:t>
@@ -2901,9 +3521,10 @@
         <w:jc w:val="center"/>
       </w:pPr>
       <w:r>
+        <w:lastRenderedPageBreak/>
         <w:drawing>
-          <wp:inline distT="0" distB="0" distL="0" distR="0" wp14:anchorId="668E2EF9" wp14:editId="4E0BEAA4">
-            <wp:extent cx="5570326" cy="3360717"/>
+          <wp:inline distT="0" distB="0" distL="0" distR="0" wp14:anchorId="668E2EF9" wp14:editId="743202E6">
+            <wp:extent cx="5850925" cy="3530009"/>
             <wp:effectExtent l="0" t="0" r="0" b="0"/>
             <wp:docPr id="1565553134" name="Picture 1"/>
             <wp:cNvGraphicFramePr>
@@ -2926,7 +3547,7 @@
                   <pic:spPr bwMode="auto">
                     <a:xfrm>
                       <a:off x="0" y="0"/>
-                      <a:ext cx="5691712" cy="3433952"/>
+                      <a:ext cx="6038882" cy="3643408"/>
                     </a:xfrm>
                     <a:prstGeom prst="rect">
                       <a:avLst/>
@@ -2977,8 +3598,13 @@
         <w:t>projeto</w:t>
       </w:r>
       <w:r>
-        <w:t xml:space="preserve"> InfoTech</w:t>
-      </w:r>
+        <w:t xml:space="preserve"> </w:t>
+      </w:r>
+      <w:proofErr w:type="spellStart"/>
+      <w:r>
+        <w:t>InfoTech</w:t>
+      </w:r>
+      <w:proofErr w:type="spellEnd"/>
     </w:p>
     <w:p/>
     <w:p>
@@ -2989,7 +3615,7 @@
           <w:numId w:val="2"/>
         </w:numPr>
       </w:pPr>
-      <w:bookmarkStart w:id="9" w:name="_Toc239531980"/>
+      <w:bookmarkStart w:id="9" w:name="_Toc240048718"/>
       <w:r>
         <w:t>Integração de Imagens, Áudio, Vídeo e Formulários</w:t>
       </w:r>
@@ -3003,16 +3629,18 @@
         <w:rPr>
           <w:rStyle w:val="EstrageirasChar"/>
         </w:rPr>
-        <w:t>website InfoTech</w:t>
-      </w:r>
-      <w:r>
-        <w:t xml:space="preserve"> mais informativo e </w:t>
-      </w:r>
-      <w:r>
-        <w:t>interativo</w:t>
-      </w:r>
-      <w:r>
-        <w:t xml:space="preserve">. A página Galeria inclui imagens relacionadas com </w:t>
+        <w:t xml:space="preserve">website </w:t>
+      </w:r>
+      <w:proofErr w:type="spellStart"/>
+      <w:r>
+        <w:rPr>
+          <w:rStyle w:val="EstrageirasChar"/>
+        </w:rPr>
+        <w:t>InfoTech</w:t>
+      </w:r>
+      <w:proofErr w:type="spellEnd"/>
+      <w:r>
+        <w:t xml:space="preserve"> mais informativo e interativo. A página Galeria inclui imagens relacionadas com </w:t>
       </w:r>
       <w:r>
         <w:rPr>
@@ -3023,17 +3651,20 @@
       <w:r>
         <w:t xml:space="preserve">, programação e redes, acompanhadas de textos alternativos através do atributo </w:t>
       </w:r>
+      <w:proofErr w:type="spellStart"/>
       <w:r>
         <w:rPr>
           <w:rStyle w:val="EstrageirasChar"/>
         </w:rPr>
         <w:t>alt</w:t>
       </w:r>
+      <w:proofErr w:type="spellEnd"/>
       <w:r>
         <w:t>, melhorando a acessibilidade.</w:t>
       </w:r>
-    </w:p>
-    <w:p>
+      <w:r>
+        <w:t xml:space="preserve"> </w:t>
+      </w:r>
       <w:r>
         <w:t xml:space="preserve">Também foram adicionados ficheiros de áudio e vídeo com controlos de reprodução. O vídeo inclui a possibilidade de utilizar legendas através do elemento </w:t>
       </w:r>
@@ -3041,7 +3672,21 @@
         <w:rPr>
           <w:rStyle w:val="EstrageirasChar"/>
         </w:rPr>
-        <w:t>&lt;track&gt;</w:t>
+        <w:t>&lt;</w:t>
+      </w:r>
+      <w:proofErr w:type="spellStart"/>
+      <w:r>
+        <w:rPr>
+          <w:rStyle w:val="EstrageirasChar"/>
+        </w:rPr>
+        <w:t>track</w:t>
+      </w:r>
+      <w:proofErr w:type="spellEnd"/>
+      <w:r>
+        <w:rPr>
+          <w:rStyle w:val="EstrageirasChar"/>
+        </w:rPr>
+        <w:t>&gt;</w:t>
       </w:r>
       <w:r>
         <w:t>.</w:t>
@@ -3049,7 +3694,6 @@
     </w:p>
     <w:p>
       <w:r>
-        <w:lastRenderedPageBreak/>
         <w:t xml:space="preserve">Na página Contacto foi criado um formulário com campos para nome, e-mail, telefone, assunto e mensagem. Foram aplicadas validações básicas para os campos obrigatórios. Também foram incluídos </w:t>
       </w:r>
       <w:r>
@@ -3081,85 +3725,6 @@
       </w:r>
       <w:r>
         <w:t>.</w:t>
-      </w:r>
-    </w:p>
-    <w:p>
-      <w:pPr>
-        <w:keepNext/>
-        <w:jc w:val="center"/>
-      </w:pPr>
-      <w:r>
-        <w:drawing>
-          <wp:inline distT="0" distB="0" distL="0" distR="0" wp14:anchorId="38543241" wp14:editId="6D293ACD">
-            <wp:extent cx="5667375" cy="1138481"/>
-            <wp:effectExtent l="0" t="0" r="0" b="5080"/>
-            <wp:docPr id="1078705968" name="Picture 1"/>
-            <wp:cNvGraphicFramePr>
-              <a:graphicFrameLocks xmlns:a="http://schemas.openxmlformats.org/drawingml/2006/main" noChangeAspect="1"/>
-            </wp:cNvGraphicFramePr>
-            <a:graphic xmlns:a="http://schemas.openxmlformats.org/drawingml/2006/main">
-              <a:graphicData uri="http://schemas.openxmlformats.org/drawingml/2006/picture">
-                <pic:pic xmlns:pic="http://schemas.openxmlformats.org/drawingml/2006/picture">
-                  <pic:nvPicPr>
-                    <pic:cNvPr id="1078705968" name=""/>
-                    <pic:cNvPicPr/>
-                  </pic:nvPicPr>
-                  <pic:blipFill rotWithShape="1">
-                    <a:blip r:embed="rId14"/>
-                    <a:srcRect l="4007" t="47891" r="23397" b="26168"/>
-                    <a:stretch>
-                      <a:fillRect/>
-                    </a:stretch>
-                  </pic:blipFill>
-                  <pic:spPr bwMode="auto">
-                    <a:xfrm>
-                      <a:off x="0" y="0"/>
-                      <a:ext cx="5730273" cy="1151116"/>
-                    </a:xfrm>
-                    <a:prstGeom prst="rect">
-                      <a:avLst/>
-                    </a:prstGeom>
-                    <a:ln>
-                      <a:noFill/>
-                    </a:ln>
-                    <a:extLst>
-                      <a:ext uri="{53640926-AAD7-44D8-BBD7-CCE9431645EC}">
-                        <a14:shadowObscured xmlns:a14="http://schemas.microsoft.com/office/drawing/2010/main"/>
-                      </a:ext>
-                    </a:extLst>
-                  </pic:spPr>
-                </pic:pic>
-              </a:graphicData>
-            </a:graphic>
-          </wp:inline>
-        </w:drawing>
-      </w:r>
-    </w:p>
-    <w:p>
-      <w:pPr>
-        <w:pStyle w:val="Caption"/>
-        <w:jc w:val="center"/>
-      </w:pPr>
-      <w:r>
-        <w:t xml:space="preserve">Figura </w:t>
-      </w:r>
-      <w:r>
-        <w:fldChar w:fldCharType="begin"/>
-      </w:r>
-      <w:r>
-        <w:instrText xml:space="preserve"> SEQ Figura \* ARABIC </w:instrText>
-      </w:r>
-      <w:r>
-        <w:fldChar w:fldCharType="separate"/>
-      </w:r>
-      <w:r>
-        <w:t>7</w:t>
-      </w:r>
-      <w:r>
-        <w:fldChar w:fldCharType="end"/>
-      </w:r>
-      <w:r>
-        <w:t>: Exemplo de imagem com texto alternativo</w:t>
       </w:r>
     </w:p>
     <w:p>
@@ -3184,7 +3749,7 @@
                     <pic:cNvPicPr/>
                   </pic:nvPicPr>
                   <pic:blipFill rotWithShape="1">
-                    <a:blip r:embed="rId15"/>
+                    <a:blip r:embed="rId14"/>
                     <a:srcRect l="4327" t="52166" r="49038" b="27595"/>
                     <a:stretch>
                       <a:fillRect/>
@@ -3220,22 +3785,10 @@
         <w:jc w:val="center"/>
       </w:pPr>
       <w:r>
-        <w:t xml:space="preserve">Figura </w:t>
-      </w:r>
-      <w:r>
-        <w:fldChar w:fldCharType="begin"/>
-      </w:r>
-      <w:r>
-        <w:instrText xml:space="preserve"> SEQ Figura \* ARABIC </w:instrText>
-      </w:r>
-      <w:r>
-        <w:fldChar w:fldCharType="separate"/>
-      </w:r>
-      <w:r>
-        <w:t>8</w:t>
-      </w:r>
-      <w:r>
-        <w:fldChar w:fldCharType="end"/>
+        <w:t>Figura</w:t>
+      </w:r>
+      <w:r>
+        <w:t xml:space="preserve"> 7</w:t>
       </w:r>
       <w:r>
         <w:t>: Exemplo de campo obrigatório do formulári</w:t>
@@ -3244,85 +3797,7 @@
         <w:t>o</w:t>
       </w:r>
     </w:p>
-    <w:p>
-      <w:pPr>
-        <w:keepNext/>
-        <w:jc w:val="center"/>
-      </w:pPr>
-      <w:r>
-        <w:drawing>
-          <wp:inline distT="0" distB="0" distL="0" distR="0" wp14:anchorId="318802FE" wp14:editId="7BD67286">
-            <wp:extent cx="5686425" cy="2539450"/>
-            <wp:effectExtent l="0" t="0" r="0" b="0"/>
-            <wp:docPr id="2023385819" name="Picture 1"/>
-            <wp:cNvGraphicFramePr>
-              <a:graphicFrameLocks xmlns:a="http://schemas.openxmlformats.org/drawingml/2006/main" noChangeAspect="1"/>
-            </wp:cNvGraphicFramePr>
-            <a:graphic xmlns:a="http://schemas.openxmlformats.org/drawingml/2006/main">
-              <a:graphicData uri="http://schemas.openxmlformats.org/drawingml/2006/picture">
-                <pic:pic xmlns:pic="http://schemas.openxmlformats.org/drawingml/2006/picture">
-                  <pic:nvPicPr>
-                    <pic:cNvPr id="2023385819" name=""/>
-                    <pic:cNvPicPr/>
-                  </pic:nvPicPr>
-                  <pic:blipFill rotWithShape="1">
-                    <a:blip r:embed="rId16"/>
-                    <a:srcRect l="3685" t="31071" r="21314" b="9350"/>
-                    <a:stretch>
-                      <a:fillRect/>
-                    </a:stretch>
-                  </pic:blipFill>
-                  <pic:spPr bwMode="auto">
-                    <a:xfrm>
-                      <a:off x="0" y="0"/>
-                      <a:ext cx="5733482" cy="2560465"/>
-                    </a:xfrm>
-                    <a:prstGeom prst="rect">
-                      <a:avLst/>
-                    </a:prstGeom>
-                    <a:ln>
-                      <a:noFill/>
-                    </a:ln>
-                    <a:extLst>
-                      <a:ext uri="{53640926-AAD7-44D8-BBD7-CCE9431645EC}">
-                        <a14:shadowObscured xmlns:a14="http://schemas.microsoft.com/office/drawing/2010/main"/>
-                      </a:ext>
-                    </a:extLst>
-                  </pic:spPr>
-                </pic:pic>
-              </a:graphicData>
-            </a:graphic>
-          </wp:inline>
-        </w:drawing>
-      </w:r>
-    </w:p>
-    <w:p>
-      <w:pPr>
-        <w:pStyle w:val="Caption"/>
-        <w:jc w:val="center"/>
-      </w:pPr>
-      <w:r>
-        <w:t xml:space="preserve">Figura </w:t>
-      </w:r>
-      <w:r>
-        <w:fldChar w:fldCharType="begin"/>
-      </w:r>
-      <w:r>
-        <w:instrText xml:space="preserve"> SEQ Figura \* ARABIC </w:instrText>
-      </w:r>
-      <w:r>
-        <w:fldChar w:fldCharType="separate"/>
-      </w:r>
-      <w:r>
-        <w:t>9</w:t>
-      </w:r>
-      <w:r>
-        <w:fldChar w:fldCharType="end"/>
-      </w:r>
-      <w:r>
-        <w:t>: Exemplo de vídeo com legendas</w:t>
-      </w:r>
-    </w:p>
+    <w:p/>
     <w:p>
       <w:pPr>
         <w:pStyle w:val="Heading2"/>
@@ -3331,7 +3806,7 @@
           <w:numId w:val="2"/>
         </w:numPr>
       </w:pPr>
-      <w:bookmarkStart w:id="10" w:name="_Toc239531981"/>
+      <w:bookmarkStart w:id="10" w:name="_Toc240048719"/>
       <w:r>
         <w:t xml:space="preserve">Testes e </w:t>
       </w:r>
@@ -3365,10 +3840,12 @@
       <w:r>
         <w:t>, botões, imagens, áudio, vídeo, formulário de contacto, menu responsivo, tema e carrossel de imagens.</w:t>
       </w:r>
-    </w:p>
-    <w:p>
-      <w:r>
-        <w:lastRenderedPageBreak/>
+      <w:r>
+        <w:t xml:space="preserve"> </w:t>
+      </w:r>
+    </w:p>
+    <w:p>
+      <w:r>
         <w:t>Foram verificadas as ligações entre as páginas, os caminhos dos ficheiros e a apresentação dos conteúdos em computador, tablet e telemóvel. Também foram testados os botões “Ler mais”, os controlos do carrossel, os campos obrigatórios do formulário e a validação do e-mail.</w:t>
       </w:r>
     </w:p>
@@ -3431,14 +3908,22 @@
         <w:fldChar w:fldCharType="separate"/>
       </w:r>
       <w:r>
-        <w:t>1</w:t>
+        <w:rPr>
+          <w:noProof/>
+        </w:rPr>
+        <w:t>2</w:t>
       </w:r>
       <w:r>
         <w:fldChar w:fldCharType="end"/>
       </w:r>
       <w:r>
-        <w:t>: Resultados dos testes realizados no website InfoTech</w:t>
-      </w:r>
+        <w:t xml:space="preserve">: Resultados dos testes realizados no website </w:t>
+      </w:r>
+      <w:proofErr w:type="spellStart"/>
+      <w:r>
+        <w:t>InfoTech</w:t>
+      </w:r>
+      <w:proofErr w:type="spellEnd"/>
     </w:p>
     <w:tbl>
       <w:tblPr>
@@ -3973,7 +4458,7 @@
           <w:numId w:val="2"/>
         </w:numPr>
       </w:pPr>
-      <w:bookmarkStart w:id="11" w:name="_Toc239531982"/>
+      <w:bookmarkStart w:id="11" w:name="_Toc240048720"/>
       <w:r>
         <w:t>Hospedagem e Publicação</w:t>
       </w:r>
@@ -3990,8 +4475,16 @@
         <w:rPr>
           <w:rStyle w:val="EstrageirasChar"/>
         </w:rPr>
-        <w:t>website InfoTech</w:t>
-      </w:r>
+        <w:t xml:space="preserve">website </w:t>
+      </w:r>
+      <w:proofErr w:type="spellStart"/>
+      <w:r>
+        <w:rPr>
+          <w:rStyle w:val="EstrageirasChar"/>
+        </w:rPr>
+        <w:t>InfoTech</w:t>
+      </w:r>
+      <w:proofErr w:type="spellEnd"/>
       <w:r>
         <w:t xml:space="preserve"> foi publicado através do</w:t>
       </w:r>
@@ -3999,8 +4492,16 @@
         <w:rPr>
           <w:rStyle w:val="EstrageirasChar"/>
         </w:rPr>
-        <w:t xml:space="preserve"> GitHub Pages</w:t>
-      </w:r>
+        <w:t xml:space="preserve"> GitHub </w:t>
+      </w:r>
+      <w:proofErr w:type="spellStart"/>
+      <w:r>
+        <w:rPr>
+          <w:rStyle w:val="EstrageirasChar"/>
+        </w:rPr>
+        <w:t>Pages</w:t>
+      </w:r>
+      <w:proofErr w:type="spellEnd"/>
       <w:r>
         <w:t xml:space="preserve">. A plataforma permite hospedar </w:t>
       </w:r>
@@ -4064,8 +4565,16 @@
         <w:rPr>
           <w:rStyle w:val="EstrageirasChar"/>
         </w:rPr>
-        <w:t>GitHub Pages</w:t>
-      </w:r>
+        <w:t xml:space="preserve">GitHub </w:t>
+      </w:r>
+      <w:proofErr w:type="spellStart"/>
+      <w:r>
+        <w:rPr>
+          <w:rStyle w:val="EstrageirasChar"/>
+        </w:rPr>
+        <w:t>Pages</w:t>
+      </w:r>
+      <w:proofErr w:type="spellEnd"/>
       <w:r>
         <w:t xml:space="preserve"> foi </w:t>
       </w:r>
@@ -4075,18 +4584,21 @@
       <w:r>
         <w:t xml:space="preserve"> a partir da </w:t>
       </w:r>
+      <w:proofErr w:type="spellStart"/>
       <w:r>
         <w:rPr>
           <w:rStyle w:val="EstrageirasChar"/>
         </w:rPr>
         <w:t>branch</w:t>
       </w:r>
+      <w:proofErr w:type="spellEnd"/>
       <w:r>
         <w:t xml:space="preserve"> principal do repositório.</w:t>
       </w:r>
     </w:p>
     <w:p>
       <w:r>
+        <w:lastRenderedPageBreak/>
         <w:t>Após a publicação, foram realizados testes no endereço disponibilizado para confirmar o carregamento das páginas, o funcionamento da navegação, do menu, das imagens, do carrossel, do formulário e dos recursos multimédia em diferentes tamanhos de ecrã</w:t>
       </w:r>
       <w:r>
@@ -4094,13 +4606,15 @@
       </w:r>
     </w:p>
     <w:p>
-      <w:r>
-        <w:lastRenderedPageBreak/>
+      <w:pPr>
+        <w:jc w:val="center"/>
+      </w:pPr>
+      <w:r>
         <w:drawing>
-          <wp:inline distT="0" distB="0" distL="0" distR="0" wp14:anchorId="4589D2CD" wp14:editId="684ABB9B">
-            <wp:extent cx="5942893" cy="4880758"/>
-            <wp:effectExtent l="0" t="0" r="1270" b="0"/>
-            <wp:docPr id="696194719" name="Picture 1"/>
+          <wp:inline distT="0" distB="0" distL="0" distR="0" wp14:anchorId="45F2998B" wp14:editId="7DC2674A">
+            <wp:extent cx="6187402" cy="2933205"/>
+            <wp:effectExtent l="0" t="0" r="4445" b="635"/>
+            <wp:docPr id="1187859245" name="Picture 2"/>
             <wp:cNvGraphicFramePr>
               <a:graphicFrameLocks xmlns:a="http://schemas.openxmlformats.org/drawingml/2006/main" noChangeAspect="1"/>
             </wp:cNvGraphicFramePr>
@@ -4108,20 +4622,20 @@
               <a:graphicData uri="http://schemas.openxmlformats.org/drawingml/2006/picture">
                 <pic:pic xmlns:pic="http://schemas.openxmlformats.org/drawingml/2006/picture">
                   <pic:nvPicPr>
-                    <pic:cNvPr id="0" name="Picture 1"/>
+                    <pic:cNvPr id="0" name="Picture 3"/>
                     <pic:cNvPicPr>
                       <a:picLocks noChangeAspect="1" noChangeArrowheads="1"/>
                     </pic:cNvPicPr>
                   </pic:nvPicPr>
                   <pic:blipFill rotWithShape="1">
-                    <a:blip r:embed="rId17">
+                    <a:blip r:embed="rId15">
                       <a:extLst>
                         <a:ext uri="{28A0092B-C50C-407E-A947-70E740481C1C}">
                           <a14:useLocalDpi xmlns:a14="http://schemas.microsoft.com/office/drawing/2010/main" val="0"/>
                         </a:ext>
                       </a:extLst>
                     </a:blip>
-                    <a:srcRect b="37176"/>
+                    <a:srcRect b="43540"/>
                     <a:stretch>
                       <a:fillRect/>
                     </a:stretch>
@@ -4129,7 +4643,7 @@
                   <pic:spPr bwMode="auto">
                     <a:xfrm>
                       <a:off x="0" y="0"/>
-                      <a:ext cx="5943600" cy="4881338"/>
+                      <a:ext cx="6208977" cy="2943433"/>
                     </a:xfrm>
                     <a:prstGeom prst="rect">
                       <a:avLst/>
@@ -4169,28 +4683,34 @@
         <w:fldChar w:fldCharType="separate"/>
       </w:r>
       <w:r>
-        <w:t>10</w:t>
+        <w:t>11</w:t>
       </w:r>
       <w:r>
         <w:fldChar w:fldCharType="end"/>
       </w:r>
       <w:r>
-        <w:t xml:space="preserve">: Repositório do </w:t>
+        <w:t xml:space="preserve">: Configuração do GitHub </w:t>
       </w:r>
       <w:proofErr w:type="spellStart"/>
       <w:r>
-        <w:t>projecto</w:t>
+        <w:t>Pages</w:t>
       </w:r>
       <w:proofErr w:type="spellEnd"/>
       <w:r>
-        <w:t xml:space="preserve"> InfoTech no GitHub</w:t>
-      </w:r>
+        <w:t xml:space="preserve"> para publicação do website</w:t>
+      </w:r>
+    </w:p>
+    <w:p>
+      <w:pPr>
+        <w:keepNext/>
+        <w:jc w:val="center"/>
+      </w:pPr>
       <w:r>
         <w:drawing>
-          <wp:inline distT="0" distB="0" distL="0" distR="0" wp14:anchorId="45F2998B" wp14:editId="11C48696">
-            <wp:extent cx="5943600" cy="2817628"/>
-            <wp:effectExtent l="0" t="0" r="0" b="1905"/>
-            <wp:docPr id="1187859245" name="Picture 2"/>
+          <wp:inline distT="0" distB="0" distL="0" distR="0" wp14:anchorId="219538F9" wp14:editId="6ADB2BC2">
+            <wp:extent cx="5975498" cy="3359302"/>
+            <wp:effectExtent l="0" t="0" r="6350" b="0"/>
+            <wp:docPr id="758666528" name="Picture 1"/>
             <wp:cNvGraphicFramePr>
               <a:graphicFrameLocks xmlns:a="http://schemas.openxmlformats.org/drawingml/2006/main" noChangeAspect="1"/>
             </wp:cNvGraphicFramePr>
@@ -4198,99 +4718,11 @@
               <a:graphicData uri="http://schemas.openxmlformats.org/drawingml/2006/picture">
                 <pic:pic xmlns:pic="http://schemas.openxmlformats.org/drawingml/2006/picture">
                   <pic:nvPicPr>
-                    <pic:cNvPr id="0" name="Picture 3"/>
-                    <pic:cNvPicPr>
-                      <a:picLocks noChangeAspect="1" noChangeArrowheads="1"/>
-                    </pic:cNvPicPr>
-                  </pic:nvPicPr>
-                  <pic:blipFill rotWithShape="1">
-                    <a:blip r:embed="rId18">
-                      <a:extLst>
-                        <a:ext uri="{28A0092B-C50C-407E-A947-70E740481C1C}">
-                          <a14:useLocalDpi xmlns:a14="http://schemas.microsoft.com/office/drawing/2010/main" val="0"/>
-                        </a:ext>
-                      </a:extLst>
-                    </a:blip>
-                    <a:srcRect b="43540"/>
-                    <a:stretch>
-                      <a:fillRect/>
-                    </a:stretch>
-                  </pic:blipFill>
-                  <pic:spPr bwMode="auto">
-                    <a:xfrm>
-                      <a:off x="0" y="0"/>
-                      <a:ext cx="5943600" cy="2817628"/>
-                    </a:xfrm>
-                    <a:prstGeom prst="rect">
-                      <a:avLst/>
-                    </a:prstGeom>
-                    <a:noFill/>
-                    <a:ln>
-                      <a:noFill/>
-                    </a:ln>
-                    <a:extLst>
-                      <a:ext uri="{53640926-AAD7-44D8-BBD7-CCE9431645EC}">
-                        <a14:shadowObscured xmlns:a14="http://schemas.microsoft.com/office/drawing/2010/main"/>
-                      </a:ext>
-                    </a:extLst>
-                  </pic:spPr>
-                </pic:pic>
-              </a:graphicData>
-            </a:graphic>
-          </wp:inline>
-        </w:drawing>
-      </w:r>
-    </w:p>
-    <w:p>
-      <w:pPr>
-        <w:pStyle w:val="Caption"/>
-        <w:jc w:val="center"/>
-      </w:pPr>
-      <w:r>
-        <w:t xml:space="preserve">Figura </w:t>
-      </w:r>
-      <w:r>
-        <w:fldChar w:fldCharType="begin"/>
-      </w:r>
-      <w:r>
-        <w:instrText xml:space="preserve"> SEQ Figura \* ARABIC </w:instrText>
-      </w:r>
-      <w:r>
-        <w:fldChar w:fldCharType="separate"/>
-      </w:r>
-      <w:r>
-        <w:t>11</w:t>
-      </w:r>
-      <w:r>
-        <w:fldChar w:fldCharType="end"/>
-      </w:r>
-      <w:r>
-        <w:t>: Configuração do GitHub Pages para publicação do website</w:t>
-      </w:r>
-    </w:p>
-    <w:p>
-      <w:pPr>
-        <w:keepNext/>
-      </w:pPr>
-      <w:r>
-        <w:lastRenderedPageBreak/>
-        <w:drawing>
-          <wp:inline distT="0" distB="0" distL="0" distR="0" wp14:anchorId="0CBC0FE2" wp14:editId="51168FD3">
-            <wp:extent cx="5943600" cy="3341370"/>
-            <wp:effectExtent l="0" t="0" r="0" b="0"/>
-            <wp:docPr id="1400711507" name="Picture 1"/>
-            <wp:cNvGraphicFramePr>
-              <a:graphicFrameLocks xmlns:a="http://schemas.openxmlformats.org/drawingml/2006/main" noChangeAspect="1"/>
-            </wp:cNvGraphicFramePr>
-            <a:graphic xmlns:a="http://schemas.openxmlformats.org/drawingml/2006/main">
-              <a:graphicData uri="http://schemas.openxmlformats.org/drawingml/2006/picture">
-                <pic:pic xmlns:pic="http://schemas.openxmlformats.org/drawingml/2006/picture">
-                  <pic:nvPicPr>
-                    <pic:cNvPr id="1400711507" name=""/>
+                    <pic:cNvPr id="758666528" name=""/>
                     <pic:cNvPicPr/>
                   </pic:nvPicPr>
                   <pic:blipFill>
-                    <a:blip r:embed="rId19"/>
+                    <a:blip r:embed="rId16"/>
                     <a:stretch>
                       <a:fillRect/>
                     </a:stretch>
@@ -4298,7 +4730,7 @@
                   <pic:spPr>
                     <a:xfrm>
                       <a:off x="0" y="0"/>
-                      <a:ext cx="5943600" cy="3341370"/>
+                      <a:ext cx="5998157" cy="3372041"/>
                     </a:xfrm>
                     <a:prstGeom prst="rect">
                       <a:avLst/>
@@ -4335,23 +4767,30 @@
         <w:fldChar w:fldCharType="end"/>
       </w:r>
       <w:r>
-        <w:t>: Website InfoTech publicado no GitHub Pages</w:t>
-      </w:r>
-    </w:p>
-    <w:p>
-      <w:pPr>
-        <w:rPr>
-          <w:i/>
-          <w:iCs/>
-        </w:rPr>
-      </w:pPr>
+        <w:t xml:space="preserve">: Website </w:t>
+      </w:r>
+      <w:proofErr w:type="spellStart"/>
+      <w:r>
+        <w:t>InfoTech</w:t>
+      </w:r>
+      <w:proofErr w:type="spellEnd"/>
+      <w:r>
+        <w:t xml:space="preserve"> publicado no GitHub </w:t>
+      </w:r>
+      <w:proofErr w:type="spellStart"/>
+      <w:r>
+        <w:t>Pages</w:t>
+      </w:r>
+      <w:proofErr w:type="spellEnd"/>
+    </w:p>
+    <w:p>
       <w:r>
         <w:t>Link do website publicado:</w:t>
       </w:r>
       <w:r>
         <w:t xml:space="preserve"> </w:t>
       </w:r>
-      <w:hyperlink r:id="rId20" w:history="1">
+      <w:hyperlink r:id="rId17" w:history="1">
         <w:r>
           <w:rPr>
             <w:rStyle w:val="Hyperlink"/>
@@ -4371,7 +4810,14 @@
         </w:r>
       </w:hyperlink>
     </w:p>
-    <w:p/>
+    <w:p>
+      <w:pPr>
+        <w:rPr>
+          <w:i/>
+          <w:iCs/>
+        </w:rPr>
+      </w:pPr>
+    </w:p>
     <w:p>
       <w:pPr>
         <w:pStyle w:val="Heading2"/>
@@ -4380,7 +4826,7 @@
           <w:numId w:val="2"/>
         </w:numPr>
       </w:pPr>
-      <w:bookmarkStart w:id="12" w:name="_Toc239531983"/>
+      <w:bookmarkStart w:id="12" w:name="_Toc240048721"/>
       <w:r>
         <w:t xml:space="preserve">Apresentação do </w:t>
       </w:r>
@@ -4391,31 +4837,32 @@
     </w:p>
     <w:p>
       <w:r>
-        <w:t xml:space="preserve">A </w:t>
-      </w:r>
-      <w:r>
-        <w:t xml:space="preserve">apresentação do </w:t>
-      </w:r>
-      <w:r>
-        <w:t>projeto</w:t>
-      </w:r>
-      <w:r>
-        <w:t xml:space="preserve"> será realizada através da demonstração do </w:t>
-      </w:r>
-      <w:r>
-        <w:rPr>
-          <w:rStyle w:val="EstrageirasChar"/>
-        </w:rPr>
-        <w:t>website InfoTech</w:t>
-      </w:r>
-      <w:r>
-        <w:t xml:space="preserve"> no navegador. Serão apresentadas as páginas Início, Sobre, Áreas, Galeria e Contacto, bem como o menu de navegação, os conteúdos educativos e as funcionalidades </w:t>
-      </w:r>
-      <w:r>
-        <w:t>interativas</w:t>
-      </w:r>
-      <w:r>
-        <w:t>.</w:t>
+        <w:t xml:space="preserve">A apresentação do projeto será realizada através da demonstração do </w:t>
+      </w:r>
+      <w:r>
+        <w:rPr>
+          <w:rStyle w:val="EstrageirasChar"/>
+        </w:rPr>
+        <w:t xml:space="preserve">website </w:t>
+      </w:r>
+      <w:proofErr w:type="spellStart"/>
+      <w:r>
+        <w:rPr>
+          <w:rStyle w:val="EstrageirasChar"/>
+        </w:rPr>
+        <w:t>InfoTech</w:t>
+      </w:r>
+      <w:proofErr w:type="spellEnd"/>
+      <w:r>
+        <w:t xml:space="preserve"> no navegador. Serão apresentadas as páginas Início, </w:t>
+      </w:r>
+      <w:proofErr w:type="gramStart"/>
+      <w:r>
+        <w:t>Sobre, Áreas</w:t>
+      </w:r>
+      <w:proofErr w:type="gramEnd"/>
+      <w:r>
+        <w:t>, Galeria e Contacto, bem como o menu de navegação, os conteúdos educativos e as funcionalidades interativas.</w:t>
       </w:r>
     </w:p>
     <w:p>
@@ -4481,6 +4928,7 @@
       <w:r>
         <w:t xml:space="preserve"> educativo </w:t>
       </w:r>
+      <w:proofErr w:type="spellStart"/>
       <w:r>
         <w:rPr>
           <w:b/>
@@ -4490,6 +4938,7 @@
         </w:rPr>
         <w:t>InfoTech</w:t>
       </w:r>
+      <w:proofErr w:type="spellEnd"/>
       <w:r>
         <w:rPr>
           <w:b/>
@@ -4523,7 +4972,7 @@
           <w:numId w:val="2"/>
         </w:numPr>
       </w:pPr>
-      <w:bookmarkStart w:id="13" w:name="_Toc239531984"/>
+      <w:bookmarkStart w:id="13" w:name="_Toc240048722"/>
       <w:r>
         <w:lastRenderedPageBreak/>
         <w:t>CONCLUSÃO</w:t>
@@ -4532,14 +4981,9 @@
     </w:p>
     <w:p>
       <w:r>
-        <w:t xml:space="preserve">A realização do </w:t>
-      </w:r>
-      <w:r>
-        <w:t>projeto</w:t>
-      </w:r>
-      <w:r>
-        <w:t xml:space="preserve"> </w:t>
-      </w:r>
+        <w:t xml:space="preserve">A realização do projeto </w:t>
+      </w:r>
+      <w:proofErr w:type="spellStart"/>
       <w:r>
         <w:rPr>
           <w:rStyle w:val="EstrageirasChar"/>
@@ -4548,6 +4992,7 @@
         </w:rPr>
         <w:t>InfoTech</w:t>
       </w:r>
+      <w:proofErr w:type="spellEnd"/>
       <w:r>
         <w:rPr>
           <w:b/>
@@ -4626,8 +5071,16 @@
         <w:rPr>
           <w:rStyle w:val="EstrageirasChar"/>
         </w:rPr>
-        <w:t>GitHub Pages</w:t>
-      </w:r>
+        <w:t xml:space="preserve">GitHub </w:t>
+      </w:r>
+      <w:proofErr w:type="spellStart"/>
+      <w:r>
+        <w:rPr>
+          <w:rStyle w:val="EstrageirasChar"/>
+        </w:rPr>
+        <w:t>Pages</w:t>
+      </w:r>
+      <w:proofErr w:type="spellEnd"/>
       <w:r>
         <w:t xml:space="preserve"> tornou o </w:t>
       </w:r>
@@ -4647,13 +5100,7 @@
         <w:t>Internet</w:t>
       </w:r>
       <w:r>
-        <w:t xml:space="preserve">. Assim, o </w:t>
-      </w:r>
-      <w:r>
-        <w:t>projeto</w:t>
-      </w:r>
-      <w:r>
-        <w:t xml:space="preserve"> contribuiu para consolidar competências práticas de desenvolvimento </w:t>
+        <w:t xml:space="preserve">. Assim, o projeto contribuiu para consolidar competências práticas de desenvolvimento </w:t>
       </w:r>
       <w:r>
         <w:rPr>
@@ -4662,10 +5109,7 @@
         <w:t>web</w:t>
       </w:r>
       <w:r>
-        <w:t xml:space="preserve">, organização, criatividade, teste e resolução de problemas, resultando num produto digital funcional e </w:t>
-      </w:r>
-      <w:r>
-        <w:t>educativo.</w:t>
+        <w:t>, organização, criatividade, teste e resolução de problemas, resultando num produto digital funcional e educativo.</w:t>
       </w:r>
     </w:p>
     <w:p>
@@ -4685,7 +5129,7 @@
       <w:pPr>
         <w:pStyle w:val="Heading1"/>
       </w:pPr>
-      <w:bookmarkStart w:id="14" w:name="_Toc239531985"/>
+      <w:bookmarkStart w:id="14" w:name="_Toc240048723"/>
       <w:r>
         <w:lastRenderedPageBreak/>
         <w:t>Referências</w:t>
@@ -4756,13 +5200,15 @@
       <w:r>
         <w:t xml:space="preserve"> ago. 2026.</w:t>
       </w:r>
-      <w:hyperlink r:id="rId21" w:tgtFrame="_blank" w:history="1">
+      <w:hyperlink r:id="rId18" w:tgtFrame="_blank" w:history="1">
+        <w:proofErr w:type="gramStart"/>
         <w:r>
           <w:rPr>
             <w:rStyle w:val="Hyperlink"/>
           </w:rPr>
           <w:t>developer.mozilla</w:t>
         </w:r>
+        <w:proofErr w:type="gramEnd"/>
       </w:hyperlink>
     </w:p>
     <w:p>
@@ -4829,13 +5275,15 @@
       <w:r>
         <w:t xml:space="preserve"> ago. 2026.</w:t>
       </w:r>
-      <w:hyperlink r:id="rId22" w:tgtFrame="_blank" w:history="1">
+      <w:hyperlink r:id="rId19" w:tgtFrame="_blank" w:history="1">
+        <w:proofErr w:type="gramStart"/>
         <w:r>
           <w:rPr>
             <w:rStyle w:val="Hyperlink"/>
           </w:rPr>
           <w:t>developer.mozilla</w:t>
         </w:r>
+        <w:proofErr w:type="gramEnd"/>
       </w:hyperlink>
     </w:p>
     <w:p>
@@ -4886,13 +5334,15 @@
       <w:r>
         <w:t xml:space="preserve"> ago. 2026.</w:t>
       </w:r>
-      <w:hyperlink r:id="rId23" w:tgtFrame="_blank" w:history="1">
+      <w:hyperlink r:id="rId20" w:tgtFrame="_blank" w:history="1">
+        <w:proofErr w:type="gramStart"/>
         <w:r>
           <w:rPr>
             <w:rStyle w:val="Hyperlink"/>
           </w:rPr>
           <w:t>developer.mozilla</w:t>
         </w:r>
+        <w:proofErr w:type="gramEnd"/>
       </w:hyperlink>
     </w:p>
     <w:p>
@@ -4932,7 +5382,23 @@
           <w:b/>
           <w:bCs/>
         </w:rPr>
-        <w:t xml:space="preserve"> GitHub Pages?</w:t>
+        <w:t xml:space="preserve"> GitHub </w:t>
+      </w:r>
+      <w:proofErr w:type="spellStart"/>
+      <w:r>
+        <w:rPr>
+          <w:b/>
+          <w:bCs/>
+        </w:rPr>
+        <w:t>Pages</w:t>
+      </w:r>
+      <w:proofErr w:type="spellEnd"/>
+      <w:r>
+        <w:rPr>
+          <w:b/>
+          <w:bCs/>
+        </w:rPr>
+        <w:t>?</w:t>
       </w:r>
       <w:r>
         <w:t xml:space="preserve"> Disponível em: &lt;https://docs.github.com/en/pages/getting-started-with-github-pages/what-is-github-pages&gt;. Acesso em: 2</w:t>
@@ -4943,7 +5409,7 @@
       <w:r>
         <w:t xml:space="preserve"> ago. 2026.</w:t>
       </w:r>
-      <w:hyperlink r:id="rId24" w:tgtFrame="_blank" w:history="1">
+      <w:hyperlink r:id="rId21" w:tgtFrame="_blank" w:history="1">
         <w:r>
           <w:rPr>
             <w:rStyle w:val="Hyperlink"/>
@@ -4973,8 +5439,17 @@
           <w:b/>
           <w:bCs/>
         </w:rPr>
-        <w:t xml:space="preserve"> for GitHub Pages</w:t>
-      </w:r>
+        <w:t xml:space="preserve"> for GitHub </w:t>
+      </w:r>
+      <w:proofErr w:type="spellStart"/>
+      <w:r>
+        <w:rPr>
+          <w:b/>
+          <w:bCs/>
+        </w:rPr>
+        <w:t>Pages</w:t>
+      </w:r>
+      <w:proofErr w:type="spellEnd"/>
       <w:r>
         <w:t>. Disponível em: &lt;https://docs.github.com/pages/quickstart&gt;. Acesso em: 2</w:t>
       </w:r>
@@ -4984,7 +5459,7 @@
       <w:r>
         <w:t xml:space="preserve"> ago. 2026.</w:t>
       </w:r>
-      <w:hyperlink r:id="rId25" w:tgtFrame="_blank" w:history="1">
+      <w:hyperlink r:id="rId22" w:tgtFrame="_blank" w:history="1">
         <w:r>
           <w:rPr>
             <w:rStyle w:val="Hyperlink"/>
@@ -4996,7 +5471,7 @@
     <w:p/>
     <w:p/>
     <w:sectPr>
-      <w:footerReference w:type="default" r:id="rId26"/>
+      <w:footerReference w:type="default" r:id="rId23"/>
       <w:pgSz w:w="12240" w:h="15840"/>
       <w:pgMar w:top="1440" w:right="1440" w:bottom="1440" w:left="1440" w:header="720" w:footer="720" w:gutter="0"/>
       <w:cols w:space="720"/>
@@ -5214,6 +5689,119 @@
     </w:lvl>
   </w:abstractNum>
   <w:abstractNum w:abstractNumId="1" w15:restartNumberingAfterBreak="0">
+    <w:nsid w:val="20505BBE"/>
+    <w:multiLevelType w:val="multilevel"/>
+    <w:tmpl w:val="9B8A9DC2"/>
+    <w:lvl w:ilvl="0">
+      <w:start w:val="2"/>
+      <w:numFmt w:val="decimal"/>
+      <w:lvlText w:val="%1."/>
+      <w:lvlJc w:val="left"/>
+      <w:pPr>
+        <w:ind w:left="480" w:hanging="480"/>
+      </w:pPr>
+      <w:rPr>
+        <w:rFonts w:hint="default"/>
+      </w:rPr>
+    </w:lvl>
+    <w:lvl w:ilvl="1">
+      <w:start w:val="1"/>
+      <w:numFmt w:val="decimal"/>
+      <w:lvlText w:val="%1.%2."/>
+      <w:lvlJc w:val="left"/>
+      <w:pPr>
+        <w:ind w:left="720" w:hanging="720"/>
+      </w:pPr>
+      <w:rPr>
+        <w:rFonts w:hint="default"/>
+      </w:rPr>
+    </w:lvl>
+    <w:lvl w:ilvl="2">
+      <w:start w:val="1"/>
+      <w:numFmt w:val="decimal"/>
+      <w:lvlText w:val="%1.%2.%3."/>
+      <w:lvlJc w:val="left"/>
+      <w:pPr>
+        <w:ind w:left="720" w:hanging="720"/>
+      </w:pPr>
+      <w:rPr>
+        <w:rFonts w:hint="default"/>
+      </w:rPr>
+    </w:lvl>
+    <w:lvl w:ilvl="3">
+      <w:start w:val="1"/>
+      <w:numFmt w:val="decimal"/>
+      <w:lvlText w:val="%1.%2.%3.%4."/>
+      <w:lvlJc w:val="left"/>
+      <w:pPr>
+        <w:ind w:left="1080" w:hanging="1080"/>
+      </w:pPr>
+      <w:rPr>
+        <w:rFonts w:hint="default"/>
+      </w:rPr>
+    </w:lvl>
+    <w:lvl w:ilvl="4">
+      <w:start w:val="1"/>
+      <w:numFmt w:val="decimal"/>
+      <w:lvlText w:val="%1.%2.%3.%4.%5."/>
+      <w:lvlJc w:val="left"/>
+      <w:pPr>
+        <w:ind w:left="1440" w:hanging="1440"/>
+      </w:pPr>
+      <w:rPr>
+        <w:rFonts w:hint="default"/>
+      </w:rPr>
+    </w:lvl>
+    <w:lvl w:ilvl="5">
+      <w:start w:val="1"/>
+      <w:numFmt w:val="decimal"/>
+      <w:lvlText w:val="%1.%2.%3.%4.%5.%6."/>
+      <w:lvlJc w:val="left"/>
+      <w:pPr>
+        <w:ind w:left="1440" w:hanging="1440"/>
+      </w:pPr>
+      <w:rPr>
+        <w:rFonts w:hint="default"/>
+      </w:rPr>
+    </w:lvl>
+    <w:lvl w:ilvl="6">
+      <w:start w:val="1"/>
+      <w:numFmt w:val="decimal"/>
+      <w:lvlText w:val="%1.%2.%3.%4.%5.%6.%7."/>
+      <w:lvlJc w:val="left"/>
+      <w:pPr>
+        <w:ind w:left="1800" w:hanging="1800"/>
+      </w:pPr>
+      <w:rPr>
+        <w:rFonts w:hint="default"/>
+      </w:rPr>
+    </w:lvl>
+    <w:lvl w:ilvl="7">
+      <w:start w:val="1"/>
+      <w:numFmt w:val="decimal"/>
+      <w:lvlText w:val="%1.%2.%3.%4.%5.%6.%7.%8."/>
+      <w:lvlJc w:val="left"/>
+      <w:pPr>
+        <w:ind w:left="2160" w:hanging="2160"/>
+      </w:pPr>
+      <w:rPr>
+        <w:rFonts w:hint="default"/>
+      </w:rPr>
+    </w:lvl>
+    <w:lvl w:ilvl="8">
+      <w:start w:val="1"/>
+      <w:numFmt w:val="decimal"/>
+      <w:lvlText w:val="%1.%2.%3.%4.%5.%6.%7.%8.%9."/>
+      <w:lvlJc w:val="left"/>
+      <w:pPr>
+        <w:ind w:left="2160" w:hanging="2160"/>
+      </w:pPr>
+      <w:rPr>
+        <w:rFonts w:hint="default"/>
+      </w:rPr>
+    </w:lvl>
+  </w:abstractNum>
+  <w:abstractNum w:abstractNumId="2" w15:restartNumberingAfterBreak="0">
     <w:nsid w:val="3B795A61"/>
     <w:multiLevelType w:val="hybridMultilevel"/>
     <w:tmpl w:val="FF18E49C"/>
@@ -5302,7 +5890,156 @@
       </w:pPr>
     </w:lvl>
   </w:abstractNum>
-  <w:abstractNum w:abstractNumId="2" w15:restartNumberingAfterBreak="0">
+  <w:abstractNum w:abstractNumId="3" w15:restartNumberingAfterBreak="0">
+    <w:nsid w:val="4CBD279D"/>
+    <w:multiLevelType w:val="multilevel"/>
+    <w:tmpl w:val="DB500776"/>
+    <w:lvl w:ilvl="0">
+      <w:start w:val="1"/>
+      <w:numFmt w:val="bullet"/>
+      <w:lvlText w:val=""/>
+      <w:lvlJc w:val="left"/>
+      <w:pPr>
+        <w:tabs>
+          <w:tab w:val="num" w:pos="720"/>
+        </w:tabs>
+        <w:ind w:left="720" w:hanging="360"/>
+      </w:pPr>
+      <w:rPr>
+        <w:rFonts w:ascii="Symbol" w:hAnsi="Symbol" w:hint="default"/>
+        <w:sz w:val="20"/>
+      </w:rPr>
+    </w:lvl>
+    <w:lvl w:ilvl="1" w:tentative="1">
+      <w:start w:val="1"/>
+      <w:numFmt w:val="bullet"/>
+      <w:lvlText w:val="o"/>
+      <w:lvlJc w:val="left"/>
+      <w:pPr>
+        <w:tabs>
+          <w:tab w:val="num" w:pos="1440"/>
+        </w:tabs>
+        <w:ind w:left="1440" w:hanging="360"/>
+      </w:pPr>
+      <w:rPr>
+        <w:rFonts w:ascii="Courier New" w:hAnsi="Courier New" w:hint="default"/>
+        <w:sz w:val="20"/>
+      </w:rPr>
+    </w:lvl>
+    <w:lvl w:ilvl="2" w:tentative="1">
+      <w:start w:val="1"/>
+      <w:numFmt w:val="bullet"/>
+      <w:lvlText w:val=""/>
+      <w:lvlJc w:val="left"/>
+      <w:pPr>
+        <w:tabs>
+          <w:tab w:val="num" w:pos="2160"/>
+        </w:tabs>
+        <w:ind w:left="2160" w:hanging="360"/>
+      </w:pPr>
+      <w:rPr>
+        <w:rFonts w:ascii="Wingdings" w:hAnsi="Wingdings" w:hint="default"/>
+        <w:sz w:val="20"/>
+      </w:rPr>
+    </w:lvl>
+    <w:lvl w:ilvl="3" w:tentative="1">
+      <w:start w:val="1"/>
+      <w:numFmt w:val="bullet"/>
+      <w:lvlText w:val=""/>
+      <w:lvlJc w:val="left"/>
+      <w:pPr>
+        <w:tabs>
+          <w:tab w:val="num" w:pos="2880"/>
+        </w:tabs>
+        <w:ind w:left="2880" w:hanging="360"/>
+      </w:pPr>
+      <w:rPr>
+        <w:rFonts w:ascii="Wingdings" w:hAnsi="Wingdings" w:hint="default"/>
+        <w:sz w:val="20"/>
+      </w:rPr>
+    </w:lvl>
+    <w:lvl w:ilvl="4" w:tentative="1">
+      <w:start w:val="1"/>
+      <w:numFmt w:val="bullet"/>
+      <w:lvlText w:val=""/>
+      <w:lvlJc w:val="left"/>
+      <w:pPr>
+        <w:tabs>
+          <w:tab w:val="num" w:pos="3600"/>
+        </w:tabs>
+        <w:ind w:left="3600" w:hanging="360"/>
+      </w:pPr>
+      <w:rPr>
+        <w:rFonts w:ascii="Wingdings" w:hAnsi="Wingdings" w:hint="default"/>
+        <w:sz w:val="20"/>
+      </w:rPr>
+    </w:lvl>
+    <w:lvl w:ilvl="5" w:tentative="1">
+      <w:start w:val="1"/>
+      <w:numFmt w:val="bullet"/>
+      <w:lvlText w:val=""/>
+      <w:lvlJc w:val="left"/>
+      <w:pPr>
+        <w:tabs>
+          <w:tab w:val="num" w:pos="4320"/>
+        </w:tabs>
+        <w:ind w:left="4320" w:hanging="360"/>
+      </w:pPr>
+      <w:rPr>
+        <w:rFonts w:ascii="Wingdings" w:hAnsi="Wingdings" w:hint="default"/>
+        <w:sz w:val="20"/>
+      </w:rPr>
+    </w:lvl>
+    <w:lvl w:ilvl="6" w:tentative="1">
+      <w:start w:val="1"/>
+      <w:numFmt w:val="bullet"/>
+      <w:lvlText w:val=""/>
+      <w:lvlJc w:val="left"/>
+      <w:pPr>
+        <w:tabs>
+          <w:tab w:val="num" w:pos="5040"/>
+        </w:tabs>
+        <w:ind w:left="5040" w:hanging="360"/>
+      </w:pPr>
+      <w:rPr>
+        <w:rFonts w:ascii="Wingdings" w:hAnsi="Wingdings" w:hint="default"/>
+        <w:sz w:val="20"/>
+      </w:rPr>
+    </w:lvl>
+    <w:lvl w:ilvl="7" w:tentative="1">
+      <w:start w:val="1"/>
+      <w:numFmt w:val="bullet"/>
+      <w:lvlText w:val=""/>
+      <w:lvlJc w:val="left"/>
+      <w:pPr>
+        <w:tabs>
+          <w:tab w:val="num" w:pos="5760"/>
+        </w:tabs>
+        <w:ind w:left="5760" w:hanging="360"/>
+      </w:pPr>
+      <w:rPr>
+        <w:rFonts w:ascii="Wingdings" w:hAnsi="Wingdings" w:hint="default"/>
+        <w:sz w:val="20"/>
+      </w:rPr>
+    </w:lvl>
+    <w:lvl w:ilvl="8" w:tentative="1">
+      <w:start w:val="1"/>
+      <w:numFmt w:val="bullet"/>
+      <w:lvlText w:val=""/>
+      <w:lvlJc w:val="left"/>
+      <w:pPr>
+        <w:tabs>
+          <w:tab w:val="num" w:pos="6480"/>
+        </w:tabs>
+        <w:ind w:left="6480" w:hanging="360"/>
+      </w:pPr>
+      <w:rPr>
+        <w:rFonts w:ascii="Wingdings" w:hAnsi="Wingdings" w:hint="default"/>
+        <w:sz w:val="20"/>
+      </w:rPr>
+    </w:lvl>
+  </w:abstractNum>
+  <w:abstractNum w:abstractNumId="4" w15:restartNumberingAfterBreak="0">
     <w:nsid w:val="55F7321B"/>
     <w:multiLevelType w:val="multilevel"/>
     <w:tmpl w:val="45A65FA0"/>
@@ -5423,14 +6160,136 @@
       </w:rPr>
     </w:lvl>
   </w:abstractNum>
+  <w:abstractNum w:abstractNumId="5" w15:restartNumberingAfterBreak="0">
+    <w:nsid w:val="6C8E4875"/>
+    <w:multiLevelType w:val="multilevel"/>
+    <w:tmpl w:val="0B704028"/>
+    <w:lvl w:ilvl="0">
+      <w:start w:val="2"/>
+      <w:numFmt w:val="decimal"/>
+      <w:lvlText w:val="%1"/>
+      <w:lvlJc w:val="left"/>
+      <w:pPr>
+        <w:ind w:left="570" w:hanging="570"/>
+      </w:pPr>
+      <w:rPr>
+        <w:rFonts w:hint="default"/>
+      </w:rPr>
+    </w:lvl>
+    <w:lvl w:ilvl="1">
+      <w:start w:val="10"/>
+      <w:numFmt w:val="decimal"/>
+      <w:lvlText w:val="%1.%2"/>
+      <w:lvlJc w:val="left"/>
+      <w:pPr>
+        <w:ind w:left="720" w:hanging="720"/>
+      </w:pPr>
+      <w:rPr>
+        <w:rFonts w:hint="default"/>
+      </w:rPr>
+    </w:lvl>
+    <w:lvl w:ilvl="2">
+      <w:start w:val="1"/>
+      <w:numFmt w:val="decimal"/>
+      <w:lvlText w:val="%1.%2.%3"/>
+      <w:lvlJc w:val="left"/>
+      <w:pPr>
+        <w:ind w:left="720" w:hanging="720"/>
+      </w:pPr>
+      <w:rPr>
+        <w:rFonts w:hint="default"/>
+      </w:rPr>
+    </w:lvl>
+    <w:lvl w:ilvl="3">
+      <w:start w:val="1"/>
+      <w:numFmt w:val="decimal"/>
+      <w:lvlText w:val="%1.%2.%3.%4"/>
+      <w:lvlJc w:val="left"/>
+      <w:pPr>
+        <w:ind w:left="1080" w:hanging="1080"/>
+      </w:pPr>
+      <w:rPr>
+        <w:rFonts w:hint="default"/>
+      </w:rPr>
+    </w:lvl>
+    <w:lvl w:ilvl="4">
+      <w:start w:val="1"/>
+      <w:numFmt w:val="decimal"/>
+      <w:lvlText w:val="%1.%2.%3.%4.%5"/>
+      <w:lvlJc w:val="left"/>
+      <w:pPr>
+        <w:ind w:left="1440" w:hanging="1440"/>
+      </w:pPr>
+      <w:rPr>
+        <w:rFonts w:hint="default"/>
+      </w:rPr>
+    </w:lvl>
+    <w:lvl w:ilvl="5">
+      <w:start w:val="1"/>
+      <w:numFmt w:val="decimal"/>
+      <w:lvlText w:val="%1.%2.%3.%4.%5.%6"/>
+      <w:lvlJc w:val="left"/>
+      <w:pPr>
+        <w:ind w:left="1440" w:hanging="1440"/>
+      </w:pPr>
+      <w:rPr>
+        <w:rFonts w:hint="default"/>
+      </w:rPr>
+    </w:lvl>
+    <w:lvl w:ilvl="6">
+      <w:start w:val="1"/>
+      <w:numFmt w:val="decimal"/>
+      <w:lvlText w:val="%1.%2.%3.%4.%5.%6.%7"/>
+      <w:lvlJc w:val="left"/>
+      <w:pPr>
+        <w:ind w:left="1800" w:hanging="1800"/>
+      </w:pPr>
+      <w:rPr>
+        <w:rFonts w:hint="default"/>
+      </w:rPr>
+    </w:lvl>
+    <w:lvl w:ilvl="7">
+      <w:start w:val="1"/>
+      <w:numFmt w:val="decimal"/>
+      <w:lvlText w:val="%1.%2.%3.%4.%5.%6.%7.%8"/>
+      <w:lvlJc w:val="left"/>
+      <w:pPr>
+        <w:ind w:left="2160" w:hanging="2160"/>
+      </w:pPr>
+      <w:rPr>
+        <w:rFonts w:hint="default"/>
+      </w:rPr>
+    </w:lvl>
+    <w:lvl w:ilvl="8">
+      <w:start w:val="1"/>
+      <w:numFmt w:val="decimal"/>
+      <w:lvlText w:val="%1.%2.%3.%4.%5.%6.%7.%8.%9"/>
+      <w:lvlJc w:val="left"/>
+      <w:pPr>
+        <w:ind w:left="2160" w:hanging="2160"/>
+      </w:pPr>
+      <w:rPr>
+        <w:rFonts w:hint="default"/>
+      </w:rPr>
+    </w:lvl>
+  </w:abstractNum>
   <w:num w:numId="1" w16cid:durableId="1611090037">
-    <w:abstractNumId w:val="1"/>
+    <w:abstractNumId w:val="2"/>
   </w:num>
   <w:num w:numId="2" w16cid:durableId="112481610">
-    <w:abstractNumId w:val="2"/>
+    <w:abstractNumId w:val="4"/>
   </w:num>
   <w:num w:numId="3" w16cid:durableId="32116333">
     <w:abstractNumId w:val="0"/>
+  </w:num>
+  <w:num w:numId="4" w16cid:durableId="1332029623">
+    <w:abstractNumId w:val="5"/>
+  </w:num>
+  <w:num w:numId="5" w16cid:durableId="1464731133">
+    <w:abstractNumId w:val="1"/>
+  </w:num>
+  <w:num w:numId="6" w16cid:durableId="1312518178">
+    <w:abstractNumId w:val="3"/>
   </w:num>
 </w:numbering>
 </file>

</xml_diff>

<commit_message>
Make last card span full row and center it
Add CSS rule so .cards-grid > .card:last-child spans the full grid (grid-column: 1 / -1), is constrained to max-width: 420px, and is horizontally centered (justify-self: center). Also updated the Word doc at doc/Documentação - InfoTech by Júlio Mulhanga.docx (binary changes).
</commit_message>
<xml_diff>
--- a/doc/Documentação - InfoTech by Júlio Mulhanga.docx
+++ b/doc/Documentação - InfoTech by Júlio Mulhanga.docx
@@ -47,6 +47,8 @@
             </w:tabs>
             <w:rPr>
               <w:rFonts w:asciiTheme="minorHAnsi" w:eastAsiaTheme="minorEastAsia" w:hAnsiTheme="minorHAnsi"/>
+              <w:noProof/>
+              <w:lang w:val="en-US"/>
             </w:rPr>
           </w:pPr>
           <w:r>
@@ -58,50 +60,58 @@
           <w:r>
             <w:fldChar w:fldCharType="separate"/>
           </w:r>
-          <w:hyperlink w:anchor="_Toc240048709" w:history="1">
+          <w:hyperlink w:anchor="_Toc240375547" w:history="1">
             <w:r>
               <w:rPr>
                 <w:rStyle w:val="Hyperlink"/>
+                <w:noProof/>
               </w:rPr>
               <w:t>RESUMO</w:t>
             </w:r>
             <w:r>
               <w:rPr>
+                <w:noProof/>
                 <w:webHidden/>
               </w:rPr>
               <w:tab/>
             </w:r>
             <w:r>
               <w:rPr>
+                <w:noProof/>
                 <w:webHidden/>
               </w:rPr>
               <w:fldChar w:fldCharType="begin"/>
             </w:r>
             <w:r>
               <w:rPr>
-                <w:webHidden/>
-              </w:rPr>
-              <w:instrText xml:space="preserve"> PAGEREF _Toc240048709 \h </w:instrText>
-            </w:r>
-            <w:r>
-              <w:rPr>
-                <w:webHidden/>
-              </w:rPr>
-            </w:r>
-            <w:r>
-              <w:rPr>
+                <w:noProof/>
+                <w:webHidden/>
+              </w:rPr>
+              <w:instrText xml:space="preserve"> PAGEREF _Toc240375547 \h </w:instrText>
+            </w:r>
+            <w:r>
+              <w:rPr>
+                <w:noProof/>
+                <w:webHidden/>
+              </w:rPr>
+            </w:r>
+            <w:r>
+              <w:rPr>
+                <w:noProof/>
                 <w:webHidden/>
               </w:rPr>
               <w:fldChar w:fldCharType="separate"/>
             </w:r>
             <w:r>
               <w:rPr>
+                <w:noProof/>
                 <w:webHidden/>
               </w:rPr>
               <w:t>2</w:t>
             </w:r>
             <w:r>
               <w:rPr>
+                <w:noProof/>
                 <w:webHidden/>
               </w:rPr>
               <w:fldChar w:fldCharType="end"/>
@@ -117,64 +127,77 @@
             </w:tabs>
             <w:rPr>
               <w:rFonts w:asciiTheme="minorHAnsi" w:eastAsiaTheme="minorEastAsia" w:hAnsiTheme="minorHAnsi"/>
+              <w:noProof/>
+              <w:lang w:val="en-US"/>
             </w:rPr>
           </w:pPr>
-          <w:hyperlink w:anchor="_Toc240048710" w:history="1">
+          <w:hyperlink w:anchor="_Toc240375548" w:history="1">
             <w:r>
               <w:rPr>
                 <w:rStyle w:val="Hyperlink"/>
+                <w:noProof/>
               </w:rPr>
               <w:t>1.</w:t>
             </w:r>
             <w:r>
               <w:rPr>
                 <w:rFonts w:asciiTheme="minorHAnsi" w:eastAsiaTheme="minorEastAsia" w:hAnsiTheme="minorHAnsi"/>
+                <w:noProof/>
+                <w:lang w:val="en-US"/>
               </w:rPr>
               <w:tab/>
             </w:r>
             <w:r>
               <w:rPr>
                 <w:rStyle w:val="Hyperlink"/>
+                <w:noProof/>
               </w:rPr>
               <w:t>INTRODUÇÃO</w:t>
             </w:r>
             <w:r>
               <w:rPr>
+                <w:noProof/>
                 <w:webHidden/>
               </w:rPr>
               <w:tab/>
             </w:r>
             <w:r>
               <w:rPr>
+                <w:noProof/>
                 <w:webHidden/>
               </w:rPr>
               <w:fldChar w:fldCharType="begin"/>
             </w:r>
             <w:r>
               <w:rPr>
-                <w:webHidden/>
-              </w:rPr>
-              <w:instrText xml:space="preserve"> PAGEREF _Toc240048710 \h </w:instrText>
-            </w:r>
-            <w:r>
-              <w:rPr>
-                <w:webHidden/>
-              </w:rPr>
-            </w:r>
-            <w:r>
-              <w:rPr>
+                <w:noProof/>
+                <w:webHidden/>
+              </w:rPr>
+              <w:instrText xml:space="preserve"> PAGEREF _Toc240375548 \h </w:instrText>
+            </w:r>
+            <w:r>
+              <w:rPr>
+                <w:noProof/>
+                <w:webHidden/>
+              </w:rPr>
+            </w:r>
+            <w:r>
+              <w:rPr>
+                <w:noProof/>
                 <w:webHidden/>
               </w:rPr>
               <w:fldChar w:fldCharType="separate"/>
             </w:r>
             <w:r>
               <w:rPr>
+                <w:noProof/>
                 <w:webHidden/>
               </w:rPr>
               <w:t>3</w:t>
             </w:r>
             <w:r>
               <w:rPr>
+                <w:noProof/>
                 <w:webHidden/>
               </w:rPr>
               <w:fldChar w:fldCharType="end"/>
@@ -190,64 +213,77 @@
             </w:tabs>
             <w:rPr>
               <w:rFonts w:asciiTheme="minorHAnsi" w:eastAsiaTheme="minorEastAsia" w:hAnsiTheme="minorHAnsi"/>
+              <w:noProof/>
+              <w:lang w:val="en-US"/>
             </w:rPr>
           </w:pPr>
-          <w:hyperlink w:anchor="_Toc240048711" w:history="1">
+          <w:hyperlink w:anchor="_Toc240375549" w:history="1">
             <w:r>
               <w:rPr>
                 <w:rStyle w:val="Hyperlink"/>
+                <w:noProof/>
               </w:rPr>
               <w:t>2.</w:t>
             </w:r>
             <w:r>
               <w:rPr>
                 <w:rFonts w:asciiTheme="minorHAnsi" w:eastAsiaTheme="minorEastAsia" w:hAnsiTheme="minorHAnsi"/>
+                <w:noProof/>
+                <w:lang w:val="en-US"/>
               </w:rPr>
               <w:tab/>
             </w:r>
             <w:r>
               <w:rPr>
                 <w:rStyle w:val="Hyperlink"/>
+                <w:noProof/>
               </w:rPr>
               <w:t>DESENVOLVIMENTO</w:t>
             </w:r>
             <w:r>
               <w:rPr>
+                <w:noProof/>
                 <w:webHidden/>
               </w:rPr>
               <w:tab/>
             </w:r>
             <w:r>
               <w:rPr>
+                <w:noProof/>
                 <w:webHidden/>
               </w:rPr>
               <w:fldChar w:fldCharType="begin"/>
             </w:r>
             <w:r>
               <w:rPr>
-                <w:webHidden/>
-              </w:rPr>
-              <w:instrText xml:space="preserve"> PAGEREF _Toc240048711 \h </w:instrText>
-            </w:r>
-            <w:r>
-              <w:rPr>
-                <w:webHidden/>
-              </w:rPr>
-            </w:r>
-            <w:r>
-              <w:rPr>
+                <w:noProof/>
+                <w:webHidden/>
+              </w:rPr>
+              <w:instrText xml:space="preserve"> PAGEREF _Toc240375549 \h </w:instrText>
+            </w:r>
+            <w:r>
+              <w:rPr>
+                <w:noProof/>
+                <w:webHidden/>
+              </w:rPr>
+            </w:r>
+            <w:r>
+              <w:rPr>
+                <w:noProof/>
                 <w:webHidden/>
               </w:rPr>
               <w:fldChar w:fldCharType="separate"/>
             </w:r>
             <w:r>
               <w:rPr>
+                <w:noProof/>
                 <w:webHidden/>
               </w:rPr>
               <w:t>4</w:t>
             </w:r>
             <w:r>
               <w:rPr>
+                <w:noProof/>
                 <w:webHidden/>
               </w:rPr>
               <w:fldChar w:fldCharType="end"/>
@@ -263,64 +299,77 @@
             </w:tabs>
             <w:rPr>
               <w:rFonts w:asciiTheme="minorHAnsi" w:eastAsiaTheme="minorEastAsia" w:hAnsiTheme="minorHAnsi"/>
+              <w:noProof/>
+              <w:lang w:val="en-US"/>
             </w:rPr>
           </w:pPr>
-          <w:hyperlink w:anchor="_Toc240048712" w:history="1">
+          <w:hyperlink w:anchor="_Toc240375550" w:history="1">
             <w:r>
               <w:rPr>
                 <w:rStyle w:val="Hyperlink"/>
+                <w:noProof/>
               </w:rPr>
               <w:t>2.1.</w:t>
             </w:r>
             <w:r>
               <w:rPr>
                 <w:rFonts w:asciiTheme="minorHAnsi" w:eastAsiaTheme="minorEastAsia" w:hAnsiTheme="minorHAnsi"/>
+                <w:noProof/>
+                <w:lang w:val="en-US"/>
               </w:rPr>
               <w:tab/>
             </w:r>
             <w:r>
               <w:rPr>
                 <w:rStyle w:val="Hyperlink"/>
+                <w:noProof/>
               </w:rPr>
               <w:t>Metodologia</w:t>
             </w:r>
             <w:r>
               <w:rPr>
+                <w:noProof/>
                 <w:webHidden/>
               </w:rPr>
               <w:tab/>
             </w:r>
             <w:r>
               <w:rPr>
+                <w:noProof/>
                 <w:webHidden/>
               </w:rPr>
               <w:fldChar w:fldCharType="begin"/>
             </w:r>
             <w:r>
               <w:rPr>
-                <w:webHidden/>
-              </w:rPr>
-              <w:instrText xml:space="preserve"> PAGEREF _Toc240048712 \h </w:instrText>
-            </w:r>
-            <w:r>
-              <w:rPr>
-                <w:webHidden/>
-              </w:rPr>
-            </w:r>
-            <w:r>
-              <w:rPr>
+                <w:noProof/>
+                <w:webHidden/>
+              </w:rPr>
+              <w:instrText xml:space="preserve"> PAGEREF _Toc240375550 \h </w:instrText>
+            </w:r>
+            <w:r>
+              <w:rPr>
+                <w:noProof/>
+                <w:webHidden/>
+              </w:rPr>
+            </w:r>
+            <w:r>
+              <w:rPr>
+                <w:noProof/>
                 <w:webHidden/>
               </w:rPr>
               <w:fldChar w:fldCharType="separate"/>
             </w:r>
             <w:r>
               <w:rPr>
+                <w:noProof/>
                 <w:webHidden/>
               </w:rPr>
               <w:t>4</w:t>
             </w:r>
             <w:r>
               <w:rPr>
+                <w:noProof/>
                 <w:webHidden/>
               </w:rPr>
               <w:fldChar w:fldCharType="end"/>
@@ -336,64 +385,77 @@
             </w:tabs>
             <w:rPr>
               <w:rFonts w:asciiTheme="minorHAnsi" w:eastAsiaTheme="minorEastAsia" w:hAnsiTheme="minorHAnsi"/>
+              <w:noProof/>
+              <w:lang w:val="en-US"/>
             </w:rPr>
           </w:pPr>
-          <w:hyperlink w:anchor="_Toc240048713" w:history="1">
+          <w:hyperlink w:anchor="_Toc240375551" w:history="1">
             <w:r>
               <w:rPr>
                 <w:rStyle w:val="Hyperlink"/>
+                <w:noProof/>
               </w:rPr>
               <w:t>2.2.</w:t>
             </w:r>
             <w:r>
               <w:rPr>
                 <w:rFonts w:asciiTheme="minorHAnsi" w:eastAsiaTheme="minorEastAsia" w:hAnsiTheme="minorHAnsi"/>
+                <w:noProof/>
+                <w:lang w:val="en-US"/>
               </w:rPr>
               <w:tab/>
             </w:r>
             <w:r>
               <w:rPr>
                 <w:rStyle w:val="Hyperlink"/>
+                <w:noProof/>
               </w:rPr>
               <w:t>Tipo de Site</w:t>
             </w:r>
             <w:r>
               <w:rPr>
+                <w:noProof/>
                 <w:webHidden/>
               </w:rPr>
               <w:tab/>
             </w:r>
             <w:r>
               <w:rPr>
+                <w:noProof/>
                 <w:webHidden/>
               </w:rPr>
               <w:fldChar w:fldCharType="begin"/>
             </w:r>
             <w:r>
               <w:rPr>
-                <w:webHidden/>
-              </w:rPr>
-              <w:instrText xml:space="preserve"> PAGEREF _Toc240048713 \h </w:instrText>
-            </w:r>
-            <w:r>
-              <w:rPr>
-                <w:webHidden/>
-              </w:rPr>
-            </w:r>
-            <w:r>
-              <w:rPr>
+                <w:noProof/>
+                <w:webHidden/>
+              </w:rPr>
+              <w:instrText xml:space="preserve"> PAGEREF _Toc240375551 \h </w:instrText>
+            </w:r>
+            <w:r>
+              <w:rPr>
+                <w:noProof/>
+                <w:webHidden/>
+              </w:rPr>
+            </w:r>
+            <w:r>
+              <w:rPr>
+                <w:noProof/>
                 <w:webHidden/>
               </w:rPr>
               <w:fldChar w:fldCharType="separate"/>
             </w:r>
             <w:r>
               <w:rPr>
+                <w:noProof/>
                 <w:webHidden/>
               </w:rPr>
               <w:t>4</w:t>
             </w:r>
             <w:r>
               <w:rPr>
+                <w:noProof/>
                 <w:webHidden/>
               </w:rPr>
               <w:fldChar w:fldCharType="end"/>
@@ -409,64 +471,77 @@
             </w:tabs>
             <w:rPr>
               <w:rFonts w:asciiTheme="minorHAnsi" w:eastAsiaTheme="minorEastAsia" w:hAnsiTheme="minorHAnsi"/>
+              <w:noProof/>
+              <w:lang w:val="en-US"/>
             </w:rPr>
           </w:pPr>
-          <w:hyperlink w:anchor="_Toc240048714" w:history="1">
+          <w:hyperlink w:anchor="_Toc240375552" w:history="1">
             <w:r>
               <w:rPr>
                 <w:rStyle w:val="Hyperlink"/>
+                <w:noProof/>
               </w:rPr>
               <w:t>2.3.</w:t>
             </w:r>
             <w:r>
               <w:rPr>
                 <w:rFonts w:asciiTheme="minorHAnsi" w:eastAsiaTheme="minorEastAsia" w:hAnsiTheme="minorHAnsi"/>
+                <w:noProof/>
+                <w:lang w:val="en-US"/>
               </w:rPr>
               <w:tab/>
             </w:r>
             <w:r>
               <w:rPr>
                 <w:rStyle w:val="Hyperlink"/>
+                <w:noProof/>
               </w:rPr>
               <w:t>Arquitetura da Informação</w:t>
             </w:r>
             <w:r>
               <w:rPr>
+                <w:noProof/>
                 <w:webHidden/>
               </w:rPr>
               <w:tab/>
             </w:r>
             <w:r>
               <w:rPr>
+                <w:noProof/>
                 <w:webHidden/>
               </w:rPr>
               <w:fldChar w:fldCharType="begin"/>
             </w:r>
             <w:r>
               <w:rPr>
-                <w:webHidden/>
-              </w:rPr>
-              <w:instrText xml:space="preserve"> PAGEREF _Toc240048714 \h </w:instrText>
-            </w:r>
-            <w:r>
-              <w:rPr>
-                <w:webHidden/>
-              </w:rPr>
-            </w:r>
-            <w:r>
-              <w:rPr>
+                <w:noProof/>
+                <w:webHidden/>
+              </w:rPr>
+              <w:instrText xml:space="preserve"> PAGEREF _Toc240375552 \h </w:instrText>
+            </w:r>
+            <w:r>
+              <w:rPr>
+                <w:noProof/>
+                <w:webHidden/>
+              </w:rPr>
+            </w:r>
+            <w:r>
+              <w:rPr>
+                <w:noProof/>
                 <w:webHidden/>
               </w:rPr>
               <w:fldChar w:fldCharType="separate"/>
             </w:r>
             <w:r>
               <w:rPr>
+                <w:noProof/>
                 <w:webHidden/>
               </w:rPr>
               <w:t>5</w:t>
             </w:r>
             <w:r>
               <w:rPr>
+                <w:noProof/>
                 <w:webHidden/>
               </w:rPr>
               <w:fldChar w:fldCharType="end"/>
@@ -482,18 +557,23 @@
             </w:tabs>
             <w:rPr>
               <w:rFonts w:asciiTheme="minorHAnsi" w:eastAsiaTheme="minorEastAsia" w:hAnsiTheme="minorHAnsi"/>
+              <w:noProof/>
+              <w:lang w:val="en-US"/>
             </w:rPr>
           </w:pPr>
-          <w:hyperlink w:anchor="_Toc240048715" w:history="1">
+          <w:hyperlink w:anchor="_Toc240375553" w:history="1">
             <w:r>
               <w:rPr>
                 <w:rStyle w:val="Hyperlink"/>
+                <w:noProof/>
               </w:rPr>
               <w:t>2.4.</w:t>
             </w:r>
             <w:r>
               <w:rPr>
                 <w:rFonts w:asciiTheme="minorHAnsi" w:eastAsiaTheme="minorEastAsia" w:hAnsiTheme="minorHAnsi"/>
+                <w:noProof/>
+                <w:lang w:val="en-US"/>
               </w:rPr>
               <w:tab/>
             </w:r>
@@ -501,12 +581,14 @@
               <w:rPr>
                 <w:rStyle w:val="Hyperlink"/>
                 <w:i/>
+                <w:noProof/>
               </w:rPr>
               <w:t>Layout</w:t>
             </w:r>
             <w:r>
               <w:rPr>
                 <w:rStyle w:val="Hyperlink"/>
+                <w:noProof/>
               </w:rPr>
               <w:t xml:space="preserve"> da </w:t>
             </w:r>
@@ -514,12 +596,14 @@
               <w:rPr>
                 <w:rStyle w:val="Hyperlink"/>
                 <w:i/>
+                <w:noProof/>
               </w:rPr>
               <w:t>Home</w:t>
             </w:r>
             <w:r>
               <w:rPr>
                 <w:rStyle w:val="Hyperlink"/>
+                <w:noProof/>
               </w:rPr>
               <w:t xml:space="preserve"> </w:t>
             </w:r>
@@ -527,46 +611,54 @@
               <w:rPr>
                 <w:rStyle w:val="Hyperlink"/>
                 <w:i/>
+                <w:noProof/>
               </w:rPr>
               <w:t>Page</w:t>
             </w:r>
             <w:r>
               <w:rPr>
+                <w:noProof/>
                 <w:webHidden/>
               </w:rPr>
               <w:tab/>
             </w:r>
             <w:r>
               <w:rPr>
+                <w:noProof/>
                 <w:webHidden/>
               </w:rPr>
               <w:fldChar w:fldCharType="begin"/>
             </w:r>
             <w:r>
               <w:rPr>
-                <w:webHidden/>
-              </w:rPr>
-              <w:instrText xml:space="preserve"> PAGEREF _Toc240048715 \h </w:instrText>
-            </w:r>
-            <w:r>
-              <w:rPr>
-                <w:webHidden/>
-              </w:rPr>
-            </w:r>
-            <w:r>
-              <w:rPr>
+                <w:noProof/>
+                <w:webHidden/>
+              </w:rPr>
+              <w:instrText xml:space="preserve"> PAGEREF _Toc240375553 \h </w:instrText>
+            </w:r>
+            <w:r>
+              <w:rPr>
+                <w:noProof/>
+                <w:webHidden/>
+              </w:rPr>
+            </w:r>
+            <w:r>
+              <w:rPr>
+                <w:noProof/>
                 <w:webHidden/>
               </w:rPr>
               <w:fldChar w:fldCharType="separate"/>
             </w:r>
             <w:r>
               <w:rPr>
+                <w:noProof/>
                 <w:webHidden/>
               </w:rPr>
               <w:t>6</w:t>
             </w:r>
             <w:r>
               <w:rPr>
+                <w:noProof/>
                 <w:webHidden/>
               </w:rPr>
               <w:fldChar w:fldCharType="end"/>
@@ -582,64 +674,163 @@
             </w:tabs>
             <w:rPr>
               <w:rFonts w:asciiTheme="minorHAnsi" w:eastAsiaTheme="minorEastAsia" w:hAnsiTheme="minorHAnsi"/>
+              <w:noProof/>
+              <w:lang w:val="en-US"/>
             </w:rPr>
           </w:pPr>
-          <w:hyperlink w:anchor="_Toc240048716" w:history="1">
+          <w:hyperlink w:anchor="_Toc240375554" w:history="1">
             <w:r>
               <w:rPr>
                 <w:rStyle w:val="Hyperlink"/>
+                <w:noProof/>
               </w:rPr>
               <w:t>2.5.</w:t>
             </w:r>
             <w:r>
               <w:rPr>
                 <w:rFonts w:asciiTheme="minorHAnsi" w:eastAsiaTheme="minorEastAsia" w:hAnsiTheme="minorHAnsi"/>
+                <w:noProof/>
+                <w:lang w:val="en-US"/>
               </w:rPr>
               <w:tab/>
             </w:r>
             <w:r>
               <w:rPr>
                 <w:rStyle w:val="Hyperlink"/>
+                <w:noProof/>
               </w:rPr>
               <w:t>Diagramação das Páginas</w:t>
             </w:r>
             <w:r>
               <w:rPr>
+                <w:noProof/>
                 <w:webHidden/>
               </w:rPr>
               <w:tab/>
             </w:r>
             <w:r>
               <w:rPr>
+                <w:noProof/>
                 <w:webHidden/>
               </w:rPr>
               <w:fldChar w:fldCharType="begin"/>
             </w:r>
             <w:r>
               <w:rPr>
-                <w:webHidden/>
-              </w:rPr>
-              <w:instrText xml:space="preserve"> PAGEREF _Toc240048716 \h </w:instrText>
-            </w:r>
-            <w:r>
-              <w:rPr>
-                <w:webHidden/>
-              </w:rPr>
-            </w:r>
-            <w:r>
-              <w:rPr>
+                <w:noProof/>
+                <w:webHidden/>
+              </w:rPr>
+              <w:instrText xml:space="preserve"> PAGEREF _Toc240375554 \h </w:instrText>
+            </w:r>
+            <w:r>
+              <w:rPr>
+                <w:noProof/>
+                <w:webHidden/>
+              </w:rPr>
+            </w:r>
+            <w:r>
+              <w:rPr>
+                <w:noProof/>
                 <w:webHidden/>
               </w:rPr>
               <w:fldChar w:fldCharType="separate"/>
             </w:r>
             <w:r>
               <w:rPr>
+                <w:noProof/>
                 <w:webHidden/>
               </w:rPr>
               <w:t>7</w:t>
             </w:r>
             <w:r>
               <w:rPr>
+                <w:noProof/>
+                <w:webHidden/>
+              </w:rPr>
+              <w:fldChar w:fldCharType="end"/>
+            </w:r>
+          </w:hyperlink>
+        </w:p>
+        <w:p>
+          <w:pPr>
+            <w:pStyle w:val="TOC3"/>
+            <w:tabs>
+              <w:tab w:val="left" w:pos="1440"/>
+              <w:tab w:val="right" w:leader="dot" w:pos="9350"/>
+            </w:tabs>
+            <w:rPr>
+              <w:rFonts w:asciiTheme="minorHAnsi" w:eastAsiaTheme="minorEastAsia" w:hAnsiTheme="minorHAnsi"/>
+              <w:noProof/>
+              <w:lang w:val="en-US"/>
+            </w:rPr>
+          </w:pPr>
+          <w:hyperlink w:anchor="_Toc240375555" w:history="1">
+            <w:r>
+              <w:rPr>
+                <w:rStyle w:val="Hyperlink"/>
+                <w:noProof/>
+              </w:rPr>
+              <w:t>2.5.1.</w:t>
+            </w:r>
+            <w:r>
+              <w:rPr>
+                <w:rFonts w:asciiTheme="minorHAnsi" w:eastAsiaTheme="minorEastAsia" w:hAnsiTheme="minorHAnsi"/>
+                <w:noProof/>
+                <w:lang w:val="en-US"/>
+              </w:rPr>
+              <w:tab/>
+            </w:r>
+            <w:r>
+              <w:rPr>
+                <w:rStyle w:val="Hyperlink"/>
+                <w:noProof/>
+              </w:rPr>
+              <w:t>Paleta de Cores</w:t>
+            </w:r>
+            <w:r>
+              <w:rPr>
+                <w:noProof/>
+                <w:webHidden/>
+              </w:rPr>
+              <w:tab/>
+            </w:r>
+            <w:r>
+              <w:rPr>
+                <w:noProof/>
+                <w:webHidden/>
+              </w:rPr>
+              <w:fldChar w:fldCharType="begin"/>
+            </w:r>
+            <w:r>
+              <w:rPr>
+                <w:noProof/>
+                <w:webHidden/>
+              </w:rPr>
+              <w:instrText xml:space="preserve"> PAGEREF _Toc240375555 \h </w:instrText>
+            </w:r>
+            <w:r>
+              <w:rPr>
+                <w:noProof/>
+                <w:webHidden/>
+              </w:rPr>
+            </w:r>
+            <w:r>
+              <w:rPr>
+                <w:noProof/>
+                <w:webHidden/>
+              </w:rPr>
+              <w:fldChar w:fldCharType="separate"/>
+            </w:r>
+            <w:r>
+              <w:rPr>
+                <w:noProof/>
+                <w:webHidden/>
+              </w:rPr>
+              <w:t>8</w:t>
+            </w:r>
+            <w:r>
+              <w:rPr>
+                <w:noProof/>
                 <w:webHidden/>
               </w:rPr>
               <w:fldChar w:fldCharType="end"/>
@@ -655,24 +846,30 @@
             </w:tabs>
             <w:rPr>
               <w:rFonts w:asciiTheme="minorHAnsi" w:eastAsiaTheme="minorEastAsia" w:hAnsiTheme="minorHAnsi"/>
+              <w:noProof/>
+              <w:lang w:val="en-US"/>
             </w:rPr>
           </w:pPr>
-          <w:hyperlink w:anchor="_Toc240048717" w:history="1">
+          <w:hyperlink w:anchor="_Toc240375556" w:history="1">
             <w:r>
               <w:rPr>
                 <w:rStyle w:val="Hyperlink"/>
+                <w:noProof/>
               </w:rPr>
               <w:t>2.6.</w:t>
             </w:r>
             <w:r>
               <w:rPr>
                 <w:rFonts w:asciiTheme="minorHAnsi" w:eastAsiaTheme="minorEastAsia" w:hAnsiTheme="minorHAnsi"/>
+                <w:noProof/>
+                <w:lang w:val="en-US"/>
               </w:rPr>
               <w:tab/>
             </w:r>
             <w:r>
               <w:rPr>
                 <w:rStyle w:val="Hyperlink"/>
+                <w:noProof/>
               </w:rPr>
               <w:t xml:space="preserve">Desenvolvimento das Páginas em </w:t>
             </w:r>
@@ -680,46 +877,54 @@
               <w:rPr>
                 <w:rStyle w:val="Hyperlink"/>
                 <w:i/>
+                <w:noProof/>
               </w:rPr>
               <w:t>HTML</w:t>
             </w:r>
             <w:r>
               <w:rPr>
+                <w:noProof/>
                 <w:webHidden/>
               </w:rPr>
               <w:tab/>
             </w:r>
             <w:r>
               <w:rPr>
+                <w:noProof/>
                 <w:webHidden/>
               </w:rPr>
               <w:fldChar w:fldCharType="begin"/>
             </w:r>
             <w:r>
               <w:rPr>
-                <w:webHidden/>
-              </w:rPr>
-              <w:instrText xml:space="preserve"> PAGEREF _Toc240048717 \h </w:instrText>
-            </w:r>
-            <w:r>
-              <w:rPr>
-                <w:webHidden/>
-              </w:rPr>
-            </w:r>
-            <w:r>
-              <w:rPr>
+                <w:noProof/>
+                <w:webHidden/>
+              </w:rPr>
+              <w:instrText xml:space="preserve"> PAGEREF _Toc240375556 \h </w:instrText>
+            </w:r>
+            <w:r>
+              <w:rPr>
+                <w:noProof/>
+                <w:webHidden/>
+              </w:rPr>
+            </w:r>
+            <w:r>
+              <w:rPr>
+                <w:noProof/>
                 <w:webHidden/>
               </w:rPr>
               <w:fldChar w:fldCharType="separate"/>
             </w:r>
             <w:r>
               <w:rPr>
+                <w:noProof/>
                 <w:webHidden/>
               </w:rPr>
               <w:t>8</w:t>
             </w:r>
             <w:r>
               <w:rPr>
+                <w:noProof/>
                 <w:webHidden/>
               </w:rPr>
               <w:fldChar w:fldCharType="end"/>
@@ -735,64 +940,77 @@
             </w:tabs>
             <w:rPr>
               <w:rFonts w:asciiTheme="minorHAnsi" w:eastAsiaTheme="minorEastAsia" w:hAnsiTheme="minorHAnsi"/>
+              <w:noProof/>
+              <w:lang w:val="en-US"/>
             </w:rPr>
           </w:pPr>
-          <w:hyperlink w:anchor="_Toc240048718" w:history="1">
+          <w:hyperlink w:anchor="_Toc240375557" w:history="1">
             <w:r>
               <w:rPr>
                 <w:rStyle w:val="Hyperlink"/>
+                <w:noProof/>
               </w:rPr>
               <w:t>2.7.</w:t>
             </w:r>
             <w:r>
               <w:rPr>
                 <w:rFonts w:asciiTheme="minorHAnsi" w:eastAsiaTheme="minorEastAsia" w:hAnsiTheme="minorHAnsi"/>
+                <w:noProof/>
+                <w:lang w:val="en-US"/>
               </w:rPr>
               <w:tab/>
             </w:r>
             <w:r>
               <w:rPr>
                 <w:rStyle w:val="Hyperlink"/>
+                <w:noProof/>
               </w:rPr>
               <w:t>Integração de Imagens, Áudio, Vídeo e Formulários</w:t>
             </w:r>
             <w:r>
               <w:rPr>
+                <w:noProof/>
                 <w:webHidden/>
               </w:rPr>
               <w:tab/>
             </w:r>
             <w:r>
               <w:rPr>
+                <w:noProof/>
                 <w:webHidden/>
               </w:rPr>
               <w:fldChar w:fldCharType="begin"/>
             </w:r>
             <w:r>
               <w:rPr>
-                <w:webHidden/>
-              </w:rPr>
-              <w:instrText xml:space="preserve"> PAGEREF _Toc240048718 \h </w:instrText>
-            </w:r>
-            <w:r>
-              <w:rPr>
-                <w:webHidden/>
-              </w:rPr>
-            </w:r>
-            <w:r>
-              <w:rPr>
+                <w:noProof/>
+                <w:webHidden/>
+              </w:rPr>
+              <w:instrText xml:space="preserve"> PAGEREF _Toc240375557 \h </w:instrText>
+            </w:r>
+            <w:r>
+              <w:rPr>
+                <w:noProof/>
+                <w:webHidden/>
+              </w:rPr>
+            </w:r>
+            <w:r>
+              <w:rPr>
+                <w:noProof/>
                 <w:webHidden/>
               </w:rPr>
               <w:fldChar w:fldCharType="separate"/>
             </w:r>
             <w:r>
               <w:rPr>
-                <w:webHidden/>
-              </w:rPr>
-              <w:t>8</w:t>
-            </w:r>
-            <w:r>
-              <w:rPr>
+                <w:noProof/>
+                <w:webHidden/>
+              </w:rPr>
+              <w:t>9</w:t>
+            </w:r>
+            <w:r>
+              <w:rPr>
+                <w:noProof/>
                 <w:webHidden/>
               </w:rPr>
               <w:fldChar w:fldCharType="end"/>
@@ -808,64 +1026,77 @@
             </w:tabs>
             <w:rPr>
               <w:rFonts w:asciiTheme="minorHAnsi" w:eastAsiaTheme="minorEastAsia" w:hAnsiTheme="minorHAnsi"/>
+              <w:noProof/>
+              <w:lang w:val="en-US"/>
             </w:rPr>
           </w:pPr>
-          <w:hyperlink w:anchor="_Toc240048719" w:history="1">
+          <w:hyperlink w:anchor="_Toc240375558" w:history="1">
             <w:r>
               <w:rPr>
                 <w:rStyle w:val="Hyperlink"/>
+                <w:noProof/>
               </w:rPr>
               <w:t>2.8.</w:t>
             </w:r>
             <w:r>
               <w:rPr>
                 <w:rFonts w:asciiTheme="minorHAnsi" w:eastAsiaTheme="minorEastAsia" w:hAnsiTheme="minorHAnsi"/>
+                <w:noProof/>
+                <w:lang w:val="en-US"/>
               </w:rPr>
               <w:tab/>
             </w:r>
             <w:r>
               <w:rPr>
                 <w:rStyle w:val="Hyperlink"/>
+                <w:noProof/>
               </w:rPr>
               <w:t>Testes e Correção de Erros</w:t>
             </w:r>
             <w:r>
               <w:rPr>
+                <w:noProof/>
                 <w:webHidden/>
               </w:rPr>
               <w:tab/>
             </w:r>
             <w:r>
               <w:rPr>
+                <w:noProof/>
                 <w:webHidden/>
               </w:rPr>
               <w:fldChar w:fldCharType="begin"/>
             </w:r>
             <w:r>
               <w:rPr>
-                <w:webHidden/>
-              </w:rPr>
-              <w:instrText xml:space="preserve"> PAGEREF _Toc240048719 \h </w:instrText>
-            </w:r>
-            <w:r>
-              <w:rPr>
-                <w:webHidden/>
-              </w:rPr>
-            </w:r>
-            <w:r>
-              <w:rPr>
+                <w:noProof/>
+                <w:webHidden/>
+              </w:rPr>
+              <w:instrText xml:space="preserve"> PAGEREF _Toc240375558 \h </w:instrText>
+            </w:r>
+            <w:r>
+              <w:rPr>
+                <w:noProof/>
+                <w:webHidden/>
+              </w:rPr>
+            </w:r>
+            <w:r>
+              <w:rPr>
+                <w:noProof/>
                 <w:webHidden/>
               </w:rPr>
               <w:fldChar w:fldCharType="separate"/>
             </w:r>
             <w:r>
               <w:rPr>
-                <w:webHidden/>
-              </w:rPr>
-              <w:t>9</w:t>
-            </w:r>
-            <w:r>
-              <w:rPr>
+                <w:noProof/>
+                <w:webHidden/>
+              </w:rPr>
+              <w:t>10</w:t>
+            </w:r>
+            <w:r>
+              <w:rPr>
+                <w:noProof/>
                 <w:webHidden/>
               </w:rPr>
               <w:fldChar w:fldCharType="end"/>
@@ -881,64 +1112,77 @@
             </w:tabs>
             <w:rPr>
               <w:rFonts w:asciiTheme="minorHAnsi" w:eastAsiaTheme="minorEastAsia" w:hAnsiTheme="minorHAnsi"/>
+              <w:noProof/>
+              <w:lang w:val="en-US"/>
             </w:rPr>
           </w:pPr>
-          <w:hyperlink w:anchor="_Toc240048720" w:history="1">
+          <w:hyperlink w:anchor="_Toc240375559" w:history="1">
             <w:r>
               <w:rPr>
                 <w:rStyle w:val="Hyperlink"/>
+                <w:noProof/>
               </w:rPr>
               <w:t>2.9.</w:t>
             </w:r>
             <w:r>
               <w:rPr>
                 <w:rFonts w:asciiTheme="minorHAnsi" w:eastAsiaTheme="minorEastAsia" w:hAnsiTheme="minorHAnsi"/>
+                <w:noProof/>
+                <w:lang w:val="en-US"/>
               </w:rPr>
               <w:tab/>
             </w:r>
             <w:r>
               <w:rPr>
                 <w:rStyle w:val="Hyperlink"/>
+                <w:noProof/>
               </w:rPr>
               <w:t>Hospedagem e Publicação</w:t>
             </w:r>
             <w:r>
               <w:rPr>
+                <w:noProof/>
                 <w:webHidden/>
               </w:rPr>
               <w:tab/>
             </w:r>
             <w:r>
               <w:rPr>
+                <w:noProof/>
                 <w:webHidden/>
               </w:rPr>
               <w:fldChar w:fldCharType="begin"/>
             </w:r>
             <w:r>
               <w:rPr>
-                <w:webHidden/>
-              </w:rPr>
-              <w:instrText xml:space="preserve"> PAGEREF _Toc240048720 \h </w:instrText>
-            </w:r>
-            <w:r>
-              <w:rPr>
-                <w:webHidden/>
-              </w:rPr>
-            </w:r>
-            <w:r>
-              <w:rPr>
+                <w:noProof/>
+                <w:webHidden/>
+              </w:rPr>
+              <w:instrText xml:space="preserve"> PAGEREF _Toc240375559 \h </w:instrText>
+            </w:r>
+            <w:r>
+              <w:rPr>
+                <w:noProof/>
+                <w:webHidden/>
+              </w:rPr>
+            </w:r>
+            <w:r>
+              <w:rPr>
+                <w:noProof/>
                 <w:webHidden/>
               </w:rPr>
               <w:fldChar w:fldCharType="separate"/>
             </w:r>
             <w:r>
               <w:rPr>
+                <w:noProof/>
                 <w:webHidden/>
               </w:rPr>
               <w:t>10</w:t>
             </w:r>
             <w:r>
               <w:rPr>
+                <w:noProof/>
                 <w:webHidden/>
               </w:rPr>
               <w:fldChar w:fldCharType="end"/>
@@ -954,64 +1198,77 @@
             </w:tabs>
             <w:rPr>
               <w:rFonts w:asciiTheme="minorHAnsi" w:eastAsiaTheme="minorEastAsia" w:hAnsiTheme="minorHAnsi"/>
+              <w:noProof/>
+              <w:lang w:val="en-US"/>
             </w:rPr>
           </w:pPr>
-          <w:hyperlink w:anchor="_Toc240048721" w:history="1">
+          <w:hyperlink w:anchor="_Toc240375560" w:history="1">
             <w:r>
               <w:rPr>
                 <w:rStyle w:val="Hyperlink"/>
+                <w:noProof/>
               </w:rPr>
               <w:t>2.10.</w:t>
             </w:r>
             <w:r>
               <w:rPr>
                 <w:rFonts w:asciiTheme="minorHAnsi" w:eastAsiaTheme="minorEastAsia" w:hAnsiTheme="minorHAnsi"/>
+                <w:noProof/>
+                <w:lang w:val="en-US"/>
               </w:rPr>
               <w:tab/>
             </w:r>
             <w:r>
               <w:rPr>
                 <w:rStyle w:val="Hyperlink"/>
+                <w:noProof/>
               </w:rPr>
               <w:t>Apresentação do Projeto</w:t>
             </w:r>
             <w:r>
               <w:rPr>
+                <w:noProof/>
                 <w:webHidden/>
               </w:rPr>
               <w:tab/>
             </w:r>
             <w:r>
               <w:rPr>
+                <w:noProof/>
                 <w:webHidden/>
               </w:rPr>
               <w:fldChar w:fldCharType="begin"/>
             </w:r>
             <w:r>
               <w:rPr>
-                <w:webHidden/>
-              </w:rPr>
-              <w:instrText xml:space="preserve"> PAGEREF _Toc240048721 \h </w:instrText>
-            </w:r>
-            <w:r>
-              <w:rPr>
-                <w:webHidden/>
-              </w:rPr>
-            </w:r>
-            <w:r>
-              <w:rPr>
+                <w:noProof/>
+                <w:webHidden/>
+              </w:rPr>
+              <w:instrText xml:space="preserve"> PAGEREF _Toc240375560 \h </w:instrText>
+            </w:r>
+            <w:r>
+              <w:rPr>
+                <w:noProof/>
+                <w:webHidden/>
+              </w:rPr>
+            </w:r>
+            <w:r>
+              <w:rPr>
+                <w:noProof/>
                 <w:webHidden/>
               </w:rPr>
               <w:fldChar w:fldCharType="separate"/>
             </w:r>
             <w:r>
               <w:rPr>
-                <w:webHidden/>
-              </w:rPr>
-              <w:t>11</w:t>
-            </w:r>
-            <w:r>
-              <w:rPr>
+                <w:noProof/>
+                <w:webHidden/>
+              </w:rPr>
+              <w:t>12</w:t>
+            </w:r>
+            <w:r>
+              <w:rPr>
+                <w:noProof/>
                 <w:webHidden/>
               </w:rPr>
               <w:fldChar w:fldCharType="end"/>
@@ -1027,64 +1284,77 @@
             </w:tabs>
             <w:rPr>
               <w:rFonts w:asciiTheme="minorHAnsi" w:eastAsiaTheme="minorEastAsia" w:hAnsiTheme="minorHAnsi"/>
+              <w:noProof/>
+              <w:lang w:val="en-US"/>
             </w:rPr>
           </w:pPr>
-          <w:hyperlink w:anchor="_Toc240048722" w:history="1">
+          <w:hyperlink w:anchor="_Toc240375561" w:history="1">
             <w:r>
               <w:rPr>
                 <w:rStyle w:val="Hyperlink"/>
+                <w:noProof/>
               </w:rPr>
               <w:t>3.</w:t>
             </w:r>
             <w:r>
               <w:rPr>
                 <w:rFonts w:asciiTheme="minorHAnsi" w:eastAsiaTheme="minorEastAsia" w:hAnsiTheme="minorHAnsi"/>
+                <w:noProof/>
+                <w:lang w:val="en-US"/>
               </w:rPr>
               <w:tab/>
             </w:r>
             <w:r>
               <w:rPr>
                 <w:rStyle w:val="Hyperlink"/>
+                <w:noProof/>
               </w:rPr>
               <w:t>CONCLUSÃO</w:t>
             </w:r>
             <w:r>
               <w:rPr>
+                <w:noProof/>
                 <w:webHidden/>
               </w:rPr>
               <w:tab/>
             </w:r>
             <w:r>
               <w:rPr>
+                <w:noProof/>
                 <w:webHidden/>
               </w:rPr>
               <w:fldChar w:fldCharType="begin"/>
             </w:r>
             <w:r>
               <w:rPr>
-                <w:webHidden/>
-              </w:rPr>
-              <w:instrText xml:space="preserve"> PAGEREF _Toc240048722 \h </w:instrText>
-            </w:r>
-            <w:r>
-              <w:rPr>
-                <w:webHidden/>
-              </w:rPr>
-            </w:r>
-            <w:r>
-              <w:rPr>
+                <w:noProof/>
+                <w:webHidden/>
+              </w:rPr>
+              <w:instrText xml:space="preserve"> PAGEREF _Toc240375561 \h </w:instrText>
+            </w:r>
+            <w:r>
+              <w:rPr>
+                <w:noProof/>
+                <w:webHidden/>
+              </w:rPr>
+            </w:r>
+            <w:r>
+              <w:rPr>
+                <w:noProof/>
                 <w:webHidden/>
               </w:rPr>
               <w:fldChar w:fldCharType="separate"/>
             </w:r>
             <w:r>
               <w:rPr>
-                <w:webHidden/>
-              </w:rPr>
-              <w:t>12</w:t>
-            </w:r>
-            <w:r>
-              <w:rPr>
+                <w:noProof/>
+                <w:webHidden/>
+              </w:rPr>
+              <w:t>13</w:t>
+            </w:r>
+            <w:r>
+              <w:rPr>
+                <w:noProof/>
                 <w:webHidden/>
               </w:rPr>
               <w:fldChar w:fldCharType="end"/>
@@ -1099,52 +1369,62 @@
             </w:tabs>
             <w:rPr>
               <w:rFonts w:asciiTheme="minorHAnsi" w:eastAsiaTheme="minorEastAsia" w:hAnsiTheme="minorHAnsi"/>
+              <w:noProof/>
+              <w:lang w:val="en-US"/>
             </w:rPr>
           </w:pPr>
-          <w:hyperlink w:anchor="_Toc240048723" w:history="1">
+          <w:hyperlink w:anchor="_Toc240375562" w:history="1">
             <w:r>
               <w:rPr>
                 <w:rStyle w:val="Hyperlink"/>
+                <w:noProof/>
               </w:rPr>
               <w:t>Referências</w:t>
             </w:r>
             <w:r>
               <w:rPr>
+                <w:noProof/>
                 <w:webHidden/>
               </w:rPr>
               <w:tab/>
             </w:r>
             <w:r>
               <w:rPr>
+                <w:noProof/>
                 <w:webHidden/>
               </w:rPr>
               <w:fldChar w:fldCharType="begin"/>
             </w:r>
             <w:r>
               <w:rPr>
-                <w:webHidden/>
-              </w:rPr>
-              <w:instrText xml:space="preserve"> PAGEREF _Toc240048723 \h </w:instrText>
-            </w:r>
-            <w:r>
-              <w:rPr>
-                <w:webHidden/>
-              </w:rPr>
-            </w:r>
-            <w:r>
-              <w:rPr>
+                <w:noProof/>
+                <w:webHidden/>
+              </w:rPr>
+              <w:instrText xml:space="preserve"> PAGEREF _Toc240375562 \h </w:instrText>
+            </w:r>
+            <w:r>
+              <w:rPr>
+                <w:noProof/>
+                <w:webHidden/>
+              </w:rPr>
+            </w:r>
+            <w:r>
+              <w:rPr>
+                <w:noProof/>
                 <w:webHidden/>
               </w:rPr>
               <w:fldChar w:fldCharType="separate"/>
             </w:r>
             <w:r>
               <w:rPr>
-                <w:webHidden/>
-              </w:rPr>
-              <w:t>13</w:t>
-            </w:r>
-            <w:r>
-              <w:rPr>
+                <w:noProof/>
+                <w:webHidden/>
+              </w:rPr>
+              <w:t>14</w:t>
+            </w:r>
+            <w:r>
+              <w:rPr>
+                <w:noProof/>
                 <w:webHidden/>
               </w:rPr>
               <w:fldChar w:fldCharType="end"/>
@@ -1171,7 +1451,7 @@
       <w:pPr>
         <w:pStyle w:val="Heading1"/>
       </w:pPr>
-      <w:bookmarkStart w:id="0" w:name="_Toc240048709"/>
+      <w:bookmarkStart w:id="0" w:name="_Toc240375547"/>
       <w:r>
         <w:lastRenderedPageBreak/>
         <w:t>RESUMO</w:t>
@@ -1344,7 +1624,7 @@
         </w:numPr>
         <w:jc w:val="left"/>
       </w:pPr>
-      <w:bookmarkStart w:id="1" w:name="_Toc240048710"/>
+      <w:bookmarkStart w:id="1" w:name="_Toc240375548"/>
       <w:r>
         <w:lastRenderedPageBreak/>
         <w:t>INTRODUÇÃO</w:t>
@@ -1540,7 +1820,7 @@
           <w:numId w:val="2"/>
         </w:numPr>
       </w:pPr>
-      <w:bookmarkStart w:id="2" w:name="_Toc240048711"/>
+      <w:bookmarkStart w:id="2" w:name="_Toc240375549"/>
       <w:r>
         <w:lastRenderedPageBreak/>
         <w:t>DESENVOLVIMENTO</w:t>
@@ -1555,7 +1835,7 @@
           <w:numId w:val="2"/>
         </w:numPr>
       </w:pPr>
-      <w:bookmarkStart w:id="3" w:name="_Toc240048712"/>
+      <w:bookmarkStart w:id="3" w:name="_Toc240375550"/>
       <w:r>
         <w:t>Metodologia</w:t>
       </w:r>
@@ -1761,7 +2041,7 @@
           <w:numId w:val="2"/>
         </w:numPr>
       </w:pPr>
-      <w:bookmarkStart w:id="4" w:name="_Toc240048713"/>
+      <w:bookmarkStart w:id="4" w:name="_Toc240375551"/>
       <w:r>
         <w:t>Tipo de Site</w:t>
       </w:r>
@@ -1946,7 +2226,7 @@
           <w:numId w:val="2"/>
         </w:numPr>
       </w:pPr>
-      <w:bookmarkStart w:id="5" w:name="_Toc240048714"/>
+      <w:bookmarkStart w:id="5" w:name="_Toc240375552"/>
       <w:r>
         <w:t>Arquitetura</w:t>
       </w:r>
@@ -2152,7 +2432,7 @@
           <w:numId w:val="2"/>
         </w:numPr>
       </w:pPr>
-      <w:bookmarkStart w:id="6" w:name="_Toc240048715"/>
+      <w:bookmarkStart w:id="6" w:name="_Toc240375553"/>
       <w:r>
         <w:rPr>
           <w:rStyle w:val="EstrageirasChar"/>
@@ -2400,7 +2680,7 @@
           <w:numId w:val="2"/>
         </w:numPr>
       </w:pPr>
-      <w:bookmarkStart w:id="7" w:name="_Toc240048716"/>
+      <w:bookmarkStart w:id="7" w:name="_Toc240375554"/>
       <w:r>
         <w:t>Diagramação das Páginas</w:t>
       </w:r>
@@ -2551,10 +2831,12 @@
           <w:numId w:val="2"/>
         </w:numPr>
       </w:pPr>
+      <w:bookmarkStart w:id="8" w:name="_Toc240375555"/>
       <w:r>
         <w:lastRenderedPageBreak/>
         <w:t>Paleta de Cores</w:t>
       </w:r>
+      <w:bookmarkEnd w:id="8"/>
     </w:p>
     <w:p>
       <w:r>
@@ -3196,7 +3478,7 @@
           <w:numId w:val="2"/>
         </w:numPr>
       </w:pPr>
-      <w:bookmarkStart w:id="8" w:name="_Toc240048717"/>
+      <w:bookmarkStart w:id="9" w:name="_Toc240375556"/>
       <w:r>
         <w:t xml:space="preserve">Desenvolvimento das Páginas em </w:t>
       </w:r>
@@ -3206,7 +3488,7 @@
         </w:rPr>
         <w:t>HTML</w:t>
       </w:r>
-      <w:bookmarkEnd w:id="8"/>
+      <w:bookmarkEnd w:id="9"/>
     </w:p>
     <w:p>
       <w:r>
@@ -3615,11 +3897,11 @@
           <w:numId w:val="2"/>
         </w:numPr>
       </w:pPr>
-      <w:bookmarkStart w:id="9" w:name="_Toc240048718"/>
+      <w:bookmarkStart w:id="10" w:name="_Toc240375557"/>
       <w:r>
         <w:t>Integração de Imagens, Áudio, Vídeo e Formulários</w:t>
       </w:r>
-      <w:bookmarkEnd w:id="9"/>
+      <w:bookmarkEnd w:id="10"/>
     </w:p>
     <w:p>
       <w:r>
@@ -3806,7 +4088,7 @@
           <w:numId w:val="2"/>
         </w:numPr>
       </w:pPr>
-      <w:bookmarkStart w:id="10" w:name="_Toc240048719"/>
+      <w:bookmarkStart w:id="11" w:name="_Toc240375558"/>
       <w:r>
         <w:t xml:space="preserve">Testes e </w:t>
       </w:r>
@@ -3816,7 +4098,7 @@
       <w:r>
         <w:t xml:space="preserve"> de Erros</w:t>
       </w:r>
-      <w:bookmarkEnd w:id="10"/>
+      <w:bookmarkEnd w:id="11"/>
     </w:p>
     <w:p>
       <w:r>
@@ -4458,11 +4740,11 @@
           <w:numId w:val="2"/>
         </w:numPr>
       </w:pPr>
-      <w:bookmarkStart w:id="11" w:name="_Toc240048720"/>
+      <w:bookmarkStart w:id="12" w:name="_Toc240375559"/>
       <w:r>
         <w:t>Hospedagem e Publicação</w:t>
       </w:r>
-      <w:bookmarkEnd w:id="11"/>
+      <w:bookmarkEnd w:id="12"/>
     </w:p>
     <w:p>
       <w:r>
@@ -4826,14 +5108,14 @@
           <w:numId w:val="2"/>
         </w:numPr>
       </w:pPr>
-      <w:bookmarkStart w:id="12" w:name="_Toc240048721"/>
+      <w:bookmarkStart w:id="13" w:name="_Toc240375560"/>
       <w:r>
         <w:t xml:space="preserve">Apresentação do </w:t>
       </w:r>
       <w:r>
         <w:t>Projeto</w:t>
       </w:r>
-      <w:bookmarkEnd w:id="12"/>
+      <w:bookmarkEnd w:id="13"/>
     </w:p>
     <w:p>
       <w:r>
@@ -4972,12 +5254,12 @@
           <w:numId w:val="2"/>
         </w:numPr>
       </w:pPr>
-      <w:bookmarkStart w:id="13" w:name="_Toc240048722"/>
+      <w:bookmarkStart w:id="14" w:name="_Toc240375561"/>
       <w:r>
         <w:lastRenderedPageBreak/>
         <w:t>CONCLUSÃO</w:t>
       </w:r>
-      <w:bookmarkEnd w:id="13"/>
+      <w:bookmarkEnd w:id="14"/>
     </w:p>
     <w:p>
       <w:r>
@@ -5129,12 +5411,12 @@
       <w:pPr>
         <w:pStyle w:val="Heading1"/>
       </w:pPr>
-      <w:bookmarkStart w:id="14" w:name="_Toc240048723"/>
+      <w:bookmarkStart w:id="15" w:name="_Toc240375562"/>
       <w:r>
         <w:lastRenderedPageBreak/>
         <w:t>Referências</w:t>
       </w:r>
-      <w:bookmarkEnd w:id="14"/>
+      <w:bookmarkEnd w:id="15"/>
     </w:p>
     <w:p>
       <w:pPr>

</xml_diff>